<commit_message>
update docs and fix bug on alfa_beta.pl
</commit_message>
<xml_diff>
--- a/Relatório ISOLA Prolog.docx
+++ b/Relatório ISOLA Prolog.docx
@@ -498,7 +498,7 @@
           <w:r>
             <w:fldChar w:fldCharType="separate"/>
           </w:r>
-          <w:hyperlink w:anchor="_Toc227516710" w:history="1">
+          <w:hyperlink w:anchor="_Toc227590395" w:history="1">
             <w:r>
               <w:rPr>
                 <w:rStyle w:val="Hiperligao"/>
@@ -541,7 +541,7 @@
                 <w:noProof/>
                 <w:webHidden/>
               </w:rPr>
-              <w:instrText xml:space="preserve"> PAGEREF _Toc227516710 \h </w:instrText>
+              <w:instrText xml:space="preserve"> PAGEREF _Toc227590395 \h </w:instrText>
             </w:r>
             <w:r>
               <w:rPr>
@@ -561,7 +561,7 @@
                 <w:noProof/>
                 <w:webHidden/>
               </w:rPr>
-              <w:t>4</w:t>
+              <w:t>6</w:t>
             </w:r>
             <w:r>
               <w:rPr>
@@ -586,7 +586,7 @@
               <w14:ligatures w14:val="standardContextual"/>
             </w:rPr>
           </w:pPr>
-          <w:hyperlink w:anchor="_Toc227516711" w:history="1">
+          <w:hyperlink w:anchor="_Toc227590396" w:history="1">
             <w:r>
               <w:rPr>
                 <w:rStyle w:val="Hiperligao"/>
@@ -629,7 +629,7 @@
                 <w:noProof/>
                 <w:webHidden/>
               </w:rPr>
-              <w:instrText xml:space="preserve"> PAGEREF _Toc227516711 \h </w:instrText>
+              <w:instrText xml:space="preserve"> PAGEREF _Toc227590396 \h </w:instrText>
             </w:r>
             <w:r>
               <w:rPr>
@@ -649,7 +649,7 @@
                 <w:noProof/>
                 <w:webHidden/>
               </w:rPr>
-              <w:t>4</w:t>
+              <w:t>7</w:t>
             </w:r>
             <w:r>
               <w:rPr>
@@ -674,7 +674,7 @@
               <w14:ligatures w14:val="standardContextual"/>
             </w:rPr>
           </w:pPr>
-          <w:hyperlink w:anchor="_Toc227516712" w:history="1">
+          <w:hyperlink w:anchor="_Toc227590397" w:history="1">
             <w:r>
               <w:rPr>
                 <w:rStyle w:val="Hiperligao"/>
@@ -717,7 +717,7 @@
                 <w:noProof/>
                 <w:webHidden/>
               </w:rPr>
-              <w:instrText xml:space="preserve"> PAGEREF _Toc227516712 \h </w:instrText>
+              <w:instrText xml:space="preserve"> PAGEREF _Toc227590397 \h </w:instrText>
             </w:r>
             <w:r>
               <w:rPr>
@@ -737,7 +737,7 @@
                 <w:noProof/>
                 <w:webHidden/>
               </w:rPr>
-              <w:t>4</w:t>
+              <w:t>7</w:t>
             </w:r>
             <w:r>
               <w:rPr>
@@ -762,7 +762,7 @@
               <w14:ligatures w14:val="standardContextual"/>
             </w:rPr>
           </w:pPr>
-          <w:hyperlink w:anchor="_Toc227516713" w:history="1">
+          <w:hyperlink w:anchor="_Toc227590398" w:history="1">
             <w:r>
               <w:rPr>
                 <w:rStyle w:val="Hiperligao"/>
@@ -805,7 +805,7 @@
                 <w:noProof/>
                 <w:webHidden/>
               </w:rPr>
-              <w:instrText xml:space="preserve"> PAGEREF _Toc227516713 \h </w:instrText>
+              <w:instrText xml:space="preserve"> PAGEREF _Toc227590398 \h </w:instrText>
             </w:r>
             <w:r>
               <w:rPr>
@@ -825,7 +825,7 @@
                 <w:noProof/>
                 <w:webHidden/>
               </w:rPr>
-              <w:t>4</w:t>
+              <w:t>7</w:t>
             </w:r>
             <w:r>
               <w:rPr>
@@ -850,7 +850,7 @@
               <w14:ligatures w14:val="standardContextual"/>
             </w:rPr>
           </w:pPr>
-          <w:hyperlink w:anchor="_Toc227516714" w:history="1">
+          <w:hyperlink w:anchor="_Toc227590399" w:history="1">
             <w:r>
               <w:rPr>
                 <w:rStyle w:val="Hiperligao"/>
@@ -893,7 +893,7 @@
                 <w:noProof/>
                 <w:webHidden/>
               </w:rPr>
-              <w:instrText xml:space="preserve"> PAGEREF _Toc227516714 \h </w:instrText>
+              <w:instrText xml:space="preserve"> PAGEREF _Toc227590399 \h </w:instrText>
             </w:r>
             <w:r>
               <w:rPr>
@@ -913,7 +913,7 @@
                 <w:noProof/>
                 <w:webHidden/>
               </w:rPr>
-              <w:t>5</w:t>
+              <w:t>8</w:t>
             </w:r>
             <w:r>
               <w:rPr>
@@ -938,7 +938,7 @@
               <w14:ligatures w14:val="standardContextual"/>
             </w:rPr>
           </w:pPr>
-          <w:hyperlink w:anchor="_Toc227516715" w:history="1">
+          <w:hyperlink w:anchor="_Toc227590400" w:history="1">
             <w:r>
               <w:rPr>
                 <w:rStyle w:val="Hiperligao"/>
@@ -981,7 +981,7 @@
                 <w:noProof/>
                 <w:webHidden/>
               </w:rPr>
-              <w:instrText xml:space="preserve"> PAGEREF _Toc227516715 \h </w:instrText>
+              <w:instrText xml:space="preserve"> PAGEREF _Toc227590400 \h </w:instrText>
             </w:r>
             <w:r>
               <w:rPr>
@@ -1001,7 +1001,7 @@
                 <w:noProof/>
                 <w:webHidden/>
               </w:rPr>
-              <w:t>6</w:t>
+              <w:t>9</w:t>
             </w:r>
             <w:r>
               <w:rPr>
@@ -1026,7 +1026,7 @@
               <w14:ligatures w14:val="standardContextual"/>
             </w:rPr>
           </w:pPr>
-          <w:hyperlink w:anchor="_Toc227516716" w:history="1">
+          <w:hyperlink w:anchor="_Toc227590401" w:history="1">
             <w:r>
               <w:rPr>
                 <w:rStyle w:val="Hiperligao"/>
@@ -1069,7 +1069,7 @@
                 <w:noProof/>
                 <w:webHidden/>
               </w:rPr>
-              <w:instrText xml:space="preserve"> PAGEREF _Toc227516716 \h </w:instrText>
+              <w:instrText xml:space="preserve"> PAGEREF _Toc227590401 \h </w:instrText>
             </w:r>
             <w:r>
               <w:rPr>
@@ -1089,7 +1089,7 @@
                 <w:noProof/>
                 <w:webHidden/>
               </w:rPr>
-              <w:t>6</w:t>
+              <w:t>9</w:t>
             </w:r>
             <w:r>
               <w:rPr>
@@ -1114,7 +1114,7 @@
               <w14:ligatures w14:val="standardContextual"/>
             </w:rPr>
           </w:pPr>
-          <w:hyperlink w:anchor="_Toc227516717" w:history="1">
+          <w:hyperlink w:anchor="_Toc227590402" w:history="1">
             <w:r>
               <w:rPr>
                 <w:rStyle w:val="Hiperligao"/>
@@ -1157,7 +1157,7 @@
                 <w:noProof/>
                 <w:webHidden/>
               </w:rPr>
-              <w:instrText xml:space="preserve"> PAGEREF _Toc227516717 \h </w:instrText>
+              <w:instrText xml:space="preserve"> PAGEREF _Toc227590402 \h </w:instrText>
             </w:r>
             <w:r>
               <w:rPr>
@@ -1177,7 +1177,7 @@
                 <w:noProof/>
                 <w:webHidden/>
               </w:rPr>
-              <w:t>6</w:t>
+              <w:t>9</w:t>
             </w:r>
             <w:r>
               <w:rPr>
@@ -1202,7 +1202,7 @@
               <w14:ligatures w14:val="standardContextual"/>
             </w:rPr>
           </w:pPr>
-          <w:hyperlink w:anchor="_Toc227516718" w:history="1">
+          <w:hyperlink w:anchor="_Toc227590403" w:history="1">
             <w:r>
               <w:rPr>
                 <w:rStyle w:val="Hiperligao"/>
@@ -1245,7 +1245,7 @@
                 <w:noProof/>
                 <w:webHidden/>
               </w:rPr>
-              <w:instrText xml:space="preserve"> PAGEREF _Toc227516718 \h </w:instrText>
+              <w:instrText xml:space="preserve"> PAGEREF _Toc227590403 \h </w:instrText>
             </w:r>
             <w:r>
               <w:rPr>
@@ -1265,7 +1265,7 @@
                 <w:noProof/>
                 <w:webHidden/>
               </w:rPr>
-              <w:t>7</w:t>
+              <w:t>10</w:t>
             </w:r>
             <w:r>
               <w:rPr>
@@ -1290,7 +1290,7 @@
               <w14:ligatures w14:val="standardContextual"/>
             </w:rPr>
           </w:pPr>
-          <w:hyperlink w:anchor="_Toc227516719" w:history="1">
+          <w:hyperlink w:anchor="_Toc227590404" w:history="1">
             <w:r>
               <w:rPr>
                 <w:rStyle w:val="Hiperligao"/>
@@ -1333,7 +1333,7 @@
                 <w:noProof/>
                 <w:webHidden/>
               </w:rPr>
-              <w:instrText xml:space="preserve"> PAGEREF _Toc227516719 \h </w:instrText>
+              <w:instrText xml:space="preserve"> PAGEREF _Toc227590404 \h </w:instrText>
             </w:r>
             <w:r>
               <w:rPr>
@@ -1353,7 +1353,7 @@
                 <w:noProof/>
                 <w:webHidden/>
               </w:rPr>
-              <w:t>7</w:t>
+              <w:t>10</w:t>
             </w:r>
             <w:r>
               <w:rPr>
@@ -1378,7 +1378,7 @@
               <w14:ligatures w14:val="standardContextual"/>
             </w:rPr>
           </w:pPr>
-          <w:hyperlink w:anchor="_Toc227516720" w:history="1">
+          <w:hyperlink w:anchor="_Toc227590405" w:history="1">
             <w:r>
               <w:rPr>
                 <w:rStyle w:val="Hiperligao"/>
@@ -1421,7 +1421,7 @@
                 <w:noProof/>
                 <w:webHidden/>
               </w:rPr>
-              <w:instrText xml:space="preserve"> PAGEREF _Toc227516720 \h </w:instrText>
+              <w:instrText xml:space="preserve"> PAGEREF _Toc227590405 \h </w:instrText>
             </w:r>
             <w:r>
               <w:rPr>
@@ -1441,7 +1441,7 @@
                 <w:noProof/>
                 <w:webHidden/>
               </w:rPr>
-              <w:t>7</w:t>
+              <w:t>11</w:t>
             </w:r>
             <w:r>
               <w:rPr>
@@ -1466,7 +1466,7 @@
               <w14:ligatures w14:val="standardContextual"/>
             </w:rPr>
           </w:pPr>
-          <w:hyperlink w:anchor="_Toc227516721" w:history="1">
+          <w:hyperlink w:anchor="_Toc227590406" w:history="1">
             <w:r>
               <w:rPr>
                 <w:rStyle w:val="Hiperligao"/>
@@ -1509,7 +1509,7 @@
                 <w:noProof/>
                 <w:webHidden/>
               </w:rPr>
-              <w:instrText xml:space="preserve"> PAGEREF _Toc227516721 \h </w:instrText>
+              <w:instrText xml:space="preserve"> PAGEREF _Toc227590406 \h </w:instrText>
             </w:r>
             <w:r>
               <w:rPr>
@@ -1529,7 +1529,7 @@
                 <w:noProof/>
                 <w:webHidden/>
               </w:rPr>
-              <w:t>7</w:t>
+              <w:t>11</w:t>
             </w:r>
             <w:r>
               <w:rPr>
@@ -1554,7 +1554,7 @@
               <w14:ligatures w14:val="standardContextual"/>
             </w:rPr>
           </w:pPr>
-          <w:hyperlink w:anchor="_Toc227516722" w:history="1">
+          <w:hyperlink w:anchor="_Toc227590407" w:history="1">
             <w:r>
               <w:rPr>
                 <w:rStyle w:val="Hiperligao"/>
@@ -1576,14 +1576,7 @@
                 <w:rStyle w:val="Hiperligao"/>
                 <w:noProof/>
               </w:rPr>
-              <w:t>Alfa</w:t>
-            </w:r>
-            <w:r>
-              <w:rPr>
-                <w:rStyle w:val="Hiperligao"/>
-                <w:noProof/>
-              </w:rPr>
-              <w:t>-Beta Pruning</w:t>
+              <w:t>Alfa-Beta</w:t>
             </w:r>
             <w:r>
               <w:rPr>
@@ -1604,7 +1597,7 @@
                 <w:noProof/>
                 <w:webHidden/>
               </w:rPr>
-              <w:instrText xml:space="preserve"> PAGEREF _Toc227516722 \h </w:instrText>
+              <w:instrText xml:space="preserve"> PAGEREF _Toc227590407 \h </w:instrText>
             </w:r>
             <w:r>
               <w:rPr>
@@ -1624,7 +1617,7 @@
                 <w:noProof/>
                 <w:webHidden/>
               </w:rPr>
-              <w:t>7</w:t>
+              <w:t>11</w:t>
             </w:r>
             <w:r>
               <w:rPr>
@@ -1649,7 +1642,7 @@
               <w14:ligatures w14:val="standardContextual"/>
             </w:rPr>
           </w:pPr>
-          <w:hyperlink w:anchor="_Toc227516723" w:history="1">
+          <w:hyperlink w:anchor="_Toc227590408" w:history="1">
             <w:r>
               <w:rPr>
                 <w:rStyle w:val="Hiperligao"/>
@@ -1692,7 +1685,7 @@
                 <w:noProof/>
                 <w:webHidden/>
               </w:rPr>
-              <w:instrText xml:space="preserve"> PAGEREF _Toc227516723 \h </w:instrText>
+              <w:instrText xml:space="preserve"> PAGEREF _Toc227590408 \h </w:instrText>
             </w:r>
             <w:r>
               <w:rPr>
@@ -1712,7 +1705,7 @@
                 <w:noProof/>
                 <w:webHidden/>
               </w:rPr>
-              <w:t>8</w:t>
+              <w:t>11</w:t>
             </w:r>
             <w:r>
               <w:rPr>
@@ -1737,7 +1730,7 @@
               <w14:ligatures w14:val="standardContextual"/>
             </w:rPr>
           </w:pPr>
-          <w:hyperlink w:anchor="_Toc227516724" w:history="1">
+          <w:hyperlink w:anchor="_Toc227590409" w:history="1">
             <w:r>
               <w:rPr>
                 <w:rStyle w:val="Hiperligao"/>
@@ -1759,21 +1752,7 @@
                 <w:rStyle w:val="Hiperligao"/>
                 <w:noProof/>
               </w:rPr>
-              <w:t xml:space="preserve">Comparação Minimax vs. </w:t>
-            </w:r>
-            <w:r>
-              <w:rPr>
-                <w:rStyle w:val="Hiperligao"/>
-                <w:noProof/>
-              </w:rPr>
-              <w:t>Alfa</w:t>
-            </w:r>
-            <w:r>
-              <w:rPr>
-                <w:rStyle w:val="Hiperligao"/>
-                <w:noProof/>
-              </w:rPr>
-              <w:t>-Beta</w:t>
+              <w:t>Comparação Minimax vs. Alfa-Beta</w:t>
             </w:r>
             <w:r>
               <w:rPr>
@@ -1794,7 +1773,7 @@
                 <w:noProof/>
                 <w:webHidden/>
               </w:rPr>
-              <w:instrText xml:space="preserve"> PAGEREF _Toc227516724 \h </w:instrText>
+              <w:instrText xml:space="preserve"> PAGEREF _Toc227590409 \h </w:instrText>
             </w:r>
             <w:r>
               <w:rPr>
@@ -1814,7 +1793,7 @@
                 <w:noProof/>
                 <w:webHidden/>
               </w:rPr>
-              <w:t>8</w:t>
+              <w:t>12</w:t>
             </w:r>
             <w:r>
               <w:rPr>
@@ -1839,7 +1818,7 @@
               <w14:ligatures w14:val="standardContextual"/>
             </w:rPr>
           </w:pPr>
-          <w:hyperlink w:anchor="_Toc227516725" w:history="1">
+          <w:hyperlink w:anchor="_Toc227590410" w:history="1">
             <w:r>
               <w:rPr>
                 <w:rStyle w:val="Hiperligao"/>
@@ -1882,7 +1861,7 @@
                 <w:noProof/>
                 <w:webHidden/>
               </w:rPr>
-              <w:instrText xml:space="preserve"> PAGEREF _Toc227516725 \h </w:instrText>
+              <w:instrText xml:space="preserve"> PAGEREF _Toc227590410 \h </w:instrText>
             </w:r>
             <w:r>
               <w:rPr>
@@ -1902,7 +1881,7 @@
                 <w:noProof/>
                 <w:webHidden/>
               </w:rPr>
-              <w:t>9</w:t>
+              <w:t>13</w:t>
             </w:r>
             <w:r>
               <w:rPr>
@@ -1927,7 +1906,7 @@
               <w14:ligatures w14:val="standardContextual"/>
             </w:rPr>
           </w:pPr>
-          <w:hyperlink w:anchor="_Toc227516726" w:history="1">
+          <w:hyperlink w:anchor="_Toc227590411" w:history="1">
             <w:r>
               <w:rPr>
                 <w:rStyle w:val="Hiperligao"/>
@@ -1970,7 +1949,7 @@
                 <w:noProof/>
                 <w:webHidden/>
               </w:rPr>
-              <w:instrText xml:space="preserve"> PAGEREF _Toc227516726 \h </w:instrText>
+              <w:instrText xml:space="preserve"> PAGEREF _Toc227590411 \h </w:instrText>
             </w:r>
             <w:r>
               <w:rPr>
@@ -1990,7 +1969,7 @@
                 <w:noProof/>
                 <w:webHidden/>
               </w:rPr>
-              <w:t>9</w:t>
+              <w:t>13</w:t>
             </w:r>
             <w:r>
               <w:rPr>
@@ -2015,7 +1994,7 @@
               <w14:ligatures w14:val="standardContextual"/>
             </w:rPr>
           </w:pPr>
-          <w:hyperlink w:anchor="_Toc227516727" w:history="1">
+          <w:hyperlink w:anchor="_Toc227590412" w:history="1">
             <w:r>
               <w:rPr>
                 <w:rStyle w:val="Hiperligao"/>
@@ -2037,21 +2016,7 @@
                 <w:rStyle w:val="Hiperligao"/>
                 <w:noProof/>
               </w:rPr>
-              <w:t xml:space="preserve">Tabuleiro 6x6 — </w:t>
-            </w:r>
-            <w:r>
-              <w:rPr>
-                <w:rStyle w:val="Hiperligao"/>
-                <w:noProof/>
-              </w:rPr>
-              <w:t>Alfa</w:t>
-            </w:r>
-            <w:r>
-              <w:rPr>
-                <w:rStyle w:val="Hiperligao"/>
-                <w:noProof/>
-              </w:rPr>
-              <w:t>-Beta com profundidade 2</w:t>
+              <w:t>Tabuleiro 6x6 — Alfa-Beta com profundidade 2</w:t>
             </w:r>
             <w:r>
               <w:rPr>
@@ -2072,7 +2037,7 @@
                 <w:noProof/>
                 <w:webHidden/>
               </w:rPr>
-              <w:instrText xml:space="preserve"> PAGEREF _Toc227516727 \h </w:instrText>
+              <w:instrText xml:space="preserve"> PAGEREF _Toc227590412 \h </w:instrText>
             </w:r>
             <w:r>
               <w:rPr>
@@ -2092,7 +2057,7 @@
                 <w:noProof/>
                 <w:webHidden/>
               </w:rPr>
-              <w:t>9</w:t>
+              <w:t>13</w:t>
             </w:r>
             <w:r>
               <w:rPr>
@@ -2117,7 +2082,7 @@
               <w14:ligatures w14:val="standardContextual"/>
             </w:rPr>
           </w:pPr>
-          <w:hyperlink w:anchor="_Toc227516728" w:history="1">
+          <w:hyperlink w:anchor="_Toc227590413" w:history="1">
             <w:r>
               <w:rPr>
                 <w:rStyle w:val="Hiperligao"/>
@@ -2139,21 +2104,95 @@
                 <w:rStyle w:val="Hiperligao"/>
                 <w:noProof/>
               </w:rPr>
-              <w:t xml:space="preserve">Impacto da Profundidade no </w:t>
-            </w:r>
+              <w:t>Impacto da Profundidade no Alfa-Beta</w:t>
+            </w:r>
+            <w:r>
+              <w:rPr>
+                <w:noProof/>
+                <w:webHidden/>
+              </w:rPr>
+              <w:tab/>
+            </w:r>
+            <w:r>
+              <w:rPr>
+                <w:noProof/>
+                <w:webHidden/>
+              </w:rPr>
+              <w:fldChar w:fldCharType="begin"/>
+            </w:r>
+            <w:r>
+              <w:rPr>
+                <w:noProof/>
+                <w:webHidden/>
+              </w:rPr>
+              <w:instrText xml:space="preserve"> PAGEREF _Toc227590413 \h </w:instrText>
+            </w:r>
+            <w:r>
+              <w:rPr>
+                <w:noProof/>
+                <w:webHidden/>
+              </w:rPr>
+            </w:r>
+            <w:r>
+              <w:rPr>
+                <w:noProof/>
+                <w:webHidden/>
+              </w:rPr>
+              <w:fldChar w:fldCharType="separate"/>
+            </w:r>
+            <w:r>
+              <w:rPr>
+                <w:noProof/>
+                <w:webHidden/>
+              </w:rPr>
+              <w:t>13</w:t>
+            </w:r>
+            <w:r>
+              <w:rPr>
+                <w:noProof/>
+                <w:webHidden/>
+              </w:rPr>
+              <w:fldChar w:fldCharType="end"/>
+            </w:r>
+          </w:hyperlink>
+        </w:p>
+        <w:p>
+          <w:pPr>
+            <w:pStyle w:val="ndice2"/>
+            <w:tabs>
+              <w:tab w:val="left" w:pos="960"/>
+              <w:tab w:val="right" w:leader="dot" w:pos="9628"/>
+            </w:tabs>
+            <w:rPr>
+              <w:noProof/>
+              <w:kern w:val="2"/>
+              <w:lang w:eastAsia="pt-PT"/>
+              <w14:ligatures w14:val="standardContextual"/>
+            </w:rPr>
+          </w:pPr>
+          <w:hyperlink w:anchor="_Toc227590414" w:history="1">
             <w:r>
               <w:rPr>
                 <w:rStyle w:val="Hiperligao"/>
                 <w:noProof/>
               </w:rPr>
-              <w:t>Alfa</w:t>
+              <w:t>6.4</w:t>
+            </w:r>
+            <w:r>
+              <w:rPr>
+                <w:noProof/>
+                <w:kern w:val="2"/>
+                <w:lang w:eastAsia="pt-PT"/>
+                <w14:ligatures w14:val="standardContextual"/>
+              </w:rPr>
+              <w:tab/>
             </w:r>
             <w:r>
               <w:rPr>
                 <w:rStyle w:val="Hiperligao"/>
                 <w:noProof/>
               </w:rPr>
-              <w:t>-Beta</w:t>
+              <w:t>Testes</w:t>
             </w:r>
             <w:r>
               <w:rPr>
@@ -2174,7 +2213,7 @@
                 <w:noProof/>
                 <w:webHidden/>
               </w:rPr>
-              <w:instrText xml:space="preserve"> PAGEREF _Toc227516728 \h </w:instrText>
+              <w:instrText xml:space="preserve"> PAGEREF _Toc227590414 \h </w:instrText>
             </w:r>
             <w:r>
               <w:rPr>
@@ -2194,7 +2233,7 @@
                 <w:noProof/>
                 <w:webHidden/>
               </w:rPr>
-              <w:t>9</w:t>
+              <w:t>15</w:t>
             </w:r>
             <w:r>
               <w:rPr>
@@ -2219,7 +2258,7 @@
               <w14:ligatures w14:val="standardContextual"/>
             </w:rPr>
           </w:pPr>
-          <w:hyperlink w:anchor="_Toc227516729" w:history="1">
+          <w:hyperlink w:anchor="_Toc227590415" w:history="1">
             <w:r>
               <w:rPr>
                 <w:rStyle w:val="Hiperligao"/>
@@ -2262,7 +2301,7 @@
                 <w:noProof/>
                 <w:webHidden/>
               </w:rPr>
-              <w:instrText xml:space="preserve"> PAGEREF _Toc227516729 \h </w:instrText>
+              <w:instrText xml:space="preserve"> PAGEREF _Toc227590415 \h </w:instrText>
             </w:r>
             <w:r>
               <w:rPr>
@@ -2282,7 +2321,447 @@
                 <w:noProof/>
                 <w:webHidden/>
               </w:rPr>
-              <w:t>12</w:t>
+              <w:t>24</w:t>
+            </w:r>
+            <w:r>
+              <w:rPr>
+                <w:noProof/>
+                <w:webHidden/>
+              </w:rPr>
+              <w:fldChar w:fldCharType="end"/>
+            </w:r>
+          </w:hyperlink>
+        </w:p>
+        <w:p>
+          <w:pPr>
+            <w:pStyle w:val="ndice2"/>
+            <w:tabs>
+              <w:tab w:val="left" w:pos="960"/>
+              <w:tab w:val="right" w:leader="dot" w:pos="9628"/>
+            </w:tabs>
+            <w:rPr>
+              <w:noProof/>
+              <w:kern w:val="2"/>
+              <w:lang w:eastAsia="pt-PT"/>
+              <w14:ligatures w14:val="standardContextual"/>
+            </w:rPr>
+          </w:pPr>
+          <w:hyperlink w:anchor="_Toc227590416" w:history="1">
+            <w:r>
+              <w:rPr>
+                <w:rStyle w:val="Hiperligao"/>
+                <w:noProof/>
+              </w:rPr>
+              <w:t>7.1</w:t>
+            </w:r>
+            <w:r>
+              <w:rPr>
+                <w:noProof/>
+                <w:kern w:val="2"/>
+                <w:lang w:eastAsia="pt-PT"/>
+                <w14:ligatures w14:val="standardContextual"/>
+              </w:rPr>
+              <w:tab/>
+            </w:r>
+            <w:r>
+              <w:rPr>
+                <w:rStyle w:val="Hiperligao"/>
+                <w:noProof/>
+              </w:rPr>
+              <w:t>Separação modular do código</w:t>
+            </w:r>
+            <w:r>
+              <w:rPr>
+                <w:noProof/>
+                <w:webHidden/>
+              </w:rPr>
+              <w:tab/>
+            </w:r>
+            <w:r>
+              <w:rPr>
+                <w:noProof/>
+                <w:webHidden/>
+              </w:rPr>
+              <w:fldChar w:fldCharType="begin"/>
+            </w:r>
+            <w:r>
+              <w:rPr>
+                <w:noProof/>
+                <w:webHidden/>
+              </w:rPr>
+              <w:instrText xml:space="preserve"> PAGEREF _Toc227590416 \h </w:instrText>
+            </w:r>
+            <w:r>
+              <w:rPr>
+                <w:noProof/>
+                <w:webHidden/>
+              </w:rPr>
+            </w:r>
+            <w:r>
+              <w:rPr>
+                <w:noProof/>
+                <w:webHidden/>
+              </w:rPr>
+              <w:fldChar w:fldCharType="separate"/>
+            </w:r>
+            <w:r>
+              <w:rPr>
+                <w:noProof/>
+                <w:webHidden/>
+              </w:rPr>
+              <w:t>24</w:t>
+            </w:r>
+            <w:r>
+              <w:rPr>
+                <w:noProof/>
+                <w:webHidden/>
+              </w:rPr>
+              <w:fldChar w:fldCharType="end"/>
+            </w:r>
+          </w:hyperlink>
+        </w:p>
+        <w:p>
+          <w:pPr>
+            <w:pStyle w:val="ndice2"/>
+            <w:tabs>
+              <w:tab w:val="left" w:pos="960"/>
+              <w:tab w:val="right" w:leader="dot" w:pos="9628"/>
+            </w:tabs>
+            <w:rPr>
+              <w:noProof/>
+              <w:kern w:val="2"/>
+              <w:lang w:eastAsia="pt-PT"/>
+              <w14:ligatures w14:val="standardContextual"/>
+            </w:rPr>
+          </w:pPr>
+          <w:hyperlink w:anchor="_Toc227590417" w:history="1">
+            <w:r>
+              <w:rPr>
+                <w:rStyle w:val="Hiperligao"/>
+                <w:noProof/>
+              </w:rPr>
+              <w:t>7.2</w:t>
+            </w:r>
+            <w:r>
+              <w:rPr>
+                <w:noProof/>
+                <w:kern w:val="2"/>
+                <w:lang w:eastAsia="pt-PT"/>
+                <w14:ligatures w14:val="standardContextual"/>
+              </w:rPr>
+              <w:tab/>
+            </w:r>
+            <w:r>
+              <w:rPr>
+                <w:rStyle w:val="Hiperligao"/>
+                <w:noProof/>
+              </w:rPr>
+              <w:t>Mobilidade como heurística de avaliação</w:t>
+            </w:r>
+            <w:r>
+              <w:rPr>
+                <w:noProof/>
+                <w:webHidden/>
+              </w:rPr>
+              <w:tab/>
+            </w:r>
+            <w:r>
+              <w:rPr>
+                <w:noProof/>
+                <w:webHidden/>
+              </w:rPr>
+              <w:fldChar w:fldCharType="begin"/>
+            </w:r>
+            <w:r>
+              <w:rPr>
+                <w:noProof/>
+                <w:webHidden/>
+              </w:rPr>
+              <w:instrText xml:space="preserve"> PAGEREF _Toc227590417 \h </w:instrText>
+            </w:r>
+            <w:r>
+              <w:rPr>
+                <w:noProof/>
+                <w:webHidden/>
+              </w:rPr>
+            </w:r>
+            <w:r>
+              <w:rPr>
+                <w:noProof/>
+                <w:webHidden/>
+              </w:rPr>
+              <w:fldChar w:fldCharType="separate"/>
+            </w:r>
+            <w:r>
+              <w:rPr>
+                <w:noProof/>
+                <w:webHidden/>
+              </w:rPr>
+              <w:t>24</w:t>
+            </w:r>
+            <w:r>
+              <w:rPr>
+                <w:noProof/>
+                <w:webHidden/>
+              </w:rPr>
+              <w:fldChar w:fldCharType="end"/>
+            </w:r>
+          </w:hyperlink>
+        </w:p>
+        <w:p>
+          <w:pPr>
+            <w:pStyle w:val="ndice2"/>
+            <w:tabs>
+              <w:tab w:val="left" w:pos="960"/>
+              <w:tab w:val="right" w:leader="dot" w:pos="9628"/>
+            </w:tabs>
+            <w:rPr>
+              <w:noProof/>
+              <w:kern w:val="2"/>
+              <w:lang w:eastAsia="pt-PT"/>
+              <w14:ligatures w14:val="standardContextual"/>
+            </w:rPr>
+          </w:pPr>
+          <w:hyperlink w:anchor="_Toc227590418" w:history="1">
+            <w:r>
+              <w:rPr>
+                <w:rStyle w:val="Hiperligao"/>
+                <w:noProof/>
+              </w:rPr>
+              <w:t>7.3</w:t>
+            </w:r>
+            <w:r>
+              <w:rPr>
+                <w:noProof/>
+                <w:kern w:val="2"/>
+                <w:lang w:eastAsia="pt-PT"/>
+                <w14:ligatures w14:val="standardContextual"/>
+              </w:rPr>
+              <w:tab/>
+            </w:r>
+            <w:r>
+              <w:rPr>
+                <w:rStyle w:val="Hiperligao"/>
+                <w:noProof/>
+              </w:rPr>
+              <w:t>Profundidade de pesquisa a 3</w:t>
+            </w:r>
+            <w:r>
+              <w:rPr>
+                <w:noProof/>
+                <w:webHidden/>
+              </w:rPr>
+              <w:tab/>
+            </w:r>
+            <w:r>
+              <w:rPr>
+                <w:noProof/>
+                <w:webHidden/>
+              </w:rPr>
+              <w:fldChar w:fldCharType="begin"/>
+            </w:r>
+            <w:r>
+              <w:rPr>
+                <w:noProof/>
+                <w:webHidden/>
+              </w:rPr>
+              <w:instrText xml:space="preserve"> PAGEREF _Toc227590418 \h </w:instrText>
+            </w:r>
+            <w:r>
+              <w:rPr>
+                <w:noProof/>
+                <w:webHidden/>
+              </w:rPr>
+            </w:r>
+            <w:r>
+              <w:rPr>
+                <w:noProof/>
+                <w:webHidden/>
+              </w:rPr>
+              <w:fldChar w:fldCharType="separate"/>
+            </w:r>
+            <w:r>
+              <w:rPr>
+                <w:noProof/>
+                <w:webHidden/>
+              </w:rPr>
+              <w:t>24</w:t>
+            </w:r>
+            <w:r>
+              <w:rPr>
+                <w:noProof/>
+                <w:webHidden/>
+              </w:rPr>
+              <w:fldChar w:fldCharType="end"/>
+            </w:r>
+          </w:hyperlink>
+        </w:p>
+        <w:p>
+          <w:pPr>
+            <w:pStyle w:val="ndice2"/>
+            <w:tabs>
+              <w:tab w:val="left" w:pos="960"/>
+              <w:tab w:val="right" w:leader="dot" w:pos="9628"/>
+            </w:tabs>
+            <w:rPr>
+              <w:noProof/>
+              <w:kern w:val="2"/>
+              <w:lang w:eastAsia="pt-PT"/>
+              <w14:ligatures w14:val="standardContextual"/>
+            </w:rPr>
+          </w:pPr>
+          <w:hyperlink w:anchor="_Toc227590419" w:history="1">
+            <w:r>
+              <w:rPr>
+                <w:rStyle w:val="Hiperligao"/>
+                <w:noProof/>
+              </w:rPr>
+              <w:t>7.4</w:t>
+            </w:r>
+            <w:r>
+              <w:rPr>
+                <w:noProof/>
+                <w:kern w:val="2"/>
+                <w:lang w:eastAsia="pt-PT"/>
+                <w14:ligatures w14:val="standardContextual"/>
+              </w:rPr>
+              <w:tab/>
+            </w:r>
+            <w:r>
+              <w:rPr>
+                <w:rStyle w:val="Hiperligao"/>
+                <w:noProof/>
+              </w:rPr>
+              <w:t>Validação tolerante das jogadas do utilizador</w:t>
+            </w:r>
+            <w:r>
+              <w:rPr>
+                <w:noProof/>
+                <w:webHidden/>
+              </w:rPr>
+              <w:tab/>
+            </w:r>
+            <w:r>
+              <w:rPr>
+                <w:noProof/>
+                <w:webHidden/>
+              </w:rPr>
+              <w:fldChar w:fldCharType="begin"/>
+            </w:r>
+            <w:r>
+              <w:rPr>
+                <w:noProof/>
+                <w:webHidden/>
+              </w:rPr>
+              <w:instrText xml:space="preserve"> PAGEREF _Toc227590419 \h </w:instrText>
+            </w:r>
+            <w:r>
+              <w:rPr>
+                <w:noProof/>
+                <w:webHidden/>
+              </w:rPr>
+            </w:r>
+            <w:r>
+              <w:rPr>
+                <w:noProof/>
+                <w:webHidden/>
+              </w:rPr>
+              <w:fldChar w:fldCharType="separate"/>
+            </w:r>
+            <w:r>
+              <w:rPr>
+                <w:noProof/>
+                <w:webHidden/>
+              </w:rPr>
+              <w:t>24</w:t>
+            </w:r>
+            <w:r>
+              <w:rPr>
+                <w:noProof/>
+                <w:webHidden/>
+              </w:rPr>
+              <w:fldChar w:fldCharType="end"/>
+            </w:r>
+          </w:hyperlink>
+        </w:p>
+        <w:p>
+          <w:pPr>
+            <w:pStyle w:val="ndice2"/>
+            <w:tabs>
+              <w:tab w:val="left" w:pos="960"/>
+              <w:tab w:val="right" w:leader="dot" w:pos="9628"/>
+            </w:tabs>
+            <w:rPr>
+              <w:noProof/>
+              <w:kern w:val="2"/>
+              <w:lang w:eastAsia="pt-PT"/>
+              <w14:ligatures w14:val="standardContextual"/>
+            </w:rPr>
+          </w:pPr>
+          <w:hyperlink w:anchor="_Toc227590420" w:history="1">
+            <w:r>
+              <w:rPr>
+                <w:rStyle w:val="Hiperligao"/>
+                <w:noProof/>
+              </w:rPr>
+              <w:t>7.5</w:t>
+            </w:r>
+            <w:r>
+              <w:rPr>
+                <w:noProof/>
+                <w:kern w:val="2"/>
+                <w:lang w:eastAsia="pt-PT"/>
+                <w14:ligatures w14:val="standardContextual"/>
+              </w:rPr>
+              <w:tab/>
+            </w:r>
+            <w:r>
+              <w:rPr>
+                <w:rStyle w:val="Hiperligao"/>
+                <w:noProof/>
+              </w:rPr>
+              <w:t>Utilização de findall/3 para geração de sucessores</w:t>
+            </w:r>
+            <w:r>
+              <w:rPr>
+                <w:noProof/>
+                <w:webHidden/>
+              </w:rPr>
+              <w:tab/>
+            </w:r>
+            <w:r>
+              <w:rPr>
+                <w:noProof/>
+                <w:webHidden/>
+              </w:rPr>
+              <w:fldChar w:fldCharType="begin"/>
+            </w:r>
+            <w:r>
+              <w:rPr>
+                <w:noProof/>
+                <w:webHidden/>
+              </w:rPr>
+              <w:instrText xml:space="preserve"> PAGEREF _Toc227590420 \h </w:instrText>
+            </w:r>
+            <w:r>
+              <w:rPr>
+                <w:noProof/>
+                <w:webHidden/>
+              </w:rPr>
+            </w:r>
+            <w:r>
+              <w:rPr>
+                <w:noProof/>
+                <w:webHidden/>
+              </w:rPr>
+              <w:fldChar w:fldCharType="separate"/>
+            </w:r>
+            <w:r>
+              <w:rPr>
+                <w:noProof/>
+                <w:webHidden/>
+              </w:rPr>
+              <w:t>24</w:t>
             </w:r>
             <w:r>
               <w:rPr>
@@ -2307,7 +2786,7 @@
               <w14:ligatures w14:val="standardContextual"/>
             </w:rPr>
           </w:pPr>
-          <w:hyperlink w:anchor="_Toc227516730" w:history="1">
+          <w:hyperlink w:anchor="_Toc227590421" w:history="1">
             <w:r>
               <w:rPr>
                 <w:rStyle w:val="Hiperligao"/>
@@ -2350,7 +2829,7 @@
                 <w:noProof/>
                 <w:webHidden/>
               </w:rPr>
-              <w:instrText xml:space="preserve"> PAGEREF _Toc227516730 \h </w:instrText>
+              <w:instrText xml:space="preserve"> PAGEREF _Toc227590421 \h </w:instrText>
             </w:r>
             <w:r>
               <w:rPr>
@@ -2370,95 +2849,7 @@
                 <w:noProof/>
                 <w:webHidden/>
               </w:rPr>
-              <w:t>13</w:t>
-            </w:r>
-            <w:r>
-              <w:rPr>
-                <w:noProof/>
-                <w:webHidden/>
-              </w:rPr>
-              <w:fldChar w:fldCharType="end"/>
-            </w:r>
-          </w:hyperlink>
-        </w:p>
-        <w:p>
-          <w:pPr>
-            <w:pStyle w:val="ndice1"/>
-            <w:tabs>
-              <w:tab w:val="left" w:pos="480"/>
-              <w:tab w:val="right" w:leader="dot" w:pos="9628"/>
-            </w:tabs>
-            <w:rPr>
-              <w:noProof/>
-              <w:kern w:val="2"/>
-              <w:lang w:eastAsia="pt-PT"/>
-              <w14:ligatures w14:val="standardContextual"/>
-            </w:rPr>
-          </w:pPr>
-          <w:hyperlink w:anchor="_Toc227516731" w:history="1">
-            <w:r>
-              <w:rPr>
-                <w:rStyle w:val="Hiperligao"/>
-                <w:noProof/>
-              </w:rPr>
-              <w:t>9</w:t>
-            </w:r>
-            <w:r>
-              <w:rPr>
-                <w:noProof/>
-                <w:kern w:val="2"/>
-                <w:lang w:eastAsia="pt-PT"/>
-                <w14:ligatures w14:val="standardContextual"/>
-              </w:rPr>
-              <w:tab/>
-            </w:r>
-            <w:r>
-              <w:rPr>
-                <w:rStyle w:val="Hiperligao"/>
-                <w:noProof/>
-              </w:rPr>
-              <w:t>Referências</w:t>
-            </w:r>
-            <w:r>
-              <w:rPr>
-                <w:noProof/>
-                <w:webHidden/>
-              </w:rPr>
-              <w:tab/>
-            </w:r>
-            <w:r>
-              <w:rPr>
-                <w:noProof/>
-                <w:webHidden/>
-              </w:rPr>
-              <w:fldChar w:fldCharType="begin"/>
-            </w:r>
-            <w:r>
-              <w:rPr>
-                <w:noProof/>
-                <w:webHidden/>
-              </w:rPr>
-              <w:instrText xml:space="preserve"> PAGEREF _Toc227516731 \h </w:instrText>
-            </w:r>
-            <w:r>
-              <w:rPr>
-                <w:noProof/>
-                <w:webHidden/>
-              </w:rPr>
-            </w:r>
-            <w:r>
-              <w:rPr>
-                <w:noProof/>
-                <w:webHidden/>
-              </w:rPr>
-              <w:fldChar w:fldCharType="separate"/>
-            </w:r>
-            <w:r>
-              <w:rPr>
-                <w:noProof/>
-                <w:webHidden/>
-              </w:rPr>
-              <w:t>13</w:t>
+              <w:t>26</w:t>
             </w:r>
             <w:r>
               <w:rPr>
@@ -2480,7 +2871,6 @@
         </w:p>
       </w:sdtContent>
     </w:sdt>
-    <w:bookmarkStart w:id="1" w:name="_Toc227516710" w:displacedByCustomXml="prev"/>
     <w:p>
       <w:pPr>
         <w:spacing w:after="160" w:line="278" w:lineRule="auto"/>
@@ -2488,6 +2878,15 @@
       </w:pPr>
       <w:r>
         <w:br w:type="page"/>
+      </w:r>
+    </w:p>
+    <w:p>
+      <w:pPr>
+        <w:pStyle w:val="Ttulondice"/>
+      </w:pPr>
+      <w:r>
+        <w:lastRenderedPageBreak/>
+        <w:t xml:space="preserve">Índice de tabelas </w:t>
       </w:r>
     </w:p>
     <w:p>
@@ -2496,6 +2895,14 @@
         <w:tabs>
           <w:tab w:val="right" w:leader="dot" w:pos="9628"/>
         </w:tabs>
+      </w:pPr>
+    </w:p>
+    <w:p>
+      <w:pPr>
+        <w:pStyle w:val="ndicedeilustraes"/>
+        <w:tabs>
+          <w:tab w:val="right" w:leader="dot" w:pos="9628"/>
+        </w:tabs>
         <w:rPr>
           <w:noProof/>
           <w:kern w:val="2"/>
@@ -2504,7 +2911,6 @@
         </w:rPr>
       </w:pPr>
       <w:r>
-        <w:lastRenderedPageBreak/>
         <w:fldChar w:fldCharType="begin"/>
       </w:r>
       <w:r>
@@ -2513,7 +2919,7 @@
       <w:r>
         <w:fldChar w:fldCharType="separate"/>
       </w:r>
-      <w:hyperlink w:anchor="_Toc227518757" w:history="1">
+      <w:hyperlink w:anchor="_Toc227581264" w:history="1">
         <w:r>
           <w:rPr>
             <w:rStyle w:val="Hiperligao"/>
@@ -2540,7 +2946,7 @@
             <w:noProof/>
             <w:webHidden/>
           </w:rPr>
-          <w:instrText xml:space="preserve"> PAGEREF _Toc227518757 \h </w:instrText>
+          <w:instrText xml:space="preserve"> PAGEREF _Toc227581264 \h </w:instrText>
         </w:r>
         <w:r>
           <w:rPr>
@@ -2560,7 +2966,7 @@
             <w:noProof/>
             <w:webHidden/>
           </w:rPr>
-          <w:t>6</w:t>
+          <w:t>7</w:t>
         </w:r>
         <w:r>
           <w:rPr>
@@ -2580,6 +2986,819 @@
       <w:pPr>
         <w:spacing w:after="160" w:line="278" w:lineRule="auto"/>
         <w:jc w:val="left"/>
+      </w:pPr>
+      <w:r>
+        <w:br w:type="page"/>
+      </w:r>
+    </w:p>
+    <w:p>
+      <w:pPr>
+        <w:pStyle w:val="Ttulondice"/>
+      </w:pPr>
+      <w:r>
+        <w:lastRenderedPageBreak/>
+        <w:t xml:space="preserve">Índice de figuras </w:t>
+      </w:r>
+    </w:p>
+    <w:p>
+      <w:pPr>
+        <w:pStyle w:val="ndicedeilustraes"/>
+        <w:tabs>
+          <w:tab w:val="right" w:leader="dot" w:pos="9628"/>
+        </w:tabs>
+        <w:rPr>
+          <w:noProof/>
+          <w:kern w:val="2"/>
+          <w:lang w:eastAsia="pt-PT"/>
+          <w14:ligatures w14:val="standardContextual"/>
+        </w:rPr>
+      </w:pPr>
+      <w:r>
+        <w:fldChar w:fldCharType="begin"/>
+      </w:r>
+      <w:r>
+        <w:instrText xml:space="preserve"> TOC \h \z \c "Figura" </w:instrText>
+      </w:r>
+      <w:r>
+        <w:fldChar w:fldCharType="separate"/>
+      </w:r>
+      <w:hyperlink w:anchor="_Toc227590422" w:history="1">
+        <w:r>
+          <w:rPr>
+            <w:rStyle w:val="Hiperligao"/>
+            <w:noProof/>
+          </w:rPr>
+          <w:t>Figura 1 Vitória do minimax</w:t>
+        </w:r>
+        <w:r>
+          <w:rPr>
+            <w:noProof/>
+            <w:webHidden/>
+          </w:rPr>
+          <w:tab/>
+        </w:r>
+        <w:r>
+          <w:rPr>
+            <w:noProof/>
+            <w:webHidden/>
+          </w:rPr>
+          <w:fldChar w:fldCharType="begin"/>
+        </w:r>
+        <w:r>
+          <w:rPr>
+            <w:noProof/>
+            <w:webHidden/>
+          </w:rPr>
+          <w:instrText xml:space="preserve"> PAGEREF _Toc227590422 \h </w:instrText>
+        </w:r>
+        <w:r>
+          <w:rPr>
+            <w:noProof/>
+            <w:webHidden/>
+          </w:rPr>
+        </w:r>
+        <w:r>
+          <w:rPr>
+            <w:noProof/>
+            <w:webHidden/>
+          </w:rPr>
+          <w:fldChar w:fldCharType="separate"/>
+        </w:r>
+        <w:r>
+          <w:rPr>
+            <w:noProof/>
+            <w:webHidden/>
+          </w:rPr>
+          <w:t>15</w:t>
+        </w:r>
+        <w:r>
+          <w:rPr>
+            <w:noProof/>
+            <w:webHidden/>
+          </w:rPr>
+          <w:fldChar w:fldCharType="end"/>
+        </w:r>
+      </w:hyperlink>
+    </w:p>
+    <w:p>
+      <w:pPr>
+        <w:pStyle w:val="ndicedeilustraes"/>
+        <w:tabs>
+          <w:tab w:val="right" w:leader="dot" w:pos="9628"/>
+        </w:tabs>
+        <w:rPr>
+          <w:noProof/>
+          <w:kern w:val="2"/>
+          <w:lang w:eastAsia="pt-PT"/>
+          <w14:ligatures w14:val="standardContextual"/>
+        </w:rPr>
+      </w:pPr>
+      <w:hyperlink w:anchor="_Toc227590423" w:history="1">
+        <w:r>
+          <w:rPr>
+            <w:rStyle w:val="Hiperligao"/>
+            <w:noProof/>
+          </w:rPr>
+          <w:t>Figura 2 vitória do alfa-beta</w:t>
+        </w:r>
+        <w:r>
+          <w:rPr>
+            <w:noProof/>
+            <w:webHidden/>
+          </w:rPr>
+          <w:tab/>
+        </w:r>
+        <w:r>
+          <w:rPr>
+            <w:noProof/>
+            <w:webHidden/>
+          </w:rPr>
+          <w:fldChar w:fldCharType="begin"/>
+        </w:r>
+        <w:r>
+          <w:rPr>
+            <w:noProof/>
+            <w:webHidden/>
+          </w:rPr>
+          <w:instrText xml:space="preserve"> PAGEREF _Toc227590423 \h </w:instrText>
+        </w:r>
+        <w:r>
+          <w:rPr>
+            <w:noProof/>
+            <w:webHidden/>
+          </w:rPr>
+        </w:r>
+        <w:r>
+          <w:rPr>
+            <w:noProof/>
+            <w:webHidden/>
+          </w:rPr>
+          <w:fldChar w:fldCharType="separate"/>
+        </w:r>
+        <w:r>
+          <w:rPr>
+            <w:noProof/>
+            <w:webHidden/>
+          </w:rPr>
+          <w:t>16</w:t>
+        </w:r>
+        <w:r>
+          <w:rPr>
+            <w:noProof/>
+            <w:webHidden/>
+          </w:rPr>
+          <w:fldChar w:fldCharType="end"/>
+        </w:r>
+      </w:hyperlink>
+    </w:p>
+    <w:p>
+      <w:pPr>
+        <w:pStyle w:val="ndicedeilustraes"/>
+        <w:tabs>
+          <w:tab w:val="right" w:leader="dot" w:pos="9628"/>
+        </w:tabs>
+        <w:rPr>
+          <w:noProof/>
+          <w:kern w:val="2"/>
+          <w:lang w:eastAsia="pt-PT"/>
+          <w14:ligatures w14:val="standardContextual"/>
+        </w:rPr>
+      </w:pPr>
+      <w:hyperlink w:anchor="_Toc227590424" w:history="1">
+        <w:r>
+          <w:rPr>
+            <w:rStyle w:val="Hiperligao"/>
+            <w:noProof/>
+          </w:rPr>
+          <w:t>Figura 3 Jogada invalida do humano</w:t>
+        </w:r>
+        <w:r>
+          <w:rPr>
+            <w:noProof/>
+            <w:webHidden/>
+          </w:rPr>
+          <w:tab/>
+        </w:r>
+        <w:r>
+          <w:rPr>
+            <w:noProof/>
+            <w:webHidden/>
+          </w:rPr>
+          <w:fldChar w:fldCharType="begin"/>
+        </w:r>
+        <w:r>
+          <w:rPr>
+            <w:noProof/>
+            <w:webHidden/>
+          </w:rPr>
+          <w:instrText xml:space="preserve"> PAGEREF _Toc227590424 \h </w:instrText>
+        </w:r>
+        <w:r>
+          <w:rPr>
+            <w:noProof/>
+            <w:webHidden/>
+          </w:rPr>
+        </w:r>
+        <w:r>
+          <w:rPr>
+            <w:noProof/>
+            <w:webHidden/>
+          </w:rPr>
+          <w:fldChar w:fldCharType="separate"/>
+        </w:r>
+        <w:r>
+          <w:rPr>
+            <w:noProof/>
+            <w:webHidden/>
+          </w:rPr>
+          <w:t>16</w:t>
+        </w:r>
+        <w:r>
+          <w:rPr>
+            <w:noProof/>
+            <w:webHidden/>
+          </w:rPr>
+          <w:fldChar w:fldCharType="end"/>
+        </w:r>
+      </w:hyperlink>
+    </w:p>
+    <w:p>
+      <w:pPr>
+        <w:pStyle w:val="ndicedeilustraes"/>
+        <w:tabs>
+          <w:tab w:val="right" w:leader="dot" w:pos="9628"/>
+        </w:tabs>
+        <w:rPr>
+          <w:noProof/>
+          <w:kern w:val="2"/>
+          <w:lang w:eastAsia="pt-PT"/>
+          <w14:ligatures w14:val="standardContextual"/>
+        </w:rPr>
+      </w:pPr>
+      <w:hyperlink w:anchor="_Toc227590425" w:history="1">
+        <w:r>
+          <w:rPr>
+            <w:rStyle w:val="Hiperligao"/>
+            <w:noProof/>
+          </w:rPr>
+          <w:t>Figura 4 Jogo perfeito por parte da AI parte 1</w:t>
+        </w:r>
+        <w:r>
+          <w:rPr>
+            <w:noProof/>
+            <w:webHidden/>
+          </w:rPr>
+          <w:tab/>
+        </w:r>
+        <w:r>
+          <w:rPr>
+            <w:noProof/>
+            <w:webHidden/>
+          </w:rPr>
+          <w:fldChar w:fldCharType="begin"/>
+        </w:r>
+        <w:r>
+          <w:rPr>
+            <w:noProof/>
+            <w:webHidden/>
+          </w:rPr>
+          <w:instrText xml:space="preserve"> PAGEREF _Toc227590425 \h </w:instrText>
+        </w:r>
+        <w:r>
+          <w:rPr>
+            <w:noProof/>
+            <w:webHidden/>
+          </w:rPr>
+        </w:r>
+        <w:r>
+          <w:rPr>
+            <w:noProof/>
+            <w:webHidden/>
+          </w:rPr>
+          <w:fldChar w:fldCharType="separate"/>
+        </w:r>
+        <w:r>
+          <w:rPr>
+            <w:noProof/>
+            <w:webHidden/>
+          </w:rPr>
+          <w:t>17</w:t>
+        </w:r>
+        <w:r>
+          <w:rPr>
+            <w:noProof/>
+            <w:webHidden/>
+          </w:rPr>
+          <w:fldChar w:fldCharType="end"/>
+        </w:r>
+      </w:hyperlink>
+    </w:p>
+    <w:p>
+      <w:pPr>
+        <w:pStyle w:val="ndicedeilustraes"/>
+        <w:tabs>
+          <w:tab w:val="right" w:leader="dot" w:pos="9628"/>
+        </w:tabs>
+        <w:rPr>
+          <w:noProof/>
+          <w:kern w:val="2"/>
+          <w:lang w:eastAsia="pt-PT"/>
+          <w14:ligatures w14:val="standardContextual"/>
+        </w:rPr>
+      </w:pPr>
+      <w:hyperlink w:anchor="_Toc227590426" w:history="1">
+        <w:r>
+          <w:rPr>
+            <w:rStyle w:val="Hiperligao"/>
+            <w:noProof/>
+          </w:rPr>
+          <w:t>Figura 5 Jogo perfeito por parte da AI part 2</w:t>
+        </w:r>
+        <w:r>
+          <w:rPr>
+            <w:noProof/>
+            <w:webHidden/>
+          </w:rPr>
+          <w:tab/>
+        </w:r>
+        <w:r>
+          <w:rPr>
+            <w:noProof/>
+            <w:webHidden/>
+          </w:rPr>
+          <w:fldChar w:fldCharType="begin"/>
+        </w:r>
+        <w:r>
+          <w:rPr>
+            <w:noProof/>
+            <w:webHidden/>
+          </w:rPr>
+          <w:instrText xml:space="preserve"> PAGEREF _Toc227590426 \h </w:instrText>
+        </w:r>
+        <w:r>
+          <w:rPr>
+            <w:noProof/>
+            <w:webHidden/>
+          </w:rPr>
+        </w:r>
+        <w:r>
+          <w:rPr>
+            <w:noProof/>
+            <w:webHidden/>
+          </w:rPr>
+          <w:fldChar w:fldCharType="separate"/>
+        </w:r>
+        <w:r>
+          <w:rPr>
+            <w:noProof/>
+            <w:webHidden/>
+          </w:rPr>
+          <w:t>18</w:t>
+        </w:r>
+        <w:r>
+          <w:rPr>
+            <w:noProof/>
+            <w:webHidden/>
+          </w:rPr>
+          <w:fldChar w:fldCharType="end"/>
+        </w:r>
+      </w:hyperlink>
+    </w:p>
+    <w:p>
+      <w:pPr>
+        <w:pStyle w:val="ndicedeilustraes"/>
+        <w:tabs>
+          <w:tab w:val="right" w:leader="dot" w:pos="9628"/>
+        </w:tabs>
+        <w:rPr>
+          <w:noProof/>
+          <w:kern w:val="2"/>
+          <w:lang w:eastAsia="pt-PT"/>
+          <w14:ligatures w14:val="standardContextual"/>
+        </w:rPr>
+      </w:pPr>
+      <w:hyperlink w:anchor="_Toc227590427" w:history="1">
+        <w:r>
+          <w:rPr>
+            <w:rStyle w:val="Hiperligao"/>
+            <w:noProof/>
+          </w:rPr>
+          <w:t>Figura 6 Jogo perfeito por parte da AI part 3</w:t>
+        </w:r>
+        <w:r>
+          <w:rPr>
+            <w:noProof/>
+            <w:webHidden/>
+          </w:rPr>
+          <w:tab/>
+        </w:r>
+        <w:r>
+          <w:rPr>
+            <w:noProof/>
+            <w:webHidden/>
+          </w:rPr>
+          <w:fldChar w:fldCharType="begin"/>
+        </w:r>
+        <w:r>
+          <w:rPr>
+            <w:noProof/>
+            <w:webHidden/>
+          </w:rPr>
+          <w:instrText xml:space="preserve"> PAGEREF _Toc227590427 \h </w:instrText>
+        </w:r>
+        <w:r>
+          <w:rPr>
+            <w:noProof/>
+            <w:webHidden/>
+          </w:rPr>
+        </w:r>
+        <w:r>
+          <w:rPr>
+            <w:noProof/>
+            <w:webHidden/>
+          </w:rPr>
+          <w:fldChar w:fldCharType="separate"/>
+        </w:r>
+        <w:r>
+          <w:rPr>
+            <w:noProof/>
+            <w:webHidden/>
+          </w:rPr>
+          <w:t>19</w:t>
+        </w:r>
+        <w:r>
+          <w:rPr>
+            <w:noProof/>
+            <w:webHidden/>
+          </w:rPr>
+          <w:fldChar w:fldCharType="end"/>
+        </w:r>
+      </w:hyperlink>
+    </w:p>
+    <w:p>
+      <w:pPr>
+        <w:pStyle w:val="ndicedeilustraes"/>
+        <w:tabs>
+          <w:tab w:val="right" w:leader="dot" w:pos="9628"/>
+        </w:tabs>
+        <w:rPr>
+          <w:noProof/>
+          <w:kern w:val="2"/>
+          <w:lang w:eastAsia="pt-PT"/>
+          <w14:ligatures w14:val="standardContextual"/>
+        </w:rPr>
+      </w:pPr>
+      <w:hyperlink w:anchor="_Toc227590428" w:history="1">
+        <w:r>
+          <w:rPr>
+            <w:rStyle w:val="Hiperligao"/>
+            <w:noProof/>
+          </w:rPr>
+          <w:t>Figura 7 Jogo perfeito por parte da AI part 4</w:t>
+        </w:r>
+        <w:r>
+          <w:rPr>
+            <w:noProof/>
+            <w:webHidden/>
+          </w:rPr>
+          <w:tab/>
+        </w:r>
+        <w:r>
+          <w:rPr>
+            <w:noProof/>
+            <w:webHidden/>
+          </w:rPr>
+          <w:fldChar w:fldCharType="begin"/>
+        </w:r>
+        <w:r>
+          <w:rPr>
+            <w:noProof/>
+            <w:webHidden/>
+          </w:rPr>
+          <w:instrText xml:space="preserve"> PAGEREF _Toc227590428 \h </w:instrText>
+        </w:r>
+        <w:r>
+          <w:rPr>
+            <w:noProof/>
+            <w:webHidden/>
+          </w:rPr>
+        </w:r>
+        <w:r>
+          <w:rPr>
+            <w:noProof/>
+            <w:webHidden/>
+          </w:rPr>
+          <w:fldChar w:fldCharType="separate"/>
+        </w:r>
+        <w:r>
+          <w:rPr>
+            <w:noProof/>
+            <w:webHidden/>
+          </w:rPr>
+          <w:t>20</w:t>
+        </w:r>
+        <w:r>
+          <w:rPr>
+            <w:noProof/>
+            <w:webHidden/>
+          </w:rPr>
+          <w:fldChar w:fldCharType="end"/>
+        </w:r>
+      </w:hyperlink>
+    </w:p>
+    <w:p>
+      <w:pPr>
+        <w:pStyle w:val="ndicedeilustraes"/>
+        <w:tabs>
+          <w:tab w:val="right" w:leader="dot" w:pos="9628"/>
+        </w:tabs>
+        <w:rPr>
+          <w:noProof/>
+          <w:kern w:val="2"/>
+          <w:lang w:eastAsia="pt-PT"/>
+          <w14:ligatures w14:val="standardContextual"/>
+        </w:rPr>
+      </w:pPr>
+      <w:hyperlink w:anchor="_Toc227590429" w:history="1">
+        <w:r>
+          <w:rPr>
+            <w:rStyle w:val="Hiperligao"/>
+            <w:noProof/>
+          </w:rPr>
+          <w:t>Figura 8 alfa-beta com 6 de profundidade</w:t>
+        </w:r>
+        <w:r>
+          <w:rPr>
+            <w:noProof/>
+            <w:webHidden/>
+          </w:rPr>
+          <w:tab/>
+        </w:r>
+        <w:r>
+          <w:rPr>
+            <w:noProof/>
+            <w:webHidden/>
+          </w:rPr>
+          <w:fldChar w:fldCharType="begin"/>
+        </w:r>
+        <w:r>
+          <w:rPr>
+            <w:noProof/>
+            <w:webHidden/>
+          </w:rPr>
+          <w:instrText xml:space="preserve"> PAGEREF _Toc227590429 \h </w:instrText>
+        </w:r>
+        <w:r>
+          <w:rPr>
+            <w:noProof/>
+            <w:webHidden/>
+          </w:rPr>
+        </w:r>
+        <w:r>
+          <w:rPr>
+            <w:noProof/>
+            <w:webHidden/>
+          </w:rPr>
+          <w:fldChar w:fldCharType="separate"/>
+        </w:r>
+        <w:r>
+          <w:rPr>
+            <w:noProof/>
+            <w:webHidden/>
+          </w:rPr>
+          <w:t>20</w:t>
+        </w:r>
+        <w:r>
+          <w:rPr>
+            <w:noProof/>
+            <w:webHidden/>
+          </w:rPr>
+          <w:fldChar w:fldCharType="end"/>
+        </w:r>
+      </w:hyperlink>
+    </w:p>
+    <w:p>
+      <w:pPr>
+        <w:pStyle w:val="ndicedeilustraes"/>
+        <w:tabs>
+          <w:tab w:val="right" w:leader="dot" w:pos="9628"/>
+        </w:tabs>
+        <w:rPr>
+          <w:noProof/>
+          <w:kern w:val="2"/>
+          <w:lang w:eastAsia="pt-PT"/>
+          <w14:ligatures w14:val="standardContextual"/>
+        </w:rPr>
+      </w:pPr>
+      <w:hyperlink w:anchor="_Toc227590430" w:history="1">
+        <w:r>
+          <w:rPr>
+            <w:rStyle w:val="Hiperligao"/>
+            <w:noProof/>
+          </w:rPr>
+          <w:t>Figura 9 alfa-beta com 5 de profundidade</w:t>
+        </w:r>
+        <w:r>
+          <w:rPr>
+            <w:noProof/>
+            <w:webHidden/>
+          </w:rPr>
+          <w:tab/>
+        </w:r>
+        <w:r>
+          <w:rPr>
+            <w:noProof/>
+            <w:webHidden/>
+          </w:rPr>
+          <w:fldChar w:fldCharType="begin"/>
+        </w:r>
+        <w:r>
+          <w:rPr>
+            <w:noProof/>
+            <w:webHidden/>
+          </w:rPr>
+          <w:instrText xml:space="preserve"> PAGEREF _Toc227590430 \h </w:instrText>
+        </w:r>
+        <w:r>
+          <w:rPr>
+            <w:noProof/>
+            <w:webHidden/>
+          </w:rPr>
+        </w:r>
+        <w:r>
+          <w:rPr>
+            <w:noProof/>
+            <w:webHidden/>
+          </w:rPr>
+          <w:fldChar w:fldCharType="separate"/>
+        </w:r>
+        <w:r>
+          <w:rPr>
+            <w:noProof/>
+            <w:webHidden/>
+          </w:rPr>
+          <w:t>21</w:t>
+        </w:r>
+        <w:r>
+          <w:rPr>
+            <w:noProof/>
+            <w:webHidden/>
+          </w:rPr>
+          <w:fldChar w:fldCharType="end"/>
+        </w:r>
+      </w:hyperlink>
+    </w:p>
+    <w:p>
+      <w:pPr>
+        <w:pStyle w:val="ndicedeilustraes"/>
+        <w:tabs>
+          <w:tab w:val="right" w:leader="dot" w:pos="9628"/>
+        </w:tabs>
+        <w:rPr>
+          <w:noProof/>
+          <w:kern w:val="2"/>
+          <w:lang w:eastAsia="pt-PT"/>
+          <w14:ligatures w14:val="standardContextual"/>
+        </w:rPr>
+      </w:pPr>
+      <w:hyperlink w:anchor="_Toc227590431" w:history="1">
+        <w:r>
+          <w:rPr>
+            <w:rStyle w:val="Hiperligao"/>
+            <w:noProof/>
+          </w:rPr>
+          <w:t>Figura 10 alfa-beta com 4 de profundidade</w:t>
+        </w:r>
+        <w:r>
+          <w:rPr>
+            <w:noProof/>
+            <w:webHidden/>
+          </w:rPr>
+          <w:tab/>
+        </w:r>
+        <w:r>
+          <w:rPr>
+            <w:noProof/>
+            <w:webHidden/>
+          </w:rPr>
+          <w:fldChar w:fldCharType="begin"/>
+        </w:r>
+        <w:r>
+          <w:rPr>
+            <w:noProof/>
+            <w:webHidden/>
+          </w:rPr>
+          <w:instrText xml:space="preserve"> PAGEREF _Toc227590431 \h </w:instrText>
+        </w:r>
+        <w:r>
+          <w:rPr>
+            <w:noProof/>
+            <w:webHidden/>
+          </w:rPr>
+        </w:r>
+        <w:r>
+          <w:rPr>
+            <w:noProof/>
+            <w:webHidden/>
+          </w:rPr>
+          <w:fldChar w:fldCharType="separate"/>
+        </w:r>
+        <w:r>
+          <w:rPr>
+            <w:noProof/>
+            <w:webHidden/>
+          </w:rPr>
+          <w:t>22</w:t>
+        </w:r>
+        <w:r>
+          <w:rPr>
+            <w:noProof/>
+            <w:webHidden/>
+          </w:rPr>
+          <w:fldChar w:fldCharType="end"/>
+        </w:r>
+      </w:hyperlink>
+    </w:p>
+    <w:p>
+      <w:pPr>
+        <w:pStyle w:val="ndicedeilustraes"/>
+        <w:tabs>
+          <w:tab w:val="right" w:leader="dot" w:pos="9628"/>
+        </w:tabs>
+        <w:rPr>
+          <w:noProof/>
+          <w:kern w:val="2"/>
+          <w:lang w:eastAsia="pt-PT"/>
+          <w14:ligatures w14:val="standardContextual"/>
+        </w:rPr>
+      </w:pPr>
+      <w:hyperlink w:anchor="_Toc227590432" w:history="1">
+        <w:r>
+          <w:rPr>
+            <w:rStyle w:val="Hiperligao"/>
+            <w:noProof/>
+          </w:rPr>
+          <w:t>Figura 11 10 alfa-beta com 4 de profundidade</w:t>
+        </w:r>
+        <w:r>
+          <w:rPr>
+            <w:noProof/>
+            <w:webHidden/>
+          </w:rPr>
+          <w:tab/>
+        </w:r>
+        <w:r>
+          <w:rPr>
+            <w:noProof/>
+            <w:webHidden/>
+          </w:rPr>
+          <w:fldChar w:fldCharType="begin"/>
+        </w:r>
+        <w:r>
+          <w:rPr>
+            <w:noProof/>
+            <w:webHidden/>
+          </w:rPr>
+          <w:instrText xml:space="preserve"> PAGEREF _Toc227590432 \h </w:instrText>
+        </w:r>
+        <w:r>
+          <w:rPr>
+            <w:noProof/>
+            <w:webHidden/>
+          </w:rPr>
+        </w:r>
+        <w:r>
+          <w:rPr>
+            <w:noProof/>
+            <w:webHidden/>
+          </w:rPr>
+          <w:fldChar w:fldCharType="separate"/>
+        </w:r>
+        <w:r>
+          <w:rPr>
+            <w:noProof/>
+            <w:webHidden/>
+          </w:rPr>
+          <w:t>23</w:t>
+        </w:r>
+        <w:r>
+          <w:rPr>
+            <w:noProof/>
+            <w:webHidden/>
+          </w:rPr>
+          <w:fldChar w:fldCharType="end"/>
+        </w:r>
+      </w:hyperlink>
+    </w:p>
+    <w:p>
+      <w:r>
+        <w:fldChar w:fldCharType="end"/>
+      </w:r>
+    </w:p>
+    <w:p>
+      <w:pPr>
+        <w:spacing w:after="160" w:line="278" w:lineRule="auto"/>
+        <w:jc w:val="left"/>
         <w:rPr>
           <w:rFonts w:asciiTheme="majorHAnsi" w:eastAsiaTheme="majorEastAsia" w:hAnsiTheme="majorHAnsi" w:cstheme="majorBidi"/>
           <w:color w:val="0F4761" w:themeColor="accent1" w:themeShade="BF"/>
@@ -2595,6 +3814,7 @@
       <w:pPr>
         <w:pStyle w:val="Ttulo1"/>
       </w:pPr>
+      <w:bookmarkStart w:id="1" w:name="_Toc227590395"/>
       <w:r>
         <w:lastRenderedPageBreak/>
         <w:t>Introdução</w:t>
@@ -2702,7 +3922,6 @@
           <w:szCs w:val="40"/>
         </w:rPr>
       </w:pPr>
-      <w:bookmarkStart w:id="2" w:name="_Toc227516711"/>
       <w:r>
         <w:br w:type="page"/>
       </w:r>
@@ -2711,6 +3930,7 @@
       <w:pPr>
         <w:pStyle w:val="Ttulo1"/>
       </w:pPr>
+      <w:bookmarkStart w:id="2" w:name="_Toc227590396"/>
       <w:r>
         <w:lastRenderedPageBreak/>
         <w:t>Descrição do jogo ISOLA</w:t>
@@ -2722,7 +3942,7 @@
       <w:pPr>
         <w:pStyle w:val="Ttulo2"/>
       </w:pPr>
-      <w:bookmarkStart w:id="3" w:name="_Toc227516712"/>
+      <w:bookmarkStart w:id="3" w:name="_Toc227590397"/>
       <w:r>
         <w:t>R</w:t>
       </w:r>
@@ -2889,7 +4109,7 @@
       <w:pPr>
         <w:pStyle w:val="Ttulo2"/>
       </w:pPr>
-      <w:bookmarkStart w:id="4" w:name="_Toc227516713"/>
+      <w:bookmarkStart w:id="4" w:name="_Toc227590398"/>
       <w:r>
         <w:t>Re</w:t>
       </w:r>
@@ -3038,7 +4258,7 @@
       <w:pPr>
         <w:pStyle w:val="Ttulo1"/>
       </w:pPr>
-      <w:bookmarkStart w:id="5" w:name="_Toc227516714"/>
+      <w:bookmarkStart w:id="5" w:name="_Toc227590399"/>
       <w:r>
         <w:lastRenderedPageBreak/>
         <w:t>Estrutura do Código</w:t>
@@ -3063,28 +4283,18 @@
         <w:pStyle w:val="Legenda"/>
         <w:keepNext/>
       </w:pPr>
-      <w:bookmarkStart w:id="6" w:name="_Toc227518757"/>
+      <w:bookmarkStart w:id="6" w:name="_Toc227581264"/>
       <w:r>
         <w:t xml:space="preserve">Tabela </w:t>
       </w:r>
-      <w:r>
-        <w:fldChar w:fldCharType="begin"/>
-      </w:r>
-      <w:r>
-        <w:instrText xml:space="preserve"> SEQ Tabela \* ARABIC </w:instrText>
-      </w:r>
-      <w:r>
-        <w:fldChar w:fldCharType="separate"/>
-      </w:r>
-      <w:r>
-        <w:rPr>
-          <w:noProof/>
-        </w:rPr>
-        <w:t>1</w:t>
-      </w:r>
-      <w:r>
-        <w:fldChar w:fldCharType="end"/>
-      </w:r>
+      <w:fldSimple w:instr=" SEQ Tabela \* ARABIC ">
+        <w:r>
+          <w:rPr>
+            <w:noProof/>
+          </w:rPr>
+          <w:t>1</w:t>
+        </w:r>
+      </w:fldSimple>
       <w:r>
         <w:t xml:space="preserve"> Descrição de cada ficheiro</w:t>
       </w:r>
@@ -3444,7 +4654,6 @@
           <w:szCs w:val="40"/>
         </w:rPr>
       </w:pPr>
-      <w:bookmarkStart w:id="7" w:name="_Toc227516715"/>
       <w:r>
         <w:br w:type="page"/>
       </w:r>
@@ -3453,6 +4662,7 @@
       <w:pPr>
         <w:pStyle w:val="Ttulo1"/>
       </w:pPr>
+      <w:bookmarkStart w:id="7" w:name="_Toc227590400"/>
       <w:r>
         <w:lastRenderedPageBreak/>
         <w:t>Principais Predicados</w:t>
@@ -3504,7 +4714,7 @@
       <w:pPr>
         <w:pStyle w:val="Ttulo2"/>
       </w:pPr>
-      <w:bookmarkStart w:id="8" w:name="_Toc227516716"/>
+      <w:bookmarkStart w:id="8" w:name="_Toc227590401"/>
       <w:r>
         <w:t>main.pl — Ciclo de Jogo</w:t>
       </w:r>
@@ -3678,7 +4888,7 @@
       <w:pPr>
         <w:pStyle w:val="Ttulo2"/>
       </w:pPr>
-      <w:bookmarkStart w:id="9" w:name="_Toc227516717"/>
+      <w:bookmarkStart w:id="9" w:name="_Toc227590402"/>
       <w:r>
         <w:t>utils.pl — Utilitários</w:t>
       </w:r>
@@ -4163,7 +5373,7 @@
       <w:pPr>
         <w:pStyle w:val="Ttulo2"/>
       </w:pPr>
-      <w:bookmarkStart w:id="10" w:name="_Toc227516718"/>
+      <w:bookmarkStart w:id="10" w:name="_Toc227590403"/>
       <w:r>
         <w:t>replace.pl — Substituição no Tabuleiro</w:t>
       </w:r>
@@ -4194,7 +5404,7 @@
       <w:pPr>
         <w:pStyle w:val="Ttulo2"/>
       </w:pPr>
-      <w:bookmarkStart w:id="11" w:name="_Toc227516719"/>
+      <w:bookmarkStart w:id="11" w:name="_Toc227590404"/>
       <w:r>
         <w:t>print.pl — Impressão</w:t>
       </w:r>
@@ -4238,7 +5448,6 @@
           <w:szCs w:val="40"/>
         </w:rPr>
       </w:pPr>
-      <w:bookmarkStart w:id="12" w:name="_Toc227516720"/>
       <w:r>
         <w:br w:type="page"/>
       </w:r>
@@ -4247,6 +5456,7 @@
       <w:pPr>
         <w:pStyle w:val="Ttulo1"/>
       </w:pPr>
+      <w:bookmarkStart w:id="12" w:name="_Toc227590405"/>
       <w:r>
         <w:lastRenderedPageBreak/>
         <w:t xml:space="preserve">Algoritmos de Pesquisa </w:t>
@@ -4262,7 +5472,7 @@
       <w:pPr>
         <w:pStyle w:val="Ttulo2"/>
       </w:pPr>
-      <w:bookmarkStart w:id="13" w:name="_Toc227516721"/>
+      <w:bookmarkStart w:id="13" w:name="_Toc227590406"/>
       <w:proofErr w:type="spellStart"/>
       <w:r>
         <w:t>Minimax</w:t>
@@ -4393,7 +5603,7 @@
       <w:pPr>
         <w:pStyle w:val="Ttulo2"/>
       </w:pPr>
-      <w:bookmarkStart w:id="14" w:name="_Toc227516722"/>
+      <w:bookmarkStart w:id="14" w:name="_Toc227590407"/>
       <w:proofErr w:type="spellStart"/>
       <w:r>
         <w:t>Alfa</w:t>
@@ -4401,11 +5611,11 @@
       <w:r>
         <w:t>-Beta</w:t>
       </w:r>
+      <w:bookmarkEnd w:id="14"/>
       <w:proofErr w:type="spellEnd"/>
       <w:r>
         <w:t xml:space="preserve"> </w:t>
       </w:r>
-      <w:bookmarkEnd w:id="14"/>
     </w:p>
     <w:p>
       <w:r>
@@ -4608,7 +5818,7 @@
       <w:pPr>
         <w:pStyle w:val="Ttulo3"/>
       </w:pPr>
-      <w:bookmarkStart w:id="15" w:name="_Toc227516723"/>
+      <w:bookmarkStart w:id="15" w:name="_Toc227590408"/>
       <w:r>
         <w:t>Função de Avaliação Estática</w:t>
       </w:r>
@@ -4719,7 +5929,7 @@
       <w:pPr>
         <w:pStyle w:val="Ttulo2"/>
       </w:pPr>
-      <w:bookmarkStart w:id="16" w:name="_Toc227516724"/>
+      <w:bookmarkStart w:id="16" w:name="_Toc227590409"/>
       <w:r>
         <w:t xml:space="preserve">Comparação </w:t>
       </w:r>
@@ -5061,7 +6271,7 @@
       <w:pPr>
         <w:pStyle w:val="Ttulo1"/>
       </w:pPr>
-      <w:bookmarkStart w:id="17" w:name="_Toc227516725"/>
+      <w:bookmarkStart w:id="17" w:name="_Toc227590410"/>
       <w:r>
         <w:lastRenderedPageBreak/>
         <w:t>Avaliação Experimental</w:t>
@@ -5072,7 +6282,7 @@
       <w:pPr>
         <w:pStyle w:val="Ttulo2"/>
       </w:pPr>
-      <w:bookmarkStart w:id="18" w:name="_Toc227516726"/>
+      <w:bookmarkStart w:id="18" w:name="_Toc227590411"/>
       <w:r>
         <w:t xml:space="preserve">Tabuleiro 3x3 — </w:t>
       </w:r>
@@ -5165,7 +6375,7 @@
       <w:pPr>
         <w:pStyle w:val="Ttulo2"/>
       </w:pPr>
-      <w:bookmarkStart w:id="19" w:name="_Toc227516727"/>
+      <w:bookmarkStart w:id="19" w:name="_Toc227590412"/>
       <w:r>
         <w:t xml:space="preserve">Tabuleiro 6x6 — </w:t>
       </w:r>
@@ -5269,7 +6479,7 @@
       <w:pPr>
         <w:pStyle w:val="Ttulo2"/>
       </w:pPr>
-      <w:bookmarkStart w:id="20" w:name="_Toc227516728"/>
+      <w:bookmarkStart w:id="20" w:name="_Toc227590413"/>
       <w:r>
         <w:t xml:space="preserve">Impacto da Profundidade no </w:t>
       </w:r>
@@ -5355,13 +6565,29 @@
       </w:r>
     </w:p>
     <w:p>
+      <w:pPr>
+        <w:pStyle w:val="Ttulo2"/>
+      </w:pPr>
+      <w:bookmarkStart w:id="21" w:name="_Toc227590414"/>
+      <w:r>
+        <w:lastRenderedPageBreak/>
+        <w:t>Testes</w:t>
+      </w:r>
+      <w:bookmarkEnd w:id="21"/>
+      <w:r>
+        <w:t xml:space="preserve"> </w:t>
+      </w:r>
+    </w:p>
+    <w:p>
+      <w:pPr>
+        <w:keepNext/>
+      </w:pPr>
       <w:r>
         <w:rPr>
           <w:rFonts w:eastAsia="Times New Roman" w:cs="Times New Roman"/>
           <w:noProof/>
           <w:lang w:eastAsia="pt-PT"/>
         </w:rPr>
-        <w:lastRenderedPageBreak/>
         <w:drawing>
           <wp:inline distT="0" distB="0" distL="0" distR="0" wp14:anchorId="2A11427E" wp14:editId="7330A101">
             <wp:extent cx="5245370" cy="4235668"/>
@@ -5398,7 +6624,39 @@
           </wp:inline>
         </w:drawing>
       </w:r>
-      <w:r>
+    </w:p>
+    <w:p>
+      <w:pPr>
+        <w:pStyle w:val="Legenda"/>
+      </w:pPr>
+      <w:bookmarkStart w:id="22" w:name="_Toc227590422"/>
+      <w:r>
+        <w:t xml:space="preserve">Figura </w:t>
+      </w:r>
+      <w:fldSimple w:instr=" SEQ Figura \* ARABIC ">
+        <w:r>
+          <w:rPr>
+            <w:noProof/>
+          </w:rPr>
+          <w:t>1</w:t>
+        </w:r>
+      </w:fldSimple>
+      <w:r>
+        <w:t xml:space="preserve"> Vitória do </w:t>
+      </w:r>
+      <w:proofErr w:type="spellStart"/>
+      <w:r>
+        <w:t>minimax</w:t>
+      </w:r>
+      <w:bookmarkEnd w:id="22"/>
+      <w:proofErr w:type="spellEnd"/>
+    </w:p>
+    <w:p>
+      <w:pPr>
+        <w:keepNext/>
+      </w:pPr>
+      <w:r>
+        <w:lastRenderedPageBreak/>
         <w:br/>
       </w:r>
       <w:r>
@@ -5407,7 +6665,6 @@
           <w:noProof/>
           <w:lang w:eastAsia="pt-PT"/>
         </w:rPr>
-        <w:lastRenderedPageBreak/>
         <w:drawing>
           <wp:inline distT="0" distB="0" distL="0" distR="0" wp14:anchorId="02BCE56E" wp14:editId="23BA51E7">
             <wp:extent cx="5962956" cy="4781796"/>
@@ -5447,220 +6704,733 @@
     </w:p>
     <w:p>
       <w:pPr>
-        <w:pStyle w:val="Ttulo1"/>
-      </w:pPr>
-      <w:bookmarkStart w:id="21" w:name="_Toc227516729"/>
-      <w:r>
-        <w:t>Decisões de Design e Justificações</w:t>
-      </w:r>
-      <w:bookmarkEnd w:id="21"/>
-    </w:p>
-    <w:p>
-      <w:pPr>
-        <w:pStyle w:val="Ttulo2"/>
-      </w:pPr>
-      <w:r>
-        <w:t>Separação modular do código</w:t>
-      </w:r>
-    </w:p>
-    <w:p>
-      <w:r>
-        <w:t>A</w:t>
-      </w:r>
-      <w:r>
-        <w:t xml:space="preserve"> organização em ficheiros distintos (main.pl, alpha_beta.pl, utils.pl, replace.pl, print.pl) segue o princípio da separação de responsabilidades, facilitando a manutenção, os testes isolados por módulo e a substituição de componentes</w:t>
-      </w:r>
-      <w:r>
-        <w:t xml:space="preserve">, </w:t>
-      </w:r>
-      <w:r>
-        <w:t xml:space="preserve">nomeadamente a comutação entre o algoritmo </w:t>
+        <w:pStyle w:val="Legenda"/>
+      </w:pPr>
+      <w:bookmarkStart w:id="23" w:name="_Toc227590423"/>
+      <w:r>
+        <w:t xml:space="preserve">Figura </w:t>
+      </w:r>
+      <w:fldSimple w:instr=" SEQ Figura \* ARABIC ">
+        <w:r>
+          <w:rPr>
+            <w:noProof/>
+          </w:rPr>
+          <w:t>2</w:t>
+        </w:r>
+      </w:fldSimple>
+      <w:r>
+        <w:t xml:space="preserve"> vitória do </w:t>
       </w:r>
       <w:proofErr w:type="spellStart"/>
-      <w:r>
-        <w:t>Minimax</w:t>
-      </w:r>
+      <w:proofErr w:type="gramStart"/>
+      <w:r>
+        <w:t>alfa-beta</w:t>
+      </w:r>
+      <w:bookmarkEnd w:id="23"/>
       <w:proofErr w:type="spellEnd"/>
-      <w:r>
-        <w:t xml:space="preserve"> e o </w:t>
-      </w:r>
-      <w:proofErr w:type="spellStart"/>
-      <w:r>
-        <w:t>Alpha-Beta</w:t>
-      </w:r>
-      <w:proofErr w:type="spellEnd"/>
-      <w:r>
-        <w:t xml:space="preserve">, realizada através da simples alteração da diretiva </w:t>
-      </w:r>
-      <w:proofErr w:type="spellStart"/>
-      <w:r>
-        <w:t>consult</w:t>
-      </w:r>
-      <w:proofErr w:type="spellEnd"/>
-      <w:r>
-        <w:t>/1 no ficheiro principal.</w:t>
-      </w:r>
-    </w:p>
-    <w:p>
-      <w:pPr>
-        <w:pStyle w:val="Ttulo2"/>
-      </w:pPr>
-      <w:r>
-        <w:t>Mobilidade como heurística de avaliação</w:t>
-      </w:r>
-    </w:p>
-    <w:p>
-      <w:r>
-        <w:t>A</w:t>
-      </w:r>
-      <w:r>
-        <w:t xml:space="preserve"> função de avaliação baseada na diferença de mobilidade entre jogadores é estritamente mais informativa do que uma avaliação binária (vitória/derrota), por permitir comparar estados não terminais. Esta propriedade é essencial para o funcionamento do </w:t>
-      </w:r>
-      <w:proofErr w:type="spellStart"/>
-      <w:r>
-        <w:t>Alpha-Beta</w:t>
-      </w:r>
-      <w:proofErr w:type="spellEnd"/>
-      <w:r>
-        <w:t xml:space="preserve"> com profundidade limitada, uma vez que a maioria dos estados avaliados não correspondem a posições terminais. A heurística orienta consistentemente o computador para estados em que preserva opções próprias e simultaneamente restringe as do adversário.</w:t>
-      </w:r>
-    </w:p>
-    <w:p>
-      <w:pPr>
-        <w:ind w:left="360"/>
-      </w:pPr>
-    </w:p>
-    <w:p>
-      <w:pPr>
-        <w:pStyle w:val="Ttulo2"/>
-      </w:pPr>
-      <w:r>
-        <w:lastRenderedPageBreak/>
-        <w:t>Profundidade de pesquisa a 3</w:t>
-      </w:r>
-    </w:p>
-    <w:p>
-      <w:r>
-        <w:t>O</w:t>
-      </w:r>
-      <w:r>
-        <w:t xml:space="preserve"> valor foi selecionado empiricamente como ponto de equilíbrio entre tempo de resposta e qualidade das jogadas num tabuleiro 6×6. Dado o elevado fator de ramificação do </w:t>
-      </w:r>
-      <w:proofErr w:type="gramStart"/>
-      <w:r>
-        <w:t>ISOLA  resultado</w:t>
-      </w:r>
       <w:proofErr w:type="gramEnd"/>
-      <w:r>
-        <w:t xml:space="preserve"> da combinação entre movimento do peão (até 8 direções) e remoção de uma casa, profundidades superiores tornam o tempo de decisão impraticável sem representações de estado mais eficientes. Em tabuleiros de menor dimensão, o parâmetro pode ser aumentado sem impacto significativo no desempenho.</w:t>
-      </w:r>
-    </w:p>
-    <w:p>
-      <w:pPr>
-        <w:pStyle w:val="Ttulo2"/>
-      </w:pPr>
-      <w:r>
-        <w:t>Validação tolerante das jogadas do utilizador</w:t>
-      </w:r>
-    </w:p>
-    <w:p>
-      <w:r>
-        <w:t>A</w:t>
-      </w:r>
-      <w:r>
-        <w:t xml:space="preserve"> introdução de uma jogada inválida não penaliza o jogador com a perda do turno. O predicado play/2 recorre recursivamente a si próprio com o mesmo estado, solicitando nova entrada até que seja válida. Esta abordagem melhora substancialmente a experiência de utilização e é também aplicada à colocação de obstáculos através do predicado </w:t>
-      </w:r>
-      <w:proofErr w:type="spellStart"/>
-      <w:r>
-        <w:t>setupSharp</w:t>
-      </w:r>
-      <w:proofErr w:type="spellEnd"/>
-      <w:r>
-        <w:t>/2.</w:t>
-      </w:r>
-    </w:p>
-    <w:p>
-      <w:pPr>
-        <w:pStyle w:val="Ttulo2"/>
-      </w:pPr>
-      <w:r>
-        <w:t xml:space="preserve">Utilização de </w:t>
-      </w:r>
-      <w:proofErr w:type="spellStart"/>
-      <w:r>
-        <w:t>findall</w:t>
-      </w:r>
-      <w:proofErr w:type="spellEnd"/>
-      <w:r>
-        <w:t>/3 para geração de sucessores</w:t>
-      </w:r>
-    </w:p>
-    <w:p>
-      <w:r>
-        <w:t xml:space="preserve">A </w:t>
-      </w:r>
-      <w:r>
-        <w:t xml:space="preserve">construção da lista completa de sucessores é delegada ao </w:t>
-      </w:r>
-      <w:proofErr w:type="spellStart"/>
-      <w:r>
-        <w:t>findall</w:t>
-      </w:r>
-      <w:proofErr w:type="spellEnd"/>
-      <w:r>
-        <w:t xml:space="preserve">/3, tirando partido do modelo de execução por </w:t>
-      </w:r>
-      <w:proofErr w:type="spellStart"/>
-      <w:r>
-        <w:t>backtracking</w:t>
-      </w:r>
-      <w:proofErr w:type="spellEnd"/>
-      <w:r>
-        <w:t xml:space="preserve"> do </w:t>
-      </w:r>
-      <w:proofErr w:type="spellStart"/>
-      <w:r>
-        <w:t>Prolog</w:t>
-      </w:r>
-      <w:proofErr w:type="spellEnd"/>
-      <w:r>
-        <w:t xml:space="preserve"> de forma puramente declarativa — o predicado </w:t>
-      </w:r>
-      <w:proofErr w:type="spellStart"/>
-      <w:r>
-        <w:t>auxMoves</w:t>
-      </w:r>
-      <w:proofErr w:type="spellEnd"/>
-      <w:r>
-        <w:t xml:space="preserve">/2 descreve o que é um movimento válido, e o </w:t>
-      </w:r>
-      <w:proofErr w:type="spellStart"/>
-      <w:r>
-        <w:t>findall</w:t>
-      </w:r>
-      <w:proofErr w:type="spellEnd"/>
-      <w:r>
-        <w:t xml:space="preserve">/3 materializa o conjunto. Esta separação entre especificação e enumeração é idiomática em </w:t>
-      </w:r>
-      <w:proofErr w:type="spellStart"/>
-      <w:r>
-        <w:t>Prolog</w:t>
-      </w:r>
-      <w:proofErr w:type="spellEnd"/>
-      <w:r>
-        <w:t xml:space="preserve"> e torna o código mais conciso e verificável do que uma implementação iterativa equivalente noutras linguagens.</w:t>
-      </w:r>
-    </w:p>
-    <w:p>
-      <w:pPr>
+    </w:p>
+    <w:p>
+      <w:pPr>
+        <w:keepNext/>
+      </w:pPr>
+      <w:r>
+        <w:drawing>
+          <wp:inline distT="0" distB="0" distL="0" distR="0" wp14:anchorId="39AF8587" wp14:editId="1DA26F7A">
+            <wp:extent cx="3930852" cy="2711589"/>
+            <wp:effectExtent l="0" t="0" r="0" b="0"/>
+            <wp:docPr id="1289306980" name="Imagem 1"/>
+            <wp:cNvGraphicFramePr>
+              <a:graphicFrameLocks xmlns:a="http://schemas.openxmlformats.org/drawingml/2006/main" noChangeAspect="1"/>
+            </wp:cNvGraphicFramePr>
+            <a:graphic xmlns:a="http://schemas.openxmlformats.org/drawingml/2006/main">
+              <a:graphicData uri="http://schemas.openxmlformats.org/drawingml/2006/picture">
+                <pic:pic xmlns:pic="http://schemas.openxmlformats.org/drawingml/2006/picture">
+                  <pic:nvPicPr>
+                    <pic:cNvPr id="1289306980" name=""/>
+                    <pic:cNvPicPr/>
+                  </pic:nvPicPr>
+                  <pic:blipFill>
+                    <a:blip r:embed="rId15"/>
+                    <a:stretch>
+                      <a:fillRect/>
+                    </a:stretch>
+                  </pic:blipFill>
+                  <pic:spPr>
+                    <a:xfrm>
+                      <a:off x="0" y="0"/>
+                      <a:ext cx="3930852" cy="2711589"/>
+                    </a:xfrm>
+                    <a:prstGeom prst="rect">
+                      <a:avLst/>
+                    </a:prstGeom>
+                  </pic:spPr>
+                </pic:pic>
+              </a:graphicData>
+            </a:graphic>
+          </wp:inline>
+        </w:drawing>
+      </w:r>
+    </w:p>
+    <w:p>
+      <w:pPr>
+        <w:pStyle w:val="Legenda"/>
+      </w:pPr>
+      <w:bookmarkStart w:id="24" w:name="_Toc227590424"/>
+      <w:r>
+        <w:t xml:space="preserve">Figura </w:t>
+      </w:r>
+      <w:fldSimple w:instr=" SEQ Figura \* ARABIC ">
+        <w:r>
+          <w:rPr>
+            <w:noProof/>
+          </w:rPr>
+          <w:t>3</w:t>
+        </w:r>
+      </w:fldSimple>
+      <w:r>
+        <w:t xml:space="preserve"> Jogada </w:t>
+      </w:r>
+      <w:r>
+        <w:rPr>
+          <w:noProof/>
+        </w:rPr>
+        <w:t>invalida do humano</w:t>
+      </w:r>
+      <w:bookmarkEnd w:id="24"/>
+    </w:p>
+    <w:p>
+      <w:pPr>
+        <w:keepNext/>
         <w:spacing w:after="160" w:line="278" w:lineRule="auto"/>
         <w:jc w:val="left"/>
+      </w:pPr>
+      <w:r>
         <w:rPr>
           <w:rFonts w:asciiTheme="majorHAnsi" w:eastAsiaTheme="majorEastAsia" w:hAnsiTheme="majorHAnsi" w:cstheme="majorBidi"/>
           <w:color w:val="0F4761" w:themeColor="accent1" w:themeShade="BF"/>
           <w:sz w:val="40"/>
           <w:szCs w:val="40"/>
         </w:rPr>
+        <w:lastRenderedPageBreak/>
+        <w:drawing>
+          <wp:inline distT="0" distB="0" distL="0" distR="0" wp14:anchorId="18A91716" wp14:editId="43DD2168">
+            <wp:extent cx="6120130" cy="6008370"/>
+            <wp:effectExtent l="0" t="0" r="0" b="0"/>
+            <wp:docPr id="193652469" name="Imagem 1"/>
+            <wp:cNvGraphicFramePr>
+              <a:graphicFrameLocks xmlns:a="http://schemas.openxmlformats.org/drawingml/2006/main" noChangeAspect="1"/>
+            </wp:cNvGraphicFramePr>
+            <a:graphic xmlns:a="http://schemas.openxmlformats.org/drawingml/2006/main">
+              <a:graphicData uri="http://schemas.openxmlformats.org/drawingml/2006/picture">
+                <pic:pic xmlns:pic="http://schemas.openxmlformats.org/drawingml/2006/picture">
+                  <pic:nvPicPr>
+                    <pic:cNvPr id="193652469" name=""/>
+                    <pic:cNvPicPr/>
+                  </pic:nvPicPr>
+                  <pic:blipFill>
+                    <a:blip r:embed="rId16"/>
+                    <a:stretch>
+                      <a:fillRect/>
+                    </a:stretch>
+                  </pic:blipFill>
+                  <pic:spPr>
+                    <a:xfrm>
+                      <a:off x="0" y="0"/>
+                      <a:ext cx="6120130" cy="6008370"/>
+                    </a:xfrm>
+                    <a:prstGeom prst="rect">
+                      <a:avLst/>
+                    </a:prstGeom>
+                  </pic:spPr>
+                </pic:pic>
+              </a:graphicData>
+            </a:graphic>
+          </wp:inline>
+        </w:drawing>
+      </w:r>
+    </w:p>
+    <w:p>
+      <w:pPr>
+        <w:pStyle w:val="Legenda"/>
+        <w:jc w:val="left"/>
+      </w:pPr>
+      <w:bookmarkStart w:id="25" w:name="_Toc227590425"/>
+      <w:r>
+        <w:t xml:space="preserve">Figura </w:t>
+      </w:r>
+      <w:fldSimple w:instr=" SEQ Figura \* ARABIC ">
+        <w:r>
+          <w:rPr>
+            <w:noProof/>
+          </w:rPr>
+          <w:t>4</w:t>
+        </w:r>
+      </w:fldSimple>
+      <w:r>
+        <w:t xml:space="preserve"> Jogo perfeito por parte da AI parte 1</w:t>
+      </w:r>
+      <w:bookmarkEnd w:id="25"/>
+    </w:p>
+    <w:p>
+      <w:pPr>
+        <w:keepNext/>
+      </w:pPr>
+      <w:r>
+        <w:lastRenderedPageBreak/>
+        <w:drawing>
+          <wp:inline distT="0" distB="0" distL="0" distR="0" wp14:anchorId="66678BCF" wp14:editId="2D6B799D">
+            <wp:extent cx="4578585" cy="3225966"/>
+            <wp:effectExtent l="0" t="0" r="0" b="0"/>
+            <wp:docPr id="263818" name="Imagem 1"/>
+            <wp:cNvGraphicFramePr>
+              <a:graphicFrameLocks xmlns:a="http://schemas.openxmlformats.org/drawingml/2006/main" noChangeAspect="1"/>
+            </wp:cNvGraphicFramePr>
+            <a:graphic xmlns:a="http://schemas.openxmlformats.org/drawingml/2006/main">
+              <a:graphicData uri="http://schemas.openxmlformats.org/drawingml/2006/picture">
+                <pic:pic xmlns:pic="http://schemas.openxmlformats.org/drawingml/2006/picture">
+                  <pic:nvPicPr>
+                    <pic:cNvPr id="263818" name=""/>
+                    <pic:cNvPicPr/>
+                  </pic:nvPicPr>
+                  <pic:blipFill>
+                    <a:blip r:embed="rId17"/>
+                    <a:stretch>
+                      <a:fillRect/>
+                    </a:stretch>
+                  </pic:blipFill>
+                  <pic:spPr>
+                    <a:xfrm>
+                      <a:off x="0" y="0"/>
+                      <a:ext cx="4578585" cy="3225966"/>
+                    </a:xfrm>
+                    <a:prstGeom prst="rect">
+                      <a:avLst/>
+                    </a:prstGeom>
+                  </pic:spPr>
+                </pic:pic>
+              </a:graphicData>
+            </a:graphic>
+          </wp:inline>
+        </w:drawing>
+      </w:r>
+    </w:p>
+    <w:p>
+      <w:pPr>
+        <w:pStyle w:val="Legenda"/>
+      </w:pPr>
+      <w:bookmarkStart w:id="26" w:name="_Toc227590426"/>
+      <w:r>
+        <w:t xml:space="preserve">Figura </w:t>
+      </w:r>
+      <w:fldSimple w:instr=" SEQ Figura \* ARABIC ">
+        <w:r>
+          <w:rPr>
+            <w:noProof/>
+          </w:rPr>
+          <w:t>5</w:t>
+        </w:r>
+      </w:fldSimple>
+      <w:r>
+        <w:t xml:space="preserve"> </w:t>
+      </w:r>
+      <w:r>
+        <w:t xml:space="preserve">Jogo perfeito por parte da AI </w:t>
+      </w:r>
+      <w:proofErr w:type="spellStart"/>
+      <w:r>
+        <w:t>part</w:t>
+      </w:r>
+      <w:proofErr w:type="spellEnd"/>
+      <w:r>
+        <w:t xml:space="preserve"> </w:t>
+      </w:r>
+      <w:r>
+        <w:t>2</w:t>
+      </w:r>
+      <w:bookmarkEnd w:id="26"/>
+    </w:p>
+    <w:p>
+      <w:pPr>
+        <w:keepNext/>
+      </w:pPr>
+      <w:r>
+        <w:lastRenderedPageBreak/>
+        <w:drawing>
+          <wp:inline distT="0" distB="0" distL="0" distR="0" wp14:anchorId="21561750" wp14:editId="30B8295F">
+            <wp:extent cx="6120130" cy="7350125"/>
+            <wp:effectExtent l="0" t="0" r="0" b="3175"/>
+            <wp:docPr id="515732823" name="Imagem 1"/>
+            <wp:cNvGraphicFramePr>
+              <a:graphicFrameLocks xmlns:a="http://schemas.openxmlformats.org/drawingml/2006/main" noChangeAspect="1"/>
+            </wp:cNvGraphicFramePr>
+            <a:graphic xmlns:a="http://schemas.openxmlformats.org/drawingml/2006/main">
+              <a:graphicData uri="http://schemas.openxmlformats.org/drawingml/2006/picture">
+                <pic:pic xmlns:pic="http://schemas.openxmlformats.org/drawingml/2006/picture">
+                  <pic:nvPicPr>
+                    <pic:cNvPr id="515732823" name=""/>
+                    <pic:cNvPicPr/>
+                  </pic:nvPicPr>
+                  <pic:blipFill>
+                    <a:blip r:embed="rId18"/>
+                    <a:stretch>
+                      <a:fillRect/>
+                    </a:stretch>
+                  </pic:blipFill>
+                  <pic:spPr>
+                    <a:xfrm>
+                      <a:off x="0" y="0"/>
+                      <a:ext cx="6120130" cy="7350125"/>
+                    </a:xfrm>
+                    <a:prstGeom prst="rect">
+                      <a:avLst/>
+                    </a:prstGeom>
+                  </pic:spPr>
+                </pic:pic>
+              </a:graphicData>
+            </a:graphic>
+          </wp:inline>
+        </w:drawing>
+      </w:r>
+    </w:p>
+    <w:p>
+      <w:pPr>
+        <w:pStyle w:val="Legenda"/>
+      </w:pPr>
+      <w:bookmarkStart w:id="27" w:name="_Toc227590427"/>
+      <w:r>
+        <w:t xml:space="preserve">Figura </w:t>
+      </w:r>
+      <w:fldSimple w:instr=" SEQ Figura \* ARABIC ">
+        <w:r>
+          <w:rPr>
+            <w:noProof/>
+          </w:rPr>
+          <w:t>6</w:t>
+        </w:r>
+      </w:fldSimple>
+      <w:r>
+        <w:t xml:space="preserve"> </w:t>
+      </w:r>
+      <w:r>
+        <w:t xml:space="preserve">Jogo perfeito por parte da AI </w:t>
+      </w:r>
+      <w:proofErr w:type="spellStart"/>
+      <w:r>
+        <w:t>part</w:t>
+      </w:r>
+      <w:proofErr w:type="spellEnd"/>
+      <w:r>
+        <w:t xml:space="preserve"> </w:t>
+      </w:r>
+      <w:r>
+        <w:t>3</w:t>
+      </w:r>
+      <w:bookmarkEnd w:id="27"/>
+    </w:p>
+    <w:p>
+      <w:pPr>
+        <w:keepNext/>
+      </w:pPr>
+      <w:r>
+        <w:lastRenderedPageBreak/>
+        <w:drawing>
+          <wp:inline distT="0" distB="0" distL="0" distR="0" wp14:anchorId="23282EB5" wp14:editId="5794AC25">
+            <wp:extent cx="5169166" cy="2292468"/>
+            <wp:effectExtent l="0" t="0" r="0" b="0"/>
+            <wp:docPr id="1286631915" name="Imagem 1"/>
+            <wp:cNvGraphicFramePr>
+              <a:graphicFrameLocks xmlns:a="http://schemas.openxmlformats.org/drawingml/2006/main" noChangeAspect="1"/>
+            </wp:cNvGraphicFramePr>
+            <a:graphic xmlns:a="http://schemas.openxmlformats.org/drawingml/2006/main">
+              <a:graphicData uri="http://schemas.openxmlformats.org/drawingml/2006/picture">
+                <pic:pic xmlns:pic="http://schemas.openxmlformats.org/drawingml/2006/picture">
+                  <pic:nvPicPr>
+                    <pic:cNvPr id="1286631915" name=""/>
+                    <pic:cNvPicPr/>
+                  </pic:nvPicPr>
+                  <pic:blipFill>
+                    <a:blip r:embed="rId19"/>
+                    <a:stretch>
+                      <a:fillRect/>
+                    </a:stretch>
+                  </pic:blipFill>
+                  <pic:spPr>
+                    <a:xfrm>
+                      <a:off x="0" y="0"/>
+                      <a:ext cx="5169166" cy="2292468"/>
+                    </a:xfrm>
+                    <a:prstGeom prst="rect">
+                      <a:avLst/>
+                    </a:prstGeom>
+                  </pic:spPr>
+                </pic:pic>
+              </a:graphicData>
+            </a:graphic>
+          </wp:inline>
+        </w:drawing>
+      </w:r>
+    </w:p>
+    <w:p>
+      <w:pPr>
+        <w:pStyle w:val="Legenda"/>
+      </w:pPr>
+      <w:bookmarkStart w:id="28" w:name="_Toc227590428"/>
+      <w:r>
+        <w:t xml:space="preserve">Figura </w:t>
+      </w:r>
+      <w:fldSimple w:instr=" SEQ Figura \* ARABIC ">
+        <w:r>
+          <w:rPr>
+            <w:noProof/>
+          </w:rPr>
+          <w:t>7</w:t>
+        </w:r>
+      </w:fldSimple>
+      <w:r>
+        <w:t xml:space="preserve"> </w:t>
+      </w:r>
+      <w:r>
+        <w:t xml:space="preserve">Jogo perfeito por parte da AI </w:t>
+      </w:r>
+      <w:proofErr w:type="spellStart"/>
+      <w:r>
+        <w:t>part</w:t>
+      </w:r>
+      <w:proofErr w:type="spellEnd"/>
+      <w:r>
+        <w:t xml:space="preserve"> </w:t>
+      </w:r>
+      <w:r>
+        <w:t>4</w:t>
+      </w:r>
+      <w:bookmarkEnd w:id="28"/>
+    </w:p>
+    <w:p>
+      <w:pPr>
+        <w:keepNext/>
+      </w:pPr>
+      <w:r>
+        <w:drawing>
+          <wp:inline distT="0" distB="0" distL="0" distR="0" wp14:anchorId="6859F0C8" wp14:editId="5D770EEF">
+            <wp:extent cx="5035809" cy="4877051"/>
+            <wp:effectExtent l="0" t="0" r="0" b="0"/>
+            <wp:docPr id="2044289584" name="Imagem 1"/>
+            <wp:cNvGraphicFramePr>
+              <a:graphicFrameLocks xmlns:a="http://schemas.openxmlformats.org/drawingml/2006/main" noChangeAspect="1"/>
+            </wp:cNvGraphicFramePr>
+            <a:graphic xmlns:a="http://schemas.openxmlformats.org/drawingml/2006/main">
+              <a:graphicData uri="http://schemas.openxmlformats.org/drawingml/2006/picture">
+                <pic:pic xmlns:pic="http://schemas.openxmlformats.org/drawingml/2006/picture">
+                  <pic:nvPicPr>
+                    <pic:cNvPr id="2044289584" name=""/>
+                    <pic:cNvPicPr/>
+                  </pic:nvPicPr>
+                  <pic:blipFill>
+                    <a:blip r:embed="rId20"/>
+                    <a:stretch>
+                      <a:fillRect/>
+                    </a:stretch>
+                  </pic:blipFill>
+                  <pic:spPr>
+                    <a:xfrm>
+                      <a:off x="0" y="0"/>
+                      <a:ext cx="5035809" cy="4877051"/>
+                    </a:xfrm>
+                    <a:prstGeom prst="rect">
+                      <a:avLst/>
+                    </a:prstGeom>
+                  </pic:spPr>
+                </pic:pic>
+              </a:graphicData>
+            </a:graphic>
+          </wp:inline>
+        </w:drawing>
+      </w:r>
+    </w:p>
+    <w:p>
+      <w:pPr>
+        <w:pStyle w:val="Legenda"/>
+      </w:pPr>
+      <w:bookmarkStart w:id="29" w:name="_Toc227590429"/>
+      <w:r>
+        <w:t xml:space="preserve">Figura </w:t>
+      </w:r>
+      <w:fldSimple w:instr=" SEQ Figura \* ARABIC ">
+        <w:r>
+          <w:rPr>
+            <w:noProof/>
+          </w:rPr>
+          <w:t>8</w:t>
+        </w:r>
+      </w:fldSimple>
+      <w:r>
+        <w:t xml:space="preserve"> </w:t>
+      </w:r>
+      <w:proofErr w:type="spellStart"/>
+      <w:proofErr w:type="gramStart"/>
+      <w:r>
+        <w:t>alfa-beta</w:t>
+      </w:r>
+      <w:proofErr w:type="spellEnd"/>
+      <w:proofErr w:type="gramEnd"/>
+      <w:r>
+        <w:t xml:space="preserve"> com </w:t>
+      </w:r>
+      <w:r>
+        <w:t>6</w:t>
+      </w:r>
+      <w:r>
+        <w:t xml:space="preserve"> de profundidade</w:t>
+      </w:r>
+      <w:bookmarkEnd w:id="29"/>
+    </w:p>
+    <w:p>
+      <w:pPr>
+        <w:keepNext/>
+      </w:pPr>
+      <w:r>
+        <w:lastRenderedPageBreak/>
+        <w:drawing>
+          <wp:inline distT="0" distB="0" distL="0" distR="0" wp14:anchorId="39F2F503" wp14:editId="38AE4457">
+            <wp:extent cx="4838949" cy="4921503"/>
+            <wp:effectExtent l="0" t="0" r="0" b="0"/>
+            <wp:docPr id="35642161" name="Imagem 1"/>
+            <wp:cNvGraphicFramePr>
+              <a:graphicFrameLocks xmlns:a="http://schemas.openxmlformats.org/drawingml/2006/main" noChangeAspect="1"/>
+            </wp:cNvGraphicFramePr>
+            <a:graphic xmlns:a="http://schemas.openxmlformats.org/drawingml/2006/main">
+              <a:graphicData uri="http://schemas.openxmlformats.org/drawingml/2006/picture">
+                <pic:pic xmlns:pic="http://schemas.openxmlformats.org/drawingml/2006/picture">
+                  <pic:nvPicPr>
+                    <pic:cNvPr id="35642161" name=""/>
+                    <pic:cNvPicPr/>
+                  </pic:nvPicPr>
+                  <pic:blipFill>
+                    <a:blip r:embed="rId21"/>
+                    <a:stretch>
+                      <a:fillRect/>
+                    </a:stretch>
+                  </pic:blipFill>
+                  <pic:spPr>
+                    <a:xfrm>
+                      <a:off x="0" y="0"/>
+                      <a:ext cx="4838949" cy="4921503"/>
+                    </a:xfrm>
+                    <a:prstGeom prst="rect">
+                      <a:avLst/>
+                    </a:prstGeom>
+                  </pic:spPr>
+                </pic:pic>
+              </a:graphicData>
+            </a:graphic>
+          </wp:inline>
+        </w:drawing>
+      </w:r>
+    </w:p>
+    <w:p>
+      <w:pPr>
+        <w:pStyle w:val="Legenda"/>
+      </w:pPr>
+      <w:bookmarkStart w:id="30" w:name="_Toc227590430"/>
+      <w:r>
+        <w:t xml:space="preserve">Figura </w:t>
+      </w:r>
+      <w:fldSimple w:instr=" SEQ Figura \* ARABIC ">
+        <w:r>
+          <w:rPr>
+            <w:noProof/>
+          </w:rPr>
+          <w:t>9</w:t>
+        </w:r>
+      </w:fldSimple>
+      <w:r>
+        <w:t xml:space="preserve"> </w:t>
+      </w:r>
+      <w:proofErr w:type="spellStart"/>
+      <w:proofErr w:type="gramStart"/>
+      <w:r>
+        <w:t>alfa-beta</w:t>
+      </w:r>
+      <w:proofErr w:type="spellEnd"/>
+      <w:proofErr w:type="gramEnd"/>
+      <w:r>
+        <w:t xml:space="preserve"> com 5 de profundidade</w:t>
+      </w:r>
+      <w:bookmarkEnd w:id="30"/>
+    </w:p>
+    <w:p>
+      <w:pPr>
+        <w:keepNext/>
+      </w:pPr>
+      <w:r>
+        <w:lastRenderedPageBreak/>
+        <w:drawing>
+          <wp:inline distT="0" distB="0" distL="0" distR="0" wp14:anchorId="416B193D" wp14:editId="44B41672">
+            <wp:extent cx="4610337" cy="4940554"/>
+            <wp:effectExtent l="0" t="0" r="0" b="0"/>
+            <wp:docPr id="1965503940" name="Imagem 1"/>
+            <wp:cNvGraphicFramePr>
+              <a:graphicFrameLocks xmlns:a="http://schemas.openxmlformats.org/drawingml/2006/main" noChangeAspect="1"/>
+            </wp:cNvGraphicFramePr>
+            <a:graphic xmlns:a="http://schemas.openxmlformats.org/drawingml/2006/main">
+              <a:graphicData uri="http://schemas.openxmlformats.org/drawingml/2006/picture">
+                <pic:pic xmlns:pic="http://schemas.openxmlformats.org/drawingml/2006/picture">
+                  <pic:nvPicPr>
+                    <pic:cNvPr id="1965503940" name=""/>
+                    <pic:cNvPicPr/>
+                  </pic:nvPicPr>
+                  <pic:blipFill>
+                    <a:blip r:embed="rId22"/>
+                    <a:stretch>
+                      <a:fillRect/>
+                    </a:stretch>
+                  </pic:blipFill>
+                  <pic:spPr>
+                    <a:xfrm>
+                      <a:off x="0" y="0"/>
+                      <a:ext cx="4610337" cy="4940554"/>
+                    </a:xfrm>
+                    <a:prstGeom prst="rect">
+                      <a:avLst/>
+                    </a:prstGeom>
+                  </pic:spPr>
+                </pic:pic>
+              </a:graphicData>
+            </a:graphic>
+          </wp:inline>
+        </w:drawing>
+      </w:r>
+    </w:p>
+    <w:p>
+      <w:pPr>
+        <w:pStyle w:val="Legenda"/>
+      </w:pPr>
+      <w:bookmarkStart w:id="31" w:name="_Toc227590431"/>
+      <w:r>
+        <w:t xml:space="preserve">Figura </w:t>
+      </w:r>
+      <w:fldSimple w:instr=" SEQ Figura \* ARABIC ">
+        <w:r>
+          <w:rPr>
+            <w:noProof/>
+          </w:rPr>
+          <w:t>10</w:t>
+        </w:r>
+      </w:fldSimple>
+      <w:r>
+        <w:t xml:space="preserve"> </w:t>
+      </w:r>
+      <w:proofErr w:type="spellStart"/>
+      <w:proofErr w:type="gramStart"/>
+      <w:r>
+        <w:t>alfa-beta</w:t>
+      </w:r>
+      <w:proofErr w:type="spellEnd"/>
+      <w:proofErr w:type="gramEnd"/>
+      <w:r>
+        <w:t xml:space="preserve"> com </w:t>
+      </w:r>
+      <w:r>
+        <w:t>4</w:t>
+      </w:r>
+      <w:r>
+        <w:t xml:space="preserve"> de profundidade</w:t>
+      </w:r>
+      <w:bookmarkEnd w:id="31"/>
+    </w:p>
+    <w:p>
+      <w:pPr>
+        <w:keepNext/>
+      </w:pPr>
+      <w:r>
+        <w:lastRenderedPageBreak/>
+        <w:drawing>
+          <wp:inline distT="0" distB="0" distL="0" distR="0" wp14:anchorId="0DD53726" wp14:editId="47B16C92">
+            <wp:extent cx="5372376" cy="4864350"/>
+            <wp:effectExtent l="0" t="0" r="0" b="0"/>
+            <wp:docPr id="1988815577" name="Imagem 1"/>
+            <wp:cNvGraphicFramePr>
+              <a:graphicFrameLocks xmlns:a="http://schemas.openxmlformats.org/drawingml/2006/main" noChangeAspect="1"/>
+            </wp:cNvGraphicFramePr>
+            <a:graphic xmlns:a="http://schemas.openxmlformats.org/drawingml/2006/main">
+              <a:graphicData uri="http://schemas.openxmlformats.org/drawingml/2006/picture">
+                <pic:pic xmlns:pic="http://schemas.openxmlformats.org/drawingml/2006/picture">
+                  <pic:nvPicPr>
+                    <pic:cNvPr id="1988815577" name=""/>
+                    <pic:cNvPicPr/>
+                  </pic:nvPicPr>
+                  <pic:blipFill>
+                    <a:blip r:embed="rId23"/>
+                    <a:stretch>
+                      <a:fillRect/>
+                    </a:stretch>
+                  </pic:blipFill>
+                  <pic:spPr>
+                    <a:xfrm>
+                      <a:off x="0" y="0"/>
+                      <a:ext cx="5372376" cy="4864350"/>
+                    </a:xfrm>
+                    <a:prstGeom prst="rect">
+                      <a:avLst/>
+                    </a:prstGeom>
+                  </pic:spPr>
+                </pic:pic>
+              </a:graphicData>
+            </a:graphic>
+          </wp:inline>
+        </w:drawing>
+      </w:r>
+    </w:p>
+    <w:p>
+      <w:pPr>
+        <w:pStyle w:val="Legenda"/>
+      </w:pPr>
+      <w:bookmarkStart w:id="32" w:name="_Toc227590432"/>
+      <w:r>
+        <w:t xml:space="preserve">Figura </w:t>
+      </w:r>
+      <w:fldSimple w:instr=" SEQ Figura \* ARABIC ">
+        <w:r>
+          <w:rPr>
+            <w:noProof/>
+          </w:rPr>
+          <w:t>11</w:t>
+        </w:r>
+      </w:fldSimple>
+      <w:r>
+        <w:t xml:space="preserve"> </w:t>
+      </w:r>
+      <w:r>
+        <w:t xml:space="preserve">10 </w:t>
+      </w:r>
+      <w:proofErr w:type="spellStart"/>
+      <w:proofErr w:type="gramStart"/>
+      <w:r>
+        <w:t>alfa-beta</w:t>
+      </w:r>
+      <w:proofErr w:type="spellEnd"/>
+      <w:proofErr w:type="gramEnd"/>
+      <w:r>
+        <w:t xml:space="preserve"> com 4 de profundidade</w:t>
+      </w:r>
+      <w:bookmarkEnd w:id="32"/>
+    </w:p>
+    <w:p>
+      <w:pPr>
+        <w:keepNext/>
+      </w:pPr>
+    </w:p>
+    <w:p>
+      <w:pPr>
+        <w:spacing w:after="160" w:line="278" w:lineRule="auto"/>
+        <w:jc w:val="left"/>
+        <w:rPr>
+          <w:rFonts w:asciiTheme="majorHAnsi" w:eastAsiaTheme="majorEastAsia" w:hAnsiTheme="majorHAnsi" w:cstheme="majorBidi"/>
+          <w:color w:val="0F4761" w:themeColor="accent1" w:themeShade="BF"/>
+          <w:sz w:val="40"/>
+          <w:szCs w:val="40"/>
+        </w:rPr>
       </w:pPr>
       <w:r>
         <w:br w:type="page"/>
@@ -5670,9 +7440,244 @@
       <w:pPr>
         <w:pStyle w:val="Ttulo1"/>
       </w:pPr>
+      <w:bookmarkStart w:id="33" w:name="_Toc227590415"/>
       <w:r>
         <w:lastRenderedPageBreak/>
-        <w:t xml:space="preserve">Conclusão </w:t>
+        <w:t>Decisões de Design e Justificações</w:t>
+      </w:r>
+      <w:bookmarkEnd w:id="33"/>
+    </w:p>
+    <w:p>
+      <w:pPr>
+        <w:pStyle w:val="Ttulo2"/>
+      </w:pPr>
+      <w:bookmarkStart w:id="34" w:name="_Toc227590416"/>
+      <w:r>
+        <w:t>Separação modular do código</w:t>
+      </w:r>
+      <w:bookmarkEnd w:id="34"/>
+    </w:p>
+    <w:p>
+      <w:r>
+        <w:t>A</w:t>
+      </w:r>
+      <w:r>
+        <w:t xml:space="preserve"> organização em ficheiros distintos (main.pl, alpha_beta.pl, utils.pl, replace.pl, print.pl) segue o princípio da separação de responsabilidades, facilitando a manutenção, os testes isolados por módulo e a substituição de componentes</w:t>
+      </w:r>
+      <w:r>
+        <w:t xml:space="preserve">, </w:t>
+      </w:r>
+      <w:r>
+        <w:t xml:space="preserve">nomeadamente a comutação entre o algoritmo </w:t>
+      </w:r>
+      <w:proofErr w:type="spellStart"/>
+      <w:r>
+        <w:t>Minimax</w:t>
+      </w:r>
+      <w:proofErr w:type="spellEnd"/>
+      <w:r>
+        <w:t xml:space="preserve"> e o </w:t>
+      </w:r>
+      <w:proofErr w:type="spellStart"/>
+      <w:r>
+        <w:t>Alpha-Beta</w:t>
+      </w:r>
+      <w:proofErr w:type="spellEnd"/>
+      <w:r>
+        <w:t xml:space="preserve">, realizada através da simples alteração da diretiva </w:t>
+      </w:r>
+      <w:proofErr w:type="spellStart"/>
+      <w:r>
+        <w:t>consult</w:t>
+      </w:r>
+      <w:proofErr w:type="spellEnd"/>
+      <w:r>
+        <w:t>/1 no ficheiro principal.</w:t>
+      </w:r>
+    </w:p>
+    <w:p>
+      <w:pPr>
+        <w:pStyle w:val="Ttulo2"/>
+      </w:pPr>
+      <w:bookmarkStart w:id="35" w:name="_Toc227590417"/>
+      <w:r>
+        <w:t>Mobilidade como heurística de avaliação</w:t>
+      </w:r>
+      <w:bookmarkEnd w:id="35"/>
+    </w:p>
+    <w:p>
+      <w:r>
+        <w:t>A</w:t>
+      </w:r>
+      <w:r>
+        <w:t xml:space="preserve"> função de avaliação baseada na diferença de mobilidade entre jogadores é estritamente mais informativa do que uma avaliação binária (vitória/derrota), por permitir comparar estados não terminais. Esta propriedade é essencial para o funcionamento do </w:t>
+      </w:r>
+      <w:proofErr w:type="spellStart"/>
+      <w:r>
+        <w:t>Alpha-Beta</w:t>
+      </w:r>
+      <w:proofErr w:type="spellEnd"/>
+      <w:r>
+        <w:t xml:space="preserve"> com profundidade limitada, uma vez que a maioria dos estados avaliados não correspondem a posições terminais. A heurística orienta consistentemente o computador para estados em que preserva opções próprias e simultaneamente restringe as do adversário.</w:t>
+      </w:r>
+    </w:p>
+    <w:p>
+      <w:pPr>
+        <w:ind w:left="360"/>
+      </w:pPr>
+    </w:p>
+    <w:p>
+      <w:pPr>
+        <w:pStyle w:val="Ttulo2"/>
+      </w:pPr>
+      <w:bookmarkStart w:id="36" w:name="_Toc227590418"/>
+      <w:r>
+        <w:t>Profundidade de pesquisa a 3</w:t>
+      </w:r>
+      <w:bookmarkEnd w:id="36"/>
+    </w:p>
+    <w:p>
+      <w:r>
+        <w:t>O</w:t>
+      </w:r>
+      <w:r>
+        <w:t xml:space="preserve"> valor foi selecionado empiricamente como ponto de equilíbrio entre tempo de resposta e qualidade das jogadas num tabuleiro 6×6. Dado o elevado fator de ramificação do </w:t>
+      </w:r>
+      <w:r>
+        <w:t>ISOLA resultado</w:t>
+      </w:r>
+      <w:r>
+        <w:t xml:space="preserve"> da combinação entre movimento do peão (até 8 direções) e remoção de uma casa, profundidades superiores tornam o tempo de decisão impraticável sem representações de estado mais eficientes. Em tabuleiros de menor dimensão, o parâmetro pode ser aumentado sem impacto significativo no desempenho.</w:t>
+      </w:r>
+    </w:p>
+    <w:p>
+      <w:pPr>
+        <w:pStyle w:val="Ttulo2"/>
+      </w:pPr>
+      <w:bookmarkStart w:id="37" w:name="_Toc227590419"/>
+      <w:r>
+        <w:t>Validação tolerante das jogadas do utilizador</w:t>
+      </w:r>
+      <w:bookmarkEnd w:id="37"/>
+    </w:p>
+    <w:p>
+      <w:r>
+        <w:t>A</w:t>
+      </w:r>
+      <w:r>
+        <w:t xml:space="preserve"> introdução de uma jogada inválida não penaliza o jogador com a perda do turno. O predicado play/2 recorre recursivamente a si próprio com o mesmo estado, solicitando nova entrada até que seja válida. Esta abordagem melhora substancialmente a experiência de utilização e é também aplicada à colocação de obstáculos através do predicado </w:t>
+      </w:r>
+      <w:proofErr w:type="spellStart"/>
+      <w:r>
+        <w:t>setupSharp</w:t>
+      </w:r>
+      <w:proofErr w:type="spellEnd"/>
+      <w:r>
+        <w:t>/2.</w:t>
+      </w:r>
+    </w:p>
+    <w:p>
+      <w:pPr>
+        <w:pStyle w:val="Ttulo2"/>
+      </w:pPr>
+      <w:bookmarkStart w:id="38" w:name="_Toc227590420"/>
+      <w:r>
+        <w:t xml:space="preserve">Utilização de </w:t>
+      </w:r>
+      <w:proofErr w:type="spellStart"/>
+      <w:r>
+        <w:t>findall</w:t>
+      </w:r>
+      <w:proofErr w:type="spellEnd"/>
+      <w:r>
+        <w:t>/3 para geração de sucessores</w:t>
+      </w:r>
+      <w:bookmarkEnd w:id="38"/>
+    </w:p>
+    <w:p>
+      <w:r>
+        <w:t xml:space="preserve">A </w:t>
+      </w:r>
+      <w:r>
+        <w:t xml:space="preserve">construção da lista completa de sucessores é delegada ao </w:t>
+      </w:r>
+      <w:proofErr w:type="spellStart"/>
+      <w:r>
+        <w:t>findall</w:t>
+      </w:r>
+      <w:proofErr w:type="spellEnd"/>
+      <w:r>
+        <w:t xml:space="preserve">/3, tirando partido do modelo de execução por </w:t>
+      </w:r>
+      <w:proofErr w:type="spellStart"/>
+      <w:r>
+        <w:t>backtracking</w:t>
+      </w:r>
+      <w:proofErr w:type="spellEnd"/>
+      <w:r>
+        <w:t xml:space="preserve"> do </w:t>
+      </w:r>
+      <w:proofErr w:type="spellStart"/>
+      <w:r>
+        <w:t>Prolog</w:t>
+      </w:r>
+      <w:proofErr w:type="spellEnd"/>
+      <w:r>
+        <w:t xml:space="preserve"> de forma puramente declarativa — o predicado </w:t>
+      </w:r>
+      <w:proofErr w:type="spellStart"/>
+      <w:r>
+        <w:t>auxMoves</w:t>
+      </w:r>
+      <w:proofErr w:type="spellEnd"/>
+      <w:r>
+        <w:t xml:space="preserve">/2 descreve o que é um movimento válido, e o </w:t>
+      </w:r>
+      <w:proofErr w:type="spellStart"/>
+      <w:r>
+        <w:t>findall</w:t>
+      </w:r>
+      <w:proofErr w:type="spellEnd"/>
+      <w:r>
+        <w:t xml:space="preserve">/3 materializa o conjunto. Esta separação entre especificação e enumeração é idiomática em </w:t>
+      </w:r>
+      <w:proofErr w:type="spellStart"/>
+      <w:r>
+        <w:t>Prolog</w:t>
+      </w:r>
+      <w:proofErr w:type="spellEnd"/>
+      <w:r>
+        <w:t xml:space="preserve"> e torna o código mais conciso e verificável do que uma implementação iterativa equivalente noutras linguagens.</w:t>
+      </w:r>
+    </w:p>
+    <w:p>
+      <w:pPr>
+        <w:spacing w:after="160" w:line="278" w:lineRule="auto"/>
+        <w:jc w:val="left"/>
+        <w:rPr>
+          <w:rFonts w:asciiTheme="majorHAnsi" w:eastAsiaTheme="majorEastAsia" w:hAnsiTheme="majorHAnsi" w:cstheme="majorBidi"/>
+          <w:color w:val="0F4761" w:themeColor="accent1" w:themeShade="BF"/>
+          <w:sz w:val="40"/>
+          <w:szCs w:val="40"/>
+        </w:rPr>
+      </w:pPr>
+      <w:r>
+        <w:lastRenderedPageBreak/>
+        <w:br w:type="page"/>
+      </w:r>
+    </w:p>
+    <w:p>
+      <w:pPr>
+        <w:pStyle w:val="Ttulo1"/>
+      </w:pPr>
+      <w:bookmarkStart w:id="39" w:name="_Toc227590421"/>
+      <w:r>
+        <w:lastRenderedPageBreak/>
+        <w:t>Conclusão</w:t>
+      </w:r>
+      <w:bookmarkEnd w:id="39"/>
+      <w:r>
+        <w:t xml:space="preserve"> </w:t>
       </w:r>
     </w:p>
     <w:p>
@@ -5757,7 +7762,21 @@
           <w:rFonts w:eastAsia="Times New Roman" w:cs="Times New Roman"/>
           <w:lang w:eastAsia="pt-PT"/>
         </w:rPr>
-        <w:t xml:space="preserve">Foram atingidos os objetivos de aprendizagem propostos: domínio da sintaxe </w:t>
+        <w:t>Foram atingidos os objetivos de aprendizagem propostos</w:t>
+      </w:r>
+      <w:r>
+        <w:rPr>
+          <w:rFonts w:eastAsia="Times New Roman" w:cs="Times New Roman"/>
+          <w:lang w:eastAsia="pt-PT"/>
+        </w:rPr>
+        <w:t>,</w:t>
+      </w:r>
+      <w:r>
+        <w:rPr>
+          <w:rFonts w:eastAsia="Times New Roman" w:cs="Times New Roman"/>
+          <w:lang w:eastAsia="pt-PT"/>
+        </w:rPr>
+        <w:t xml:space="preserve"> domínio da sintaxe </w:t>
       </w:r>
       <w:proofErr w:type="spellStart"/>
       <w:r>
@@ -5883,7 +7902,21 @@
           <w:rFonts w:eastAsia="Times New Roman" w:cs="Times New Roman"/>
           <w:lang w:eastAsia="pt-PT"/>
         </w:rPr>
-        <w:t xml:space="preserve"> com profundidade 2 e função de avaliação por mobilidade revelou-se uma solução eficaz.</w:t>
+        <w:t xml:space="preserve"> com profundidade </w:t>
+      </w:r>
+      <w:r>
+        <w:rPr>
+          <w:rFonts w:eastAsia="Times New Roman" w:cs="Times New Roman"/>
+          <w:lang w:eastAsia="pt-PT"/>
+        </w:rPr>
+        <w:t>3</w:t>
+      </w:r>
+      <w:r>
+        <w:rPr>
+          <w:rFonts w:eastAsia="Times New Roman" w:cs="Times New Roman"/>
+          <w:lang w:eastAsia="pt-PT"/>
+        </w:rPr>
+        <w:t xml:space="preserve"> e função de avaliação por mobilidade revelou-se uma solução eficaz.</w:t>
       </w:r>
       <w:r>
         <w:rPr>
@@ -5902,327 +7935,9 @@
           <w:lang w:eastAsia="pt-PT"/>
         </w:rPr>
       </w:pPr>
-      <w:r>
-        <w:rPr>
-          <w:rFonts w:eastAsia="Times New Roman" w:cs="Times New Roman"/>
-          <w:lang w:eastAsia="pt-PT"/>
-        </w:rPr>
-        <w:br w:type="page"/>
-      </w:r>
-    </w:p>
-    <w:p>
-      <w:pPr>
-        <w:rPr>
-          <w:rFonts w:eastAsia="Times New Roman" w:cs="Times New Roman"/>
-          <w:lang w:eastAsia="pt-PT"/>
-        </w:rPr>
-      </w:pPr>
-    </w:p>
-    <w:bookmarkStart w:id="22" w:name="_Toc227516731" w:displacedByCustomXml="next"/>
-    <w:sdt>
-      <w:sdtPr>
-        <w:rPr>
-          <w:rFonts w:asciiTheme="minorHAnsi" w:eastAsiaTheme="minorEastAsia" w:hAnsiTheme="minorHAnsi" w:cstheme="minorBidi"/>
-          <w:color w:val="auto"/>
-          <w:sz w:val="24"/>
-          <w:szCs w:val="24"/>
-        </w:rPr>
-        <w:id w:val="-1725673898"/>
-        <w:docPartObj>
-          <w:docPartGallery w:val="Bibliographies"/>
-          <w:docPartUnique/>
-        </w:docPartObj>
-      </w:sdtPr>
-      <w:sdtContent>
-        <w:p>
-          <w:pPr>
-            <w:pStyle w:val="Ttulo1"/>
-            <w:spacing w:afterLines="25" w:after="60"/>
-            <w:ind w:left="360"/>
-            <w:jc w:val="left"/>
-          </w:pPr>
-          <w:r>
-            <w:t>Referências</w:t>
-          </w:r>
-          <w:bookmarkEnd w:id="22"/>
-        </w:p>
-        <w:sdt>
-          <w:sdtPr>
-            <w:id w:val="-573587230"/>
-            <w:bibliography/>
-          </w:sdtPr>
-          <w:sdtContent>
-            <w:p>
-              <w:pPr>
-                <w:rPr>
-                  <w:rFonts w:eastAsiaTheme="minorHAnsi"/>
-                  <w:noProof/>
-                  <w:kern w:val="2"/>
-                  <w:lang w:eastAsia="en-US"/>
-                  <w14:ligatures w14:val="standardContextual"/>
-                </w:rPr>
-              </w:pPr>
-              <w:r>
-                <w:fldChar w:fldCharType="begin"/>
-              </w:r>
-              <w:r>
-                <w:instrText>BIBLIOGRAPHY</w:instrText>
-              </w:r>
-              <w:r>
-                <w:fldChar w:fldCharType="separate"/>
-              </w:r>
-            </w:p>
-            <w:tbl>
-              <w:tblPr>
-                <w:tblW w:w="5000" w:type="pct"/>
-                <w:tblCellSpacing w:w="15" w:type="dxa"/>
-                <w:tblCellMar>
-                  <w:top w:w="15" w:type="dxa"/>
-                  <w:left w:w="15" w:type="dxa"/>
-                  <w:bottom w:w="15" w:type="dxa"/>
-                  <w:right w:w="15" w:type="dxa"/>
-                </w:tblCellMar>
-                <w:tblLook w:val="04A0" w:firstRow="1" w:lastRow="0" w:firstColumn="1" w:lastColumn="0" w:noHBand="0" w:noVBand="1"/>
-              </w:tblPr>
-              <w:tblGrid>
-                <w:gridCol w:w="715"/>
-                <w:gridCol w:w="8923"/>
-              </w:tblGrid>
-              <w:tr>
-                <w:trPr>
-                  <w:divId w:val="1151556814"/>
-                  <w:tblCellSpacing w:w="15" w:type="dxa"/>
-                </w:trPr>
-                <w:tc>
-                  <w:tcPr>
-                    <w:tcW w:w="50" w:type="pct"/>
-                    <w:hideMark/>
-                  </w:tcPr>
-                  <w:p>
-                    <w:pPr>
-                      <w:pStyle w:val="NormalWeb"/>
-                      <w:ind w:left="360"/>
-                    </w:pPr>
-                    <w:r>
-                      <w:t xml:space="preserve">[1] </w:t>
-                    </w:r>
-                  </w:p>
-                </w:tc>
-                <w:tc>
-                  <w:tcPr>
-                    <w:tcW w:w="0" w:type="auto"/>
-                    <w:hideMark/>
-                  </w:tcPr>
-                  <w:p>
-                    <w:pPr>
-                      <w:pStyle w:val="NormalWeb"/>
-                      <w:ind w:left="360"/>
-                    </w:pPr>
-                    <w:r>
-                      <w:rPr>
-                        <w:lang w:val="en-GB"/>
-                      </w:rPr>
-                      <w:t xml:space="preserve">J. Johncy, “Why Every Music Producer Faces Challenges and How to Beat Them,” 29 Maio 2025. [Online]. Available: https://www.pointblankmusicschool.com/blog/why-every-music-producer-faces-challenges-and-how-to-beat-them/. </w:t>
-                    </w:r>
-                    <w:r>
-                      <w:t>[Acedido em 1 Março 2026].</w:t>
-                    </w:r>
-                  </w:p>
-                </w:tc>
-              </w:tr>
-              <w:tr>
-                <w:trPr>
-                  <w:divId w:val="1151556814"/>
-                  <w:tblCellSpacing w:w="15" w:type="dxa"/>
-                </w:trPr>
-                <w:tc>
-                  <w:tcPr>
-                    <w:tcW w:w="50" w:type="pct"/>
-                    <w:hideMark/>
-                  </w:tcPr>
-                  <w:p>
-                    <w:pPr>
-                      <w:pStyle w:val="NormalWeb"/>
-                      <w:ind w:left="360"/>
-                    </w:pPr>
-                    <w:r>
-                      <w:t xml:space="preserve">[2] </w:t>
-                    </w:r>
-                  </w:p>
-                </w:tc>
-                <w:tc>
-                  <w:tcPr>
-                    <w:tcW w:w="0" w:type="auto"/>
-                    <w:hideMark/>
-                  </w:tcPr>
-                  <w:p>
-                    <w:pPr>
-                      <w:pStyle w:val="NormalWeb"/>
-                      <w:ind w:left="360"/>
-                    </w:pPr>
-                    <w:r>
-                      <w:rPr>
-                        <w:lang w:val="en-GB"/>
-                      </w:rPr>
-                      <w:t xml:space="preserve">S.-L. W. Huang, Y. Kim e C.-Z. Anna, “Midi-LLM: Adapting Large Language Models for Text-to-MIDI Music Generation,” 6 Novembro 2025. </w:t>
-                    </w:r>
-                    <w:r>
-                      <w:t>[Online]. Available: https://arxiv.org/html/2511.03942v1. [Acedido em 1 Março 2026].</w:t>
-                    </w:r>
-                  </w:p>
-                </w:tc>
-              </w:tr>
-              <w:tr>
-                <w:trPr>
-                  <w:divId w:val="1151556814"/>
-                  <w:tblCellSpacing w:w="15" w:type="dxa"/>
-                </w:trPr>
-                <w:tc>
-                  <w:tcPr>
-                    <w:tcW w:w="50" w:type="pct"/>
-                    <w:hideMark/>
-                  </w:tcPr>
-                  <w:p>
-                    <w:pPr>
-                      <w:pStyle w:val="NormalWeb"/>
-                      <w:ind w:left="360"/>
-                    </w:pPr>
-                    <w:r>
-                      <w:t xml:space="preserve">[3] </w:t>
-                    </w:r>
-                  </w:p>
-                </w:tc>
-                <w:tc>
-                  <w:tcPr>
-                    <w:tcW w:w="0" w:type="auto"/>
-                    <w:hideMark/>
-                  </w:tcPr>
-                  <w:p>
-                    <w:pPr>
-                      <w:pStyle w:val="NormalWeb"/>
-                      <w:ind w:left="360"/>
-                    </w:pPr>
-                    <w:r>
-                      <w:rPr>
-                        <w:lang w:val="en-GB"/>
-                      </w:rPr>
-                      <w:t xml:space="preserve">J. Hollan, “Why Python is the language of choice for AI,” 22 Outubro 2024. </w:t>
-                    </w:r>
-                    <w:r>
-                      <w:t>[Online]. Available: https://www.infoworld.com/article/3567094/why-python-is-the-language-of-choice-for-ai.html. [Acedido em 1 Março 2026].</w:t>
-                    </w:r>
-                  </w:p>
-                </w:tc>
-              </w:tr>
-              <w:tr>
-                <w:trPr>
-                  <w:divId w:val="1151556814"/>
-                  <w:tblCellSpacing w:w="15" w:type="dxa"/>
-                </w:trPr>
-                <w:tc>
-                  <w:tcPr>
-                    <w:tcW w:w="50" w:type="pct"/>
-                    <w:hideMark/>
-                  </w:tcPr>
-                  <w:p>
-                    <w:pPr>
-                      <w:pStyle w:val="NormalWeb"/>
-                      <w:ind w:left="360"/>
-                    </w:pPr>
-                    <w:r>
-                      <w:t xml:space="preserve">[4] </w:t>
-                    </w:r>
-                  </w:p>
-                </w:tc>
-                <w:tc>
-                  <w:tcPr>
-                    <w:tcW w:w="0" w:type="auto"/>
-                    <w:hideMark/>
-                  </w:tcPr>
-                  <w:p>
-                    <w:pPr>
-                      <w:pStyle w:val="NormalWeb"/>
-                      <w:ind w:left="360"/>
-                    </w:pPr>
-                    <w:r>
-                      <w:rPr>
-                        <w:lang w:val="en-GB"/>
-                      </w:rPr>
-                      <w:t xml:space="preserve">“Open Music Foundation Models for Full-Song Generation,” [Online]. </w:t>
-                    </w:r>
-                    <w:r>
-                      <w:t>Available: https://map-yue.github.io/. [Acedido em 1 Março 2026].</w:t>
-                    </w:r>
-                  </w:p>
-                </w:tc>
-              </w:tr>
-              <w:tr>
-                <w:trPr>
-                  <w:divId w:val="1151556814"/>
-                  <w:tblCellSpacing w:w="15" w:type="dxa"/>
-                </w:trPr>
-                <w:tc>
-                  <w:tcPr>
-                    <w:tcW w:w="50" w:type="pct"/>
-                    <w:hideMark/>
-                  </w:tcPr>
-                  <w:p>
-                    <w:pPr>
-                      <w:pStyle w:val="NormalWeb"/>
-                      <w:ind w:left="360"/>
-                    </w:pPr>
-                    <w:r>
-                      <w:t xml:space="preserve">[5] </w:t>
-                    </w:r>
-                  </w:p>
-                </w:tc>
-                <w:tc>
-                  <w:tcPr>
-                    <w:tcW w:w="0" w:type="auto"/>
-                    <w:hideMark/>
-                  </w:tcPr>
-                  <w:p>
-                    <w:pPr>
-                      <w:pStyle w:val="NormalWeb"/>
-                      <w:ind w:left="360"/>
-                    </w:pPr>
-                    <w:r>
-                      <w:rPr>
-                        <w:lang w:val="en-GB"/>
-                      </w:rPr>
-                      <w:t xml:space="preserve">P. Joshi, “From Noise to Music: Analyzing Audio with Python and Librosa,” 6 Agosto 2024. [Online]. Available: https://medium.com/@joshiprerak123/from-noise-to-music-analyzing-audio-with-python-and-librosa-4a4ea5b1b805. </w:t>
-                    </w:r>
-                    <w:r>
-                      <w:t>[Acedido em 1 Março 2026].</w:t>
-                    </w:r>
-                  </w:p>
-                </w:tc>
-              </w:tr>
-            </w:tbl>
-            <w:p>
-              <w:pPr>
-                <w:divId w:val="1151556814"/>
-                <w:rPr>
-                  <w:rFonts w:eastAsia="Times New Roman"/>
-                  <w:noProof/>
-                </w:rPr>
-              </w:pPr>
-            </w:p>
-            <w:p>
-              <w:r>
-                <w:rPr>
-                  <w:b/>
-                  <w:bCs/>
-                </w:rPr>
-                <w:fldChar w:fldCharType="end"/>
-              </w:r>
-            </w:p>
-          </w:sdtContent>
-        </w:sdt>
-      </w:sdtContent>
-    </w:sdt>
+    </w:p>
     <w:sectPr>
-      <w:footerReference w:type="default" r:id="rId15"/>
+      <w:footerReference w:type="default" r:id="rId24"/>
       <w:pgSz w:w="11906" w:h="16838"/>
       <w:pgMar w:top="1134" w:right="1134" w:bottom="1134" w:left="1134" w:header="708" w:footer="708" w:gutter="0"/>
       <w:cols w:space="708"/>
@@ -7870,6 +9585,9 @@
   </w:num>
   <w:num w:numId="14" w16cid:durableId="1221601167">
     <w:abstractNumId w:val="4"/>
+  </w:num>
+  <w:num w:numId="15" w16cid:durableId="1730496509">
+    <w:abstractNumId w:val="0"/>
   </w:num>
   <w:numIdMacAtCleanup w:val="5"/>
 </w:numbering>
@@ -8517,6 +10235,7 @@
   <w:style w:type="character" w:default="1" w:styleId="Tipodeletrapredefinidodopargrafo">
     <w:name w:val="Default Paragraph Font"/>
     <w:uiPriority w:val="1"/>
+    <w:semiHidden/>
     <w:unhideWhenUsed/>
   </w:style>
   <w:style w:type="table" w:default="1" w:styleId="Tabelanormal">

</xml_diff>

<commit_message>
final review of the docs
</commit_message>
<xml_diff>
--- a/Relatório ISOLA Prolog.docx
+++ b/Relatório ISOLA Prolog.docx
@@ -498,7 +498,7 @@
           <w:r>
             <w:fldChar w:fldCharType="separate"/>
           </w:r>
-          <w:hyperlink w:anchor="_Toc227594638" w:history="1">
+          <w:hyperlink w:anchor="_Toc227607949" w:history="1">
             <w:r>
               <w:rPr>
                 <w:rStyle w:val="Hiperligao"/>
@@ -541,7 +541,7 @@
                 <w:noProof/>
                 <w:webHidden/>
               </w:rPr>
-              <w:instrText xml:space="preserve"> PAGEREF _Toc227594638 \h </w:instrText>
+              <w:instrText xml:space="preserve"> PAGEREF _Toc227607949 \h </w:instrText>
             </w:r>
             <w:r>
               <w:rPr>
@@ -586,7 +586,7 @@
               <w14:ligatures w14:val="standardContextual"/>
             </w:rPr>
           </w:pPr>
-          <w:hyperlink w:anchor="_Toc227594639" w:history="1">
+          <w:hyperlink w:anchor="_Toc227607950" w:history="1">
             <w:r>
               <w:rPr>
                 <w:rStyle w:val="Hiperligao"/>
@@ -629,7 +629,7 @@
                 <w:noProof/>
                 <w:webHidden/>
               </w:rPr>
-              <w:instrText xml:space="preserve"> PAGEREF _Toc227594639 \h </w:instrText>
+              <w:instrText xml:space="preserve"> PAGEREF _Toc227607950 \h </w:instrText>
             </w:r>
             <w:r>
               <w:rPr>
@@ -674,7 +674,7 @@
               <w14:ligatures w14:val="standardContextual"/>
             </w:rPr>
           </w:pPr>
-          <w:hyperlink w:anchor="_Toc227594640" w:history="1">
+          <w:hyperlink w:anchor="_Toc227607951" w:history="1">
             <w:r>
               <w:rPr>
                 <w:rStyle w:val="Hiperligao"/>
@@ -717,7 +717,7 @@
                 <w:noProof/>
                 <w:webHidden/>
               </w:rPr>
-              <w:instrText xml:space="preserve"> PAGEREF _Toc227594640 \h </w:instrText>
+              <w:instrText xml:space="preserve"> PAGEREF _Toc227607951 \h </w:instrText>
             </w:r>
             <w:r>
               <w:rPr>
@@ -762,7 +762,7 @@
               <w14:ligatures w14:val="standardContextual"/>
             </w:rPr>
           </w:pPr>
-          <w:hyperlink w:anchor="_Toc227594641" w:history="1">
+          <w:hyperlink w:anchor="_Toc227607952" w:history="1">
             <w:r>
               <w:rPr>
                 <w:rStyle w:val="Hiperligao"/>
@@ -805,7 +805,7 @@
                 <w:noProof/>
                 <w:webHidden/>
               </w:rPr>
-              <w:instrText xml:space="preserve"> PAGEREF _Toc227594641 \h </w:instrText>
+              <w:instrText xml:space="preserve"> PAGEREF _Toc227607952 \h </w:instrText>
             </w:r>
             <w:r>
               <w:rPr>
@@ -850,7 +850,7 @@
               <w14:ligatures w14:val="standardContextual"/>
             </w:rPr>
           </w:pPr>
-          <w:hyperlink w:anchor="_Toc227594642" w:history="1">
+          <w:hyperlink w:anchor="_Toc227607953" w:history="1">
             <w:r>
               <w:rPr>
                 <w:rStyle w:val="Hiperligao"/>
@@ -893,7 +893,7 @@
                 <w:noProof/>
                 <w:webHidden/>
               </w:rPr>
-              <w:instrText xml:space="preserve"> PAGEREF _Toc227594642 \h </w:instrText>
+              <w:instrText xml:space="preserve"> PAGEREF _Toc227607953 \h </w:instrText>
             </w:r>
             <w:r>
               <w:rPr>
@@ -938,7 +938,7 @@
               <w14:ligatures w14:val="standardContextual"/>
             </w:rPr>
           </w:pPr>
-          <w:hyperlink w:anchor="_Toc227594643" w:history="1">
+          <w:hyperlink w:anchor="_Toc227607954" w:history="1">
             <w:r>
               <w:rPr>
                 <w:rStyle w:val="Hiperligao"/>
@@ -981,7 +981,7 @@
                 <w:noProof/>
                 <w:webHidden/>
               </w:rPr>
-              <w:instrText xml:space="preserve"> PAGEREF _Toc227594643 \h </w:instrText>
+              <w:instrText xml:space="preserve"> PAGEREF _Toc227607954 \h </w:instrText>
             </w:r>
             <w:r>
               <w:rPr>
@@ -1026,7 +1026,7 @@
               <w14:ligatures w14:val="standardContextual"/>
             </w:rPr>
           </w:pPr>
-          <w:hyperlink w:anchor="_Toc227594644" w:history="1">
+          <w:hyperlink w:anchor="_Toc227607955" w:history="1">
             <w:r>
               <w:rPr>
                 <w:rStyle w:val="Hiperligao"/>
@@ -1048,7 +1048,7 @@
                 <w:rStyle w:val="Hiperligao"/>
                 <w:noProof/>
               </w:rPr>
-              <w:t>main.pl — Ciclo de Jogo</w:t>
+              <w:t>main.pl</w:t>
             </w:r>
             <w:r>
               <w:rPr>
@@ -1069,7 +1069,7 @@
                 <w:noProof/>
                 <w:webHidden/>
               </w:rPr>
-              <w:instrText xml:space="preserve"> PAGEREF _Toc227594644 \h </w:instrText>
+              <w:instrText xml:space="preserve"> PAGEREF _Toc227607955 \h </w:instrText>
             </w:r>
             <w:r>
               <w:rPr>
@@ -1114,7 +1114,7 @@
               <w14:ligatures w14:val="standardContextual"/>
             </w:rPr>
           </w:pPr>
-          <w:hyperlink w:anchor="_Toc227594645" w:history="1">
+          <w:hyperlink w:anchor="_Toc227607956" w:history="1">
             <w:r>
               <w:rPr>
                 <w:rStyle w:val="Hiperligao"/>
@@ -1136,7 +1136,7 @@
                 <w:rStyle w:val="Hiperligao"/>
                 <w:noProof/>
               </w:rPr>
-              <w:t>utils.pl — Utilitários</w:t>
+              <w:t>utils.pl</w:t>
             </w:r>
             <w:r>
               <w:rPr>
@@ -1157,7 +1157,7 @@
                 <w:noProof/>
                 <w:webHidden/>
               </w:rPr>
-              <w:instrText xml:space="preserve"> PAGEREF _Toc227594645 \h </w:instrText>
+              <w:instrText xml:space="preserve"> PAGEREF _Toc227607956 \h </w:instrText>
             </w:r>
             <w:r>
               <w:rPr>
@@ -1202,7 +1202,7 @@
               <w14:ligatures w14:val="standardContextual"/>
             </w:rPr>
           </w:pPr>
-          <w:hyperlink w:anchor="_Toc227594646" w:history="1">
+          <w:hyperlink w:anchor="_Toc227607957" w:history="1">
             <w:r>
               <w:rPr>
                 <w:rStyle w:val="Hiperligao"/>
@@ -1224,7 +1224,7 @@
                 <w:rStyle w:val="Hiperligao"/>
                 <w:noProof/>
               </w:rPr>
-              <w:t>replace.pl — Substituição no Tabuleiro</w:t>
+              <w:t>replace.pl</w:t>
             </w:r>
             <w:r>
               <w:rPr>
@@ -1245,7 +1245,7 @@
                 <w:noProof/>
                 <w:webHidden/>
               </w:rPr>
-              <w:instrText xml:space="preserve"> PAGEREF _Toc227594646 \h </w:instrText>
+              <w:instrText xml:space="preserve"> PAGEREF _Toc227607957 \h </w:instrText>
             </w:r>
             <w:r>
               <w:rPr>
@@ -1290,7 +1290,7 @@
               <w14:ligatures w14:val="standardContextual"/>
             </w:rPr>
           </w:pPr>
-          <w:hyperlink w:anchor="_Toc227594647" w:history="1">
+          <w:hyperlink w:anchor="_Toc227607958" w:history="1">
             <w:r>
               <w:rPr>
                 <w:rStyle w:val="Hiperligao"/>
@@ -1312,7 +1312,7 @@
                 <w:rStyle w:val="Hiperligao"/>
                 <w:noProof/>
               </w:rPr>
-              <w:t>print.pl — Impressão</w:t>
+              <w:t>print.pl</w:t>
             </w:r>
             <w:r>
               <w:rPr>
@@ -1333,7 +1333,7 @@
                 <w:noProof/>
                 <w:webHidden/>
               </w:rPr>
-              <w:instrText xml:space="preserve"> PAGEREF _Toc227594647 \h </w:instrText>
+              <w:instrText xml:space="preserve"> PAGEREF _Toc227607958 \h </w:instrText>
             </w:r>
             <w:r>
               <w:rPr>
@@ -1378,7 +1378,7 @@
               <w14:ligatures w14:val="standardContextual"/>
             </w:rPr>
           </w:pPr>
-          <w:hyperlink w:anchor="_Toc227594648" w:history="1">
+          <w:hyperlink w:anchor="_Toc227607959" w:history="1">
             <w:r>
               <w:rPr>
                 <w:rStyle w:val="Hiperligao"/>
@@ -1421,7 +1421,7 @@
                 <w:noProof/>
                 <w:webHidden/>
               </w:rPr>
-              <w:instrText xml:space="preserve"> PAGEREF _Toc227594648 \h </w:instrText>
+              <w:instrText xml:space="preserve"> PAGEREF _Toc227607959 \h </w:instrText>
             </w:r>
             <w:r>
               <w:rPr>
@@ -1466,7 +1466,7 @@
               <w14:ligatures w14:val="standardContextual"/>
             </w:rPr>
           </w:pPr>
-          <w:hyperlink w:anchor="_Toc227594649" w:history="1">
+          <w:hyperlink w:anchor="_Toc227607960" w:history="1">
             <w:r>
               <w:rPr>
                 <w:rStyle w:val="Hiperligao"/>
@@ -1509,7 +1509,7 @@
                 <w:noProof/>
                 <w:webHidden/>
               </w:rPr>
-              <w:instrText xml:space="preserve"> PAGEREF _Toc227594649 \h </w:instrText>
+              <w:instrText xml:space="preserve"> PAGEREF _Toc227607960 \h </w:instrText>
             </w:r>
             <w:r>
               <w:rPr>
@@ -1554,7 +1554,7 @@
               <w14:ligatures w14:val="standardContextual"/>
             </w:rPr>
           </w:pPr>
-          <w:hyperlink w:anchor="_Toc227594650" w:history="1">
+          <w:hyperlink w:anchor="_Toc227607961" w:history="1">
             <w:r>
               <w:rPr>
                 <w:rStyle w:val="Hiperligao"/>
@@ -1597,7 +1597,7 @@
                 <w:noProof/>
                 <w:webHidden/>
               </w:rPr>
-              <w:instrText xml:space="preserve"> PAGEREF _Toc227594650 \h </w:instrText>
+              <w:instrText xml:space="preserve"> PAGEREF _Toc227607961 \h </w:instrText>
             </w:r>
             <w:r>
               <w:rPr>
@@ -1642,7 +1642,7 @@
               <w14:ligatures w14:val="standardContextual"/>
             </w:rPr>
           </w:pPr>
-          <w:hyperlink w:anchor="_Toc227594651" w:history="1">
+          <w:hyperlink w:anchor="_Toc227607962" w:history="1">
             <w:r>
               <w:rPr>
                 <w:rStyle w:val="Hiperligao"/>
@@ -1685,7 +1685,7 @@
                 <w:noProof/>
                 <w:webHidden/>
               </w:rPr>
-              <w:instrText xml:space="preserve"> PAGEREF _Toc227594651 \h </w:instrText>
+              <w:instrText xml:space="preserve"> PAGEREF _Toc227607962 \h </w:instrText>
             </w:r>
             <w:r>
               <w:rPr>
@@ -1730,7 +1730,7 @@
               <w14:ligatures w14:val="standardContextual"/>
             </w:rPr>
           </w:pPr>
-          <w:hyperlink w:anchor="_Toc227594652" w:history="1">
+          <w:hyperlink w:anchor="_Toc227607963" w:history="1">
             <w:r>
               <w:rPr>
                 <w:rStyle w:val="Hiperligao"/>
@@ -1773,7 +1773,7 @@
                 <w:noProof/>
                 <w:webHidden/>
               </w:rPr>
-              <w:instrText xml:space="preserve"> PAGEREF _Toc227594652 \h </w:instrText>
+              <w:instrText xml:space="preserve"> PAGEREF _Toc227607963 \h </w:instrText>
             </w:r>
             <w:r>
               <w:rPr>
@@ -1818,7 +1818,7 @@
               <w14:ligatures w14:val="standardContextual"/>
             </w:rPr>
           </w:pPr>
-          <w:hyperlink w:anchor="_Toc227594653" w:history="1">
+          <w:hyperlink w:anchor="_Toc227607964" w:history="1">
             <w:r>
               <w:rPr>
                 <w:rStyle w:val="Hiperligao"/>
@@ -1861,7 +1861,7 @@
                 <w:noProof/>
                 <w:webHidden/>
               </w:rPr>
-              <w:instrText xml:space="preserve"> PAGEREF _Toc227594653 \h </w:instrText>
+              <w:instrText xml:space="preserve"> PAGEREF _Toc227607964 \h </w:instrText>
             </w:r>
             <w:r>
               <w:rPr>
@@ -1906,7 +1906,7 @@
               <w14:ligatures w14:val="standardContextual"/>
             </w:rPr>
           </w:pPr>
-          <w:hyperlink w:anchor="_Toc227594654" w:history="1">
+          <w:hyperlink w:anchor="_Toc227607965" w:history="1">
             <w:r>
               <w:rPr>
                 <w:rStyle w:val="Hiperligao"/>
@@ -1928,7 +1928,7 @@
                 <w:rStyle w:val="Hiperligao"/>
                 <w:noProof/>
               </w:rPr>
-              <w:t>Tabuleiro 3x3 — Minimax sem limite</w:t>
+              <w:t>Tabuleiro 3x3 Minimax sem limite</w:t>
             </w:r>
             <w:r>
               <w:rPr>
@@ -1949,7 +1949,7 @@
                 <w:noProof/>
                 <w:webHidden/>
               </w:rPr>
-              <w:instrText xml:space="preserve"> PAGEREF _Toc227594654 \h </w:instrText>
+              <w:instrText xml:space="preserve"> PAGEREF _Toc227607965 \h </w:instrText>
             </w:r>
             <w:r>
               <w:rPr>
@@ -1994,7 +1994,7 @@
               <w14:ligatures w14:val="standardContextual"/>
             </w:rPr>
           </w:pPr>
-          <w:hyperlink w:anchor="_Toc227594655" w:history="1">
+          <w:hyperlink w:anchor="_Toc227607966" w:history="1">
             <w:r>
               <w:rPr>
                 <w:rStyle w:val="Hiperligao"/>
@@ -2016,7 +2016,7 @@
                 <w:rStyle w:val="Hiperligao"/>
                 <w:noProof/>
               </w:rPr>
-              <w:t>Tabuleiro 6x6 — Alfa-Beta com profundidade 3</w:t>
+              <w:t>Tabuleiro 6x6 Alfa-Beta com profundidade 3</w:t>
             </w:r>
             <w:r>
               <w:rPr>
@@ -2037,7 +2037,7 @@
                 <w:noProof/>
                 <w:webHidden/>
               </w:rPr>
-              <w:instrText xml:space="preserve"> PAGEREF _Toc227594655 \h </w:instrText>
+              <w:instrText xml:space="preserve"> PAGEREF _Toc227607966 \h </w:instrText>
             </w:r>
             <w:r>
               <w:rPr>
@@ -2082,7 +2082,7 @@
               <w14:ligatures w14:val="standardContextual"/>
             </w:rPr>
           </w:pPr>
-          <w:hyperlink w:anchor="_Toc227594656" w:history="1">
+          <w:hyperlink w:anchor="_Toc227607967" w:history="1">
             <w:r>
               <w:rPr>
                 <w:rStyle w:val="Hiperligao"/>
@@ -2104,7 +2104,7 @@
                 <w:rStyle w:val="Hiperligao"/>
                 <w:noProof/>
               </w:rPr>
-              <w:t>Impacto da Profundidade no Alfa-Beta</w:t>
+              <w:t>Impacto da profundidade no Alfa-Beta</w:t>
             </w:r>
             <w:r>
               <w:rPr>
@@ -2125,7 +2125,7 @@
                 <w:noProof/>
                 <w:webHidden/>
               </w:rPr>
-              <w:instrText xml:space="preserve"> PAGEREF _Toc227594656 \h </w:instrText>
+              <w:instrText xml:space="preserve"> PAGEREF _Toc227607967 \h </w:instrText>
             </w:r>
             <w:r>
               <w:rPr>
@@ -2170,7 +2170,7 @@
               <w14:ligatures w14:val="standardContextual"/>
             </w:rPr>
           </w:pPr>
-          <w:hyperlink w:anchor="_Toc227594657" w:history="1">
+          <w:hyperlink w:anchor="_Toc227607968" w:history="1">
             <w:r>
               <w:rPr>
                 <w:rStyle w:val="Hiperligao"/>
@@ -2213,7 +2213,7 @@
                 <w:noProof/>
                 <w:webHidden/>
               </w:rPr>
-              <w:instrText xml:space="preserve"> PAGEREF _Toc227594657 \h </w:instrText>
+              <w:instrText xml:space="preserve"> PAGEREF _Toc227607968 \h </w:instrText>
             </w:r>
             <w:r>
               <w:rPr>
@@ -2258,7 +2258,7 @@
               <w14:ligatures w14:val="standardContextual"/>
             </w:rPr>
           </w:pPr>
-          <w:hyperlink w:anchor="_Toc227594658" w:history="1">
+          <w:hyperlink w:anchor="_Toc227607969" w:history="1">
             <w:r>
               <w:rPr>
                 <w:rStyle w:val="Hiperligao"/>
@@ -2301,7 +2301,7 @@
                 <w:noProof/>
                 <w:webHidden/>
               </w:rPr>
-              <w:instrText xml:space="preserve"> PAGEREF _Toc227594658 \h </w:instrText>
+              <w:instrText xml:space="preserve"> PAGEREF _Toc227607969 \h </w:instrText>
             </w:r>
             <w:r>
               <w:rPr>
@@ -2346,7 +2346,7 @@
               <w14:ligatures w14:val="standardContextual"/>
             </w:rPr>
           </w:pPr>
-          <w:hyperlink w:anchor="_Toc227594659" w:history="1">
+          <w:hyperlink w:anchor="_Toc227607970" w:history="1">
             <w:r>
               <w:rPr>
                 <w:rStyle w:val="Hiperligao"/>
@@ -2389,7 +2389,7 @@
                 <w:noProof/>
                 <w:webHidden/>
               </w:rPr>
-              <w:instrText xml:space="preserve"> PAGEREF _Toc227594659 \h </w:instrText>
+              <w:instrText xml:space="preserve"> PAGEREF _Toc227607970 \h </w:instrText>
             </w:r>
             <w:r>
               <w:rPr>
@@ -2434,7 +2434,7 @@
               <w14:ligatures w14:val="standardContextual"/>
             </w:rPr>
           </w:pPr>
-          <w:hyperlink w:anchor="_Toc227594660" w:history="1">
+          <w:hyperlink w:anchor="_Toc227607971" w:history="1">
             <w:r>
               <w:rPr>
                 <w:rStyle w:val="Hiperligao"/>
@@ -2477,7 +2477,7 @@
                 <w:noProof/>
                 <w:webHidden/>
               </w:rPr>
-              <w:instrText xml:space="preserve"> PAGEREF _Toc227594660 \h </w:instrText>
+              <w:instrText xml:space="preserve"> PAGEREF _Toc227607971 \h </w:instrText>
             </w:r>
             <w:r>
               <w:rPr>
@@ -2522,7 +2522,7 @@
               <w14:ligatures w14:val="standardContextual"/>
             </w:rPr>
           </w:pPr>
-          <w:hyperlink w:anchor="_Toc227594661" w:history="1">
+          <w:hyperlink w:anchor="_Toc227607972" w:history="1">
             <w:r>
               <w:rPr>
                 <w:rStyle w:val="Hiperligao"/>
@@ -2565,7 +2565,7 @@
                 <w:noProof/>
                 <w:webHidden/>
               </w:rPr>
-              <w:instrText xml:space="preserve"> PAGEREF _Toc227594661 \h </w:instrText>
+              <w:instrText xml:space="preserve"> PAGEREF _Toc227607972 \h </w:instrText>
             </w:r>
             <w:r>
               <w:rPr>
@@ -2610,7 +2610,7 @@
               <w14:ligatures w14:val="standardContextual"/>
             </w:rPr>
           </w:pPr>
-          <w:hyperlink w:anchor="_Toc227594662" w:history="1">
+          <w:hyperlink w:anchor="_Toc227607973" w:history="1">
             <w:r>
               <w:rPr>
                 <w:rStyle w:val="Hiperligao"/>
@@ -2653,7 +2653,7 @@
                 <w:noProof/>
                 <w:webHidden/>
               </w:rPr>
-              <w:instrText xml:space="preserve"> PAGEREF _Toc227594662 \h </w:instrText>
+              <w:instrText xml:space="preserve"> PAGEREF _Toc227607973 \h </w:instrText>
             </w:r>
             <w:r>
               <w:rPr>
@@ -2698,7 +2698,7 @@
               <w14:ligatures w14:val="standardContextual"/>
             </w:rPr>
           </w:pPr>
-          <w:hyperlink w:anchor="_Toc227594663" w:history="1">
+          <w:hyperlink w:anchor="_Toc227607974" w:history="1">
             <w:r>
               <w:rPr>
                 <w:rStyle w:val="Hiperligao"/>
@@ -2741,7 +2741,7 @@
                 <w:noProof/>
                 <w:webHidden/>
               </w:rPr>
-              <w:instrText xml:space="preserve"> PAGEREF _Toc227594663 \h </w:instrText>
+              <w:instrText xml:space="preserve"> PAGEREF _Toc227607974 \h </w:instrText>
             </w:r>
             <w:r>
               <w:rPr>
@@ -2786,7 +2786,7 @@
               <w14:ligatures w14:val="standardContextual"/>
             </w:rPr>
           </w:pPr>
-          <w:hyperlink w:anchor="_Toc227594664" w:history="1">
+          <w:hyperlink w:anchor="_Toc227607975" w:history="1">
             <w:r>
               <w:rPr>
                 <w:rStyle w:val="Hiperligao"/>
@@ -2829,7 +2829,7 @@
                 <w:noProof/>
                 <w:webHidden/>
               </w:rPr>
-              <w:instrText xml:space="preserve"> PAGEREF _Toc227594664 \h </w:instrText>
+              <w:instrText xml:space="preserve"> PAGEREF _Toc227607975 \h </w:instrText>
             </w:r>
             <w:r>
               <w:rPr>
@@ -3956,7 +3956,7 @@
       <w:pPr>
         <w:pStyle w:val="Ttulo1"/>
       </w:pPr>
-      <w:bookmarkStart w:id="1" w:name="_Toc227594638"/>
+      <w:bookmarkStart w:id="1" w:name="_Toc227607949"/>
       <w:r>
         <w:lastRenderedPageBreak/>
         <w:t>Introdução</w:t>
@@ -4072,19 +4072,18 @@
       <w:pPr>
         <w:pStyle w:val="Ttulo1"/>
       </w:pPr>
-      <w:bookmarkStart w:id="2" w:name="_Toc227594639"/>
+      <w:bookmarkStart w:id="2" w:name="_Toc227607950"/>
       <w:r>
         <w:lastRenderedPageBreak/>
         <w:t>Descrição do jogo ISOLA</w:t>
       </w:r>
       <w:bookmarkEnd w:id="2"/>
     </w:p>
-    <w:p/>
     <w:p>
       <w:pPr>
         <w:pStyle w:val="Ttulo2"/>
       </w:pPr>
-      <w:bookmarkStart w:id="3" w:name="_Toc227594640"/>
+      <w:bookmarkStart w:id="3" w:name="_Toc227607951"/>
       <w:r>
         <w:t>R</w:t>
       </w:r>
@@ -4243,15 +4242,9 @@
     </w:p>
     <w:p>
       <w:pPr>
-        <w:pStyle w:val="NormalWeb"/>
-        <w:ind w:left="360"/>
-      </w:pPr>
-    </w:p>
-    <w:p>
-      <w:pPr>
         <w:pStyle w:val="Ttulo2"/>
       </w:pPr>
-      <w:bookmarkStart w:id="4" w:name="_Toc227594641"/>
+      <w:bookmarkStart w:id="4" w:name="_Toc227607952"/>
       <w:r>
         <w:t>Re</w:t>
       </w:r>
@@ -4316,7 +4309,6 @@
         <w:t>asa removida (bloqueada)</w:t>
       </w:r>
     </w:p>
-    <w:p/>
     <w:p>
       <w:r>
         <w:t xml:space="preserve">Exemplo de tabuleiro inicial </w:t>
@@ -4387,7 +4379,7 @@
     </w:p>
     <w:p>
       <w:pPr>
-        <w:spacing w:before="100" w:beforeAutospacing="1" w:afterLines="25" w:after="60" w:line="240" w:lineRule="auto"/>
+        <w:spacing w:after="160" w:line="278" w:lineRule="auto"/>
         <w:jc w:val="left"/>
         <w:rPr>
           <w:rFonts w:ascii="Cambria" w:eastAsiaTheme="majorEastAsia" w:hAnsi="Cambria" w:cstheme="majorBidi"/>
@@ -4395,12 +4387,20 @@
           <w:szCs w:val="32"/>
         </w:rPr>
       </w:pPr>
+      <w:r>
+        <w:rPr>
+          <w:rFonts w:ascii="Cambria" w:eastAsiaTheme="majorEastAsia" w:hAnsi="Cambria" w:cstheme="majorBidi"/>
+          <w:sz w:val="32"/>
+          <w:szCs w:val="32"/>
+        </w:rPr>
+        <w:br w:type="page"/>
+      </w:r>
     </w:p>
     <w:p>
       <w:pPr>
         <w:pStyle w:val="Ttulo1"/>
       </w:pPr>
-      <w:bookmarkStart w:id="5" w:name="_Toc227594642"/>
+      <w:bookmarkStart w:id="5" w:name="_Toc227607953"/>
       <w:r>
         <w:lastRenderedPageBreak/>
         <w:t>Estrutura do Código</w:t>
@@ -4429,27 +4429,14 @@
       <w:r>
         <w:t xml:space="preserve">Tabela </w:t>
       </w:r>
-      <w:r>
-        <w:fldChar w:fldCharType="begin"/>
-      </w:r>
-      <w:r>
-        <w:instrText xml:space="preserve"> SEQ Tabela \* ARABIC </w:instrText>
-      </w:r>
-      <w:r>
-        <w:fldChar w:fldCharType="separate"/>
-      </w:r>
-      <w:r>
-        <w:rPr>
-          <w:noProof/>
-        </w:rPr>
-        <w:t>1</w:t>
-      </w:r>
-      <w:r>
-        <w:rPr>
-          <w:noProof/>
-        </w:rPr>
-        <w:fldChar w:fldCharType="end"/>
-      </w:r>
+      <w:fldSimple w:instr=" SEQ Tabela \* ARABIC ">
+        <w:r>
+          <w:rPr>
+            <w:noProof/>
+          </w:rPr>
+          <w:t>1</w:t>
+        </w:r>
+      </w:fldSimple>
       <w:r>
         <w:t xml:space="preserve"> Descrição de cada ficheiro</w:t>
       </w:r>
@@ -4817,7 +4804,7 @@
       <w:pPr>
         <w:pStyle w:val="Ttulo1"/>
       </w:pPr>
-      <w:bookmarkStart w:id="7" w:name="_Toc227594643"/>
+      <w:bookmarkStart w:id="7" w:name="_Toc227607954"/>
       <w:r>
         <w:lastRenderedPageBreak/>
         <w:t>Principais Predicados</w:t>
@@ -4872,7 +4859,7 @@
       <w:pPr>
         <w:pStyle w:val="Ttulo2"/>
       </w:pPr>
-      <w:bookmarkStart w:id="8" w:name="_Toc227594644"/>
+      <w:bookmarkStart w:id="8" w:name="_Toc227607955"/>
       <w:r>
         <w:t>main.pl</w:t>
       </w:r>
@@ -5003,20 +4990,20 @@
         <w:t>Alfa</w:t>
       </w:r>
       <w:r>
-        <w:t>-</w:t>
-      </w:r>
-      <w:proofErr w:type="gramStart"/>
-      <w:r>
-        <w:t>Beta</w:t>
+        <w:t>-Beta</w:t>
       </w:r>
       <w:proofErr w:type="spellEnd"/>
       <w:r>
-        <w:t xml:space="preserve"> </w:t>
-      </w:r>
+        <w:t xml:space="preserve"> ou </w:t>
+      </w:r>
+      <w:proofErr w:type="spellStart"/>
+      <w:r>
+        <w:t>minimax</w:t>
+      </w:r>
+      <w:proofErr w:type="spellEnd"/>
       <w:r>
         <w:t>.</w:t>
       </w:r>
-      <w:proofErr w:type="gramEnd"/>
     </w:p>
     <w:p>
       <w:pPr>
@@ -5052,7 +5039,7 @@
       <w:pPr>
         <w:pStyle w:val="Ttulo2"/>
       </w:pPr>
-      <w:bookmarkStart w:id="9" w:name="_Toc227594645"/>
+      <w:bookmarkStart w:id="9" w:name="_Toc227607956"/>
       <w:r>
         <w:t>utils.pl</w:t>
       </w:r>
@@ -5552,7 +5539,7 @@
       <w:pPr>
         <w:pStyle w:val="Ttulo2"/>
       </w:pPr>
-      <w:bookmarkStart w:id="10" w:name="_Toc227594646"/>
+      <w:bookmarkStart w:id="10" w:name="_Toc227607957"/>
       <w:r>
         <w:t>replace.pl</w:t>
       </w:r>
@@ -5583,7 +5570,7 @@
       <w:pPr>
         <w:pStyle w:val="Ttulo2"/>
       </w:pPr>
-      <w:bookmarkStart w:id="11" w:name="_Toc227594647"/>
+      <w:bookmarkStart w:id="11" w:name="_Toc227607958"/>
       <w:r>
         <w:t>print.pl</w:t>
       </w:r>
@@ -5635,7 +5622,7 @@
       <w:pPr>
         <w:pStyle w:val="Ttulo1"/>
       </w:pPr>
-      <w:bookmarkStart w:id="12" w:name="_Toc227594648"/>
+      <w:bookmarkStart w:id="12" w:name="_Toc227607959"/>
       <w:r>
         <w:lastRenderedPageBreak/>
         <w:t xml:space="preserve">Algoritmos de Pesquisa </w:t>
@@ -5651,7 +5638,7 @@
       <w:pPr>
         <w:pStyle w:val="Ttulo2"/>
       </w:pPr>
-      <w:bookmarkStart w:id="13" w:name="_Toc227594649"/>
+      <w:bookmarkStart w:id="13" w:name="_Toc227607960"/>
       <w:proofErr w:type="spellStart"/>
       <w:r>
         <w:t>Minimax</w:t>
@@ -5818,7 +5805,7 @@
       <w:pPr>
         <w:pStyle w:val="Ttulo2"/>
       </w:pPr>
-      <w:bookmarkStart w:id="14" w:name="_Toc227594650"/>
+      <w:bookmarkStart w:id="14" w:name="_Toc227607961"/>
       <w:proofErr w:type="spellStart"/>
       <w:r>
         <w:t>Alfa</w:t>
@@ -6033,7 +6020,7 @@
       <w:pPr>
         <w:pStyle w:val="Ttulo3"/>
       </w:pPr>
-      <w:bookmarkStart w:id="15" w:name="_Toc227594651"/>
+      <w:bookmarkStart w:id="15" w:name="_Toc227607962"/>
       <w:r>
         <w:t>Função de Avaliação Estática</w:t>
       </w:r>
@@ -6153,7 +6140,7 @@
       <w:pPr>
         <w:pStyle w:val="Ttulo2"/>
       </w:pPr>
-      <w:bookmarkStart w:id="16" w:name="_Toc227594652"/>
+      <w:bookmarkStart w:id="16" w:name="_Toc227607963"/>
       <w:r>
         <w:t xml:space="preserve">Comparação </w:t>
       </w:r>
@@ -6192,24 +6179,14 @@
       <w:r>
         <w:t xml:space="preserve">Tabela </w:t>
       </w:r>
-      <w:r>
-        <w:fldChar w:fldCharType="begin"/>
-      </w:r>
-      <w:r>
-        <w:instrText xml:space="preserve"> SEQ Tabela \* ARABIC </w:instrText>
-      </w:r>
-      <w:r>
-        <w:fldChar w:fldCharType="separate"/>
-      </w:r>
-      <w:r>
-        <w:rPr>
-          <w:noProof/>
-        </w:rPr>
-        <w:t>2</w:t>
-      </w:r>
-      <w:r>
-        <w:fldChar w:fldCharType="end"/>
-      </w:r>
+      <w:fldSimple w:instr=" SEQ Tabela \* ARABIC ">
+        <w:r>
+          <w:rPr>
+            <w:noProof/>
+          </w:rPr>
+          <w:t>2</w:t>
+        </w:r>
+      </w:fldSimple>
       <w:r>
         <w:t xml:space="preserve"> Comparação</w:t>
       </w:r>
@@ -6559,7 +6536,7 @@
       <w:pPr>
         <w:pStyle w:val="Ttulo1"/>
       </w:pPr>
-      <w:bookmarkStart w:id="18" w:name="_Toc227594653"/>
+      <w:bookmarkStart w:id="18" w:name="_Toc227607964"/>
       <w:r>
         <w:lastRenderedPageBreak/>
         <w:t>Avaliação Experimental</w:t>
@@ -6570,7 +6547,7 @@
       <w:pPr>
         <w:pStyle w:val="Ttulo2"/>
       </w:pPr>
-      <w:bookmarkStart w:id="19" w:name="_Toc227594654"/>
+      <w:bookmarkStart w:id="19" w:name="_Toc227607965"/>
       <w:r>
         <w:t xml:space="preserve">Tabuleiro 3x3 </w:t>
       </w:r>
@@ -6663,7 +6640,7 @@
       <w:pPr>
         <w:pStyle w:val="Ttulo2"/>
       </w:pPr>
-      <w:bookmarkStart w:id="20" w:name="_Toc227594655"/>
+      <w:bookmarkStart w:id="20" w:name="_Toc227607966"/>
       <w:r>
         <w:t xml:space="preserve">Tabuleiro 6x6 </w:t>
       </w:r>
@@ -6776,7 +6753,7 @@
       <w:pPr>
         <w:pStyle w:val="Ttulo2"/>
       </w:pPr>
-      <w:bookmarkStart w:id="21" w:name="_Toc227594656"/>
+      <w:bookmarkStart w:id="21" w:name="_Toc227607967"/>
       <w:r>
         <w:t xml:space="preserve">Impacto da </w:t>
       </w:r>
@@ -6809,24 +6786,14 @@
       <w:r>
         <w:t xml:space="preserve">Tabela </w:t>
       </w:r>
-      <w:r>
-        <w:fldChar w:fldCharType="begin"/>
-      </w:r>
-      <w:r>
-        <w:instrText xml:space="preserve"> SEQ Tabela \* ARABIC </w:instrText>
-      </w:r>
-      <w:r>
-        <w:fldChar w:fldCharType="separate"/>
-      </w:r>
-      <w:r>
-        <w:rPr>
-          <w:noProof/>
-        </w:rPr>
-        <w:t>3</w:t>
-      </w:r>
-      <w:r>
-        <w:fldChar w:fldCharType="end"/>
-      </w:r>
+      <w:fldSimple w:instr=" SEQ Tabela \* ARABIC ">
+        <w:r>
+          <w:rPr>
+            <w:noProof/>
+          </w:rPr>
+          <w:t>3</w:t>
+        </w:r>
+      </w:fldSimple>
       <w:r>
         <w:t xml:space="preserve"> Tabela de profundidade/tempo tabuleiro 4x4 (melhor caso)</w:t>
       </w:r>
@@ -7056,35 +7023,16 @@
         <w:lastRenderedPageBreak/>
         <w:t xml:space="preserve">Tabela </w:t>
       </w:r>
-      <w:r>
-        <w:fldChar w:fldCharType="begin"/>
-      </w:r>
-      <w:r>
-        <w:instrText xml:space="preserve"> SEQ Tabela \* ARABIC </w:instrText>
-      </w:r>
-      <w:r>
-        <w:fldChar w:fldCharType="separate"/>
-      </w:r>
-      <w:r>
-        <w:rPr>
-          <w:noProof/>
-        </w:rPr>
-        <w:t>4</w:t>
-      </w:r>
-      <w:r>
-        <w:fldChar w:fldCharType="end"/>
-      </w:r>
-      <w:r>
-        <w:t xml:space="preserve"> Tabela </w:t>
-      </w:r>
-      <w:r>
-        <w:t>de profundidade/tempo tabuleiro 4x4 (</w:t>
-      </w:r>
-      <w:r>
-        <w:t>pior</w:t>
-      </w:r>
-      <w:r>
-        <w:t xml:space="preserve"> caso)</w:t>
+      <w:fldSimple w:instr=" SEQ Tabela \* ARABIC ">
+        <w:r>
+          <w:rPr>
+            <w:noProof/>
+          </w:rPr>
+          <w:t>4</w:t>
+        </w:r>
+      </w:fldSimple>
+      <w:r>
+        <w:t xml:space="preserve"> Tabela de profundidade/tempo tabuleiro 4x4 (pior caso)</w:t>
       </w:r>
     </w:p>
     <w:tbl>
@@ -7162,10 +7110,7 @@
               <w:cnfStyle w:val="000000100000" w:firstRow="0" w:lastRow="0" w:firstColumn="0" w:lastColumn="0" w:oddVBand="0" w:evenVBand="0" w:oddHBand="1" w:evenHBand="0" w:firstRowFirstColumn="0" w:firstRowLastColumn="0" w:lastRowFirstColumn="0" w:lastRowLastColumn="0"/>
             </w:pPr>
             <w:r>
-              <w:t>0.</w:t>
-            </w:r>
-            <w:r>
-              <w:t>4</w:t>
+              <w:t>0.4</w:t>
             </w:r>
           </w:p>
         </w:tc>
@@ -7307,6 +7252,9 @@
     </w:tbl>
     <w:p/>
     <w:p>
+      <w:pPr>
+        <w:keepNext/>
+      </w:pPr>
       <w:r>
         <w:rPr>
           <w:noProof/>
@@ -7356,8 +7304,38 @@
       </w:r>
     </w:p>
     <w:p>
-      <w:r>
-        <w:t xml:space="preserve">Concluiu-se que a profundidade 3 representa um bom compromisso entre qualidade e velocidade para o tabuleiro; ressalta-se que o desempenho do algoritmo </w:t>
+      <w:pPr>
+        <w:pStyle w:val="Legenda"/>
+      </w:pPr>
+      <w:r>
+        <w:t xml:space="preserve">Figura </w:t>
+      </w:r>
+      <w:fldSimple w:instr=" SEQ Figura \* ARABIC ">
+        <w:r>
+          <w:rPr>
+            <w:noProof/>
+          </w:rPr>
+          <w:t>1</w:t>
+        </w:r>
+      </w:fldSimple>
+      <w:r>
+        <w:t xml:space="preserve"> memória usada pelo </w:t>
+      </w:r>
+      <w:proofErr w:type="spellStart"/>
+      <w:r>
+        <w:t>prolog</w:t>
+      </w:r>
+      <w:proofErr w:type="spellEnd"/>
+    </w:p>
+    <w:p>
+      <w:r>
+        <w:t>Concluiu-se que a profundidade 3 representa um bom compromisso entre qualidade e velocidade para o tabuleiro</w:t>
+      </w:r>
+      <w:r>
+        <w:t xml:space="preserve">, </w:t>
+      </w:r>
+      <w:r>
+        <w:t xml:space="preserve">ressalta-se que o desempenho do algoritmo </w:t>
       </w:r>
       <w:r>
         <w:t xml:space="preserve">no pior caso </w:t>
@@ -7379,8 +7357,9 @@
       <w:pPr>
         <w:pStyle w:val="Ttulo2"/>
       </w:pPr>
-      <w:bookmarkStart w:id="22" w:name="_Toc227594657"/>
-      <w:r>
+      <w:bookmarkStart w:id="22" w:name="_Toc227607968"/>
+      <w:r>
+        <w:lastRenderedPageBreak/>
         <w:t>Testes</w:t>
       </w:r>
       <w:bookmarkEnd w:id="22"/>
@@ -7443,27 +7422,14 @@
       <w:r>
         <w:t xml:space="preserve">Figura </w:t>
       </w:r>
-      <w:r>
-        <w:fldChar w:fldCharType="begin"/>
-      </w:r>
-      <w:r>
-        <w:instrText xml:space="preserve"> SEQ Figura \* ARABIC </w:instrText>
-      </w:r>
-      <w:r>
-        <w:fldChar w:fldCharType="separate"/>
-      </w:r>
-      <w:r>
-        <w:rPr>
-          <w:noProof/>
-        </w:rPr>
-        <w:t>2</w:t>
-      </w:r>
-      <w:r>
-        <w:rPr>
-          <w:noProof/>
-        </w:rPr>
-        <w:fldChar w:fldCharType="end"/>
-      </w:r>
+      <w:fldSimple w:instr=" SEQ Figura \* ARABIC ">
+        <w:r>
+          <w:rPr>
+            <w:noProof/>
+          </w:rPr>
+          <w:t>2</w:t>
+        </w:r>
+      </w:fldSimple>
       <w:r>
         <w:t xml:space="preserve"> Vitória do </w:t>
       </w:r>
@@ -7533,27 +7499,14 @@
       <w:r>
         <w:t xml:space="preserve">Figura </w:t>
       </w:r>
-      <w:r>
-        <w:fldChar w:fldCharType="begin"/>
-      </w:r>
-      <w:r>
-        <w:instrText xml:space="preserve"> SEQ Figura \* ARABIC </w:instrText>
-      </w:r>
-      <w:r>
-        <w:fldChar w:fldCharType="separate"/>
-      </w:r>
-      <w:r>
-        <w:rPr>
-          <w:noProof/>
-        </w:rPr>
-        <w:t>3</w:t>
-      </w:r>
-      <w:r>
-        <w:rPr>
-          <w:noProof/>
-        </w:rPr>
-        <w:fldChar w:fldCharType="end"/>
-      </w:r>
+      <w:fldSimple w:instr=" SEQ Figura \* ARABIC ">
+        <w:r>
+          <w:rPr>
+            <w:noProof/>
+          </w:rPr>
+          <w:t>3</w:t>
+        </w:r>
+      </w:fldSimple>
       <w:r>
         <w:t xml:space="preserve"> vitória do </w:t>
       </w:r>
@@ -7619,27 +7572,14 @@
       <w:r>
         <w:t xml:space="preserve">Figura </w:t>
       </w:r>
-      <w:r>
-        <w:fldChar w:fldCharType="begin"/>
-      </w:r>
-      <w:r>
-        <w:instrText xml:space="preserve"> SEQ Figura \* ARABIC </w:instrText>
-      </w:r>
-      <w:r>
-        <w:fldChar w:fldCharType="separate"/>
-      </w:r>
-      <w:r>
-        <w:rPr>
-          <w:noProof/>
-        </w:rPr>
-        <w:t>4</w:t>
-      </w:r>
-      <w:r>
-        <w:rPr>
-          <w:noProof/>
-        </w:rPr>
-        <w:fldChar w:fldCharType="end"/>
-      </w:r>
+      <w:fldSimple w:instr=" SEQ Figura \* ARABIC ">
+        <w:r>
+          <w:rPr>
+            <w:noProof/>
+          </w:rPr>
+          <w:t>4</w:t>
+        </w:r>
+      </w:fldSimple>
       <w:r>
         <w:t xml:space="preserve"> Jogada </w:t>
       </w:r>
@@ -7712,27 +7652,14 @@
       <w:r>
         <w:t xml:space="preserve">Figura </w:t>
       </w:r>
-      <w:r>
-        <w:fldChar w:fldCharType="begin"/>
-      </w:r>
-      <w:r>
-        <w:instrText xml:space="preserve"> SEQ Figura \* ARABIC </w:instrText>
-      </w:r>
-      <w:r>
-        <w:fldChar w:fldCharType="separate"/>
-      </w:r>
-      <w:r>
-        <w:rPr>
-          <w:noProof/>
-        </w:rPr>
-        <w:t>5</w:t>
-      </w:r>
-      <w:r>
-        <w:rPr>
-          <w:noProof/>
-        </w:rPr>
-        <w:fldChar w:fldCharType="end"/>
-      </w:r>
+      <w:fldSimple w:instr=" SEQ Figura \* ARABIC ">
+        <w:r>
+          <w:rPr>
+            <w:noProof/>
+          </w:rPr>
+          <w:t>5</w:t>
+        </w:r>
+      </w:fldSimple>
       <w:r>
         <w:t xml:space="preserve"> Jogo perfeito por parte da AI parte 1</w:t>
       </w:r>
@@ -7792,27 +7719,14 @@
       <w:r>
         <w:t xml:space="preserve">Figura </w:t>
       </w:r>
-      <w:r>
-        <w:fldChar w:fldCharType="begin"/>
-      </w:r>
-      <w:r>
-        <w:instrText xml:space="preserve"> SEQ Figura \* ARABIC </w:instrText>
-      </w:r>
-      <w:r>
-        <w:fldChar w:fldCharType="separate"/>
-      </w:r>
-      <w:r>
-        <w:rPr>
-          <w:noProof/>
-        </w:rPr>
-        <w:t>6</w:t>
-      </w:r>
-      <w:r>
-        <w:rPr>
-          <w:noProof/>
-        </w:rPr>
-        <w:fldChar w:fldCharType="end"/>
-      </w:r>
+      <w:fldSimple w:instr=" SEQ Figura \* ARABIC ">
+        <w:r>
+          <w:rPr>
+            <w:noProof/>
+          </w:rPr>
+          <w:t>6</w:t>
+        </w:r>
+      </w:fldSimple>
       <w:r>
         <w:t xml:space="preserve"> </w:t>
       </w:r>
@@ -7886,27 +7800,14 @@
       <w:r>
         <w:t xml:space="preserve">Figura </w:t>
       </w:r>
-      <w:r>
-        <w:fldChar w:fldCharType="begin"/>
-      </w:r>
-      <w:r>
-        <w:instrText xml:space="preserve"> SEQ Figura \* ARABIC </w:instrText>
-      </w:r>
-      <w:r>
-        <w:fldChar w:fldCharType="separate"/>
-      </w:r>
-      <w:r>
-        <w:rPr>
-          <w:noProof/>
-        </w:rPr>
-        <w:t>7</w:t>
-      </w:r>
-      <w:r>
-        <w:rPr>
-          <w:noProof/>
-        </w:rPr>
-        <w:fldChar w:fldCharType="end"/>
-      </w:r>
+      <w:fldSimple w:instr=" SEQ Figura \* ARABIC ">
+        <w:r>
+          <w:rPr>
+            <w:noProof/>
+          </w:rPr>
+          <w:t>7</w:t>
+        </w:r>
+      </w:fldSimple>
       <w:r>
         <w:t xml:space="preserve"> </w:t>
       </w:r>
@@ -7980,27 +7881,14 @@
       <w:r>
         <w:t xml:space="preserve">Figura </w:t>
       </w:r>
-      <w:r>
-        <w:fldChar w:fldCharType="begin"/>
-      </w:r>
-      <w:r>
-        <w:instrText xml:space="preserve"> SEQ Figura \* ARABIC </w:instrText>
-      </w:r>
-      <w:r>
-        <w:fldChar w:fldCharType="separate"/>
-      </w:r>
-      <w:r>
-        <w:rPr>
-          <w:noProof/>
-        </w:rPr>
-        <w:t>8</w:t>
-      </w:r>
-      <w:r>
-        <w:rPr>
-          <w:noProof/>
-        </w:rPr>
-        <w:fldChar w:fldCharType="end"/>
-      </w:r>
+      <w:fldSimple w:instr=" SEQ Figura \* ARABIC ">
+        <w:r>
+          <w:rPr>
+            <w:noProof/>
+          </w:rPr>
+          <w:t>8</w:t>
+        </w:r>
+      </w:fldSimple>
       <w:r>
         <w:t xml:space="preserve"> </w:t>
       </w:r>
@@ -8073,27 +7961,14 @@
       <w:r>
         <w:t xml:space="preserve">Figura </w:t>
       </w:r>
-      <w:r>
-        <w:fldChar w:fldCharType="begin"/>
-      </w:r>
-      <w:r>
-        <w:instrText xml:space="preserve"> SEQ Figura \* ARABIC </w:instrText>
-      </w:r>
-      <w:r>
-        <w:fldChar w:fldCharType="separate"/>
-      </w:r>
-      <w:r>
-        <w:rPr>
-          <w:noProof/>
-        </w:rPr>
-        <w:t>9</w:t>
-      </w:r>
-      <w:r>
-        <w:rPr>
-          <w:noProof/>
-        </w:rPr>
-        <w:fldChar w:fldCharType="end"/>
-      </w:r>
+      <w:fldSimple w:instr=" SEQ Figura \* ARABIC ">
+        <w:r>
+          <w:rPr>
+            <w:noProof/>
+          </w:rPr>
+          <w:t>9</w:t>
+        </w:r>
+      </w:fldSimple>
       <w:r>
         <w:t xml:space="preserve"> </w:t>
       </w:r>
@@ -8169,27 +8044,14 @@
       <w:r>
         <w:t xml:space="preserve">Figura </w:t>
       </w:r>
-      <w:r>
-        <w:fldChar w:fldCharType="begin"/>
-      </w:r>
-      <w:r>
-        <w:instrText xml:space="preserve"> SEQ Figura \* ARABIC </w:instrText>
-      </w:r>
-      <w:r>
-        <w:fldChar w:fldCharType="separate"/>
-      </w:r>
-      <w:r>
-        <w:rPr>
-          <w:noProof/>
-        </w:rPr>
-        <w:t>10</w:t>
-      </w:r>
-      <w:r>
-        <w:rPr>
-          <w:noProof/>
-        </w:rPr>
-        <w:fldChar w:fldCharType="end"/>
-      </w:r>
+      <w:fldSimple w:instr=" SEQ Figura \* ARABIC ">
+        <w:r>
+          <w:rPr>
+            <w:noProof/>
+          </w:rPr>
+          <w:t>10</w:t>
+        </w:r>
+      </w:fldSimple>
       <w:r>
         <w:t xml:space="preserve"> </w:t>
       </w:r>
@@ -8259,27 +8121,14 @@
       <w:r>
         <w:t xml:space="preserve">Figura </w:t>
       </w:r>
-      <w:r>
-        <w:fldChar w:fldCharType="begin"/>
-      </w:r>
-      <w:r>
-        <w:instrText xml:space="preserve"> SEQ Figura \* ARABIC </w:instrText>
-      </w:r>
-      <w:r>
-        <w:fldChar w:fldCharType="separate"/>
-      </w:r>
-      <w:r>
-        <w:rPr>
-          <w:noProof/>
-        </w:rPr>
-        <w:t>11</w:t>
-      </w:r>
-      <w:r>
-        <w:rPr>
-          <w:noProof/>
-        </w:rPr>
-        <w:fldChar w:fldCharType="end"/>
-      </w:r>
+      <w:fldSimple w:instr=" SEQ Figura \* ARABIC ">
+        <w:r>
+          <w:rPr>
+            <w:noProof/>
+          </w:rPr>
+          <w:t>11</w:t>
+        </w:r>
+      </w:fldSimple>
       <w:r>
         <w:t xml:space="preserve"> </w:t>
       </w:r>
@@ -8355,27 +8204,14 @@
       <w:r>
         <w:t xml:space="preserve">Figura </w:t>
       </w:r>
-      <w:r>
-        <w:fldChar w:fldCharType="begin"/>
-      </w:r>
-      <w:r>
-        <w:instrText xml:space="preserve"> SEQ Figura \* ARABIC </w:instrText>
-      </w:r>
-      <w:r>
-        <w:fldChar w:fldCharType="separate"/>
-      </w:r>
-      <w:r>
-        <w:rPr>
-          <w:noProof/>
-        </w:rPr>
-        <w:t>12</w:t>
-      </w:r>
-      <w:r>
-        <w:rPr>
-          <w:noProof/>
-        </w:rPr>
-        <w:fldChar w:fldCharType="end"/>
-      </w:r>
+      <w:fldSimple w:instr=" SEQ Figura \* ARABIC ">
+        <w:r>
+          <w:rPr>
+            <w:noProof/>
+          </w:rPr>
+          <w:t>12</w:t>
+        </w:r>
+      </w:fldSimple>
       <w:r>
         <w:t xml:space="preserve"> </w:t>
       </w:r>
@@ -8421,7 +8257,7 @@
       <w:pPr>
         <w:pStyle w:val="Ttulo1"/>
       </w:pPr>
-      <w:bookmarkStart w:id="34" w:name="_Toc227594658"/>
+      <w:bookmarkStart w:id="34" w:name="_Toc227607969"/>
       <w:r>
         <w:lastRenderedPageBreak/>
         <w:t>Decisões de Design e Justificações</w:t>
@@ -8432,7 +8268,7 @@
       <w:pPr>
         <w:pStyle w:val="Ttulo2"/>
       </w:pPr>
-      <w:bookmarkStart w:id="35" w:name="_Toc227594659"/>
+      <w:bookmarkStart w:id="35" w:name="_Toc227607970"/>
       <w:r>
         <w:t>Separação modular do código</w:t>
       </w:r>
@@ -8480,7 +8316,7 @@
       <w:pPr>
         <w:pStyle w:val="Ttulo2"/>
       </w:pPr>
-      <w:bookmarkStart w:id="36" w:name="_Toc227594660"/>
+      <w:bookmarkStart w:id="36" w:name="_Toc227607971"/>
       <w:r>
         <w:t>Mobilidade como heurística de avaliação</w:t>
       </w:r>
@@ -8510,14 +8346,9 @@
     </w:p>
     <w:p>
       <w:pPr>
-        <w:ind w:left="360"/>
-      </w:pPr>
-    </w:p>
-    <w:p>
-      <w:pPr>
         <w:pStyle w:val="Ttulo2"/>
       </w:pPr>
-      <w:bookmarkStart w:id="37" w:name="_Toc227594661"/>
+      <w:bookmarkStart w:id="37" w:name="_Toc227607972"/>
       <w:r>
         <w:t>Profundidade de pesquisa a 3</w:t>
       </w:r>
@@ -8541,7 +8372,7 @@
       <w:pPr>
         <w:pStyle w:val="Ttulo2"/>
       </w:pPr>
-      <w:bookmarkStart w:id="38" w:name="_Toc227594662"/>
+      <w:bookmarkStart w:id="38" w:name="_Toc227607973"/>
       <w:r>
         <w:t>Validação tolerante das jogadas do utilizador</w:t>
       </w:r>
@@ -8567,7 +8398,7 @@
       <w:pPr>
         <w:pStyle w:val="Ttulo2"/>
       </w:pPr>
-      <w:bookmarkStart w:id="39" w:name="_Toc227594663"/>
+      <w:bookmarkStart w:id="39" w:name="_Toc227607974"/>
       <w:r>
         <w:t xml:space="preserve">Utilização de </w:t>
       </w:r>
@@ -8610,7 +8441,13 @@
       </w:r>
       <w:proofErr w:type="spellEnd"/>
       <w:r>
-        <w:t xml:space="preserve"> de forma puramente declarativa — o predicado </w:t>
+        <w:t xml:space="preserve"> de forma puramente declarativa</w:t>
+      </w:r>
+      <w:r>
+        <w:t xml:space="preserve">, </w:t>
+      </w:r>
+      <w:r>
+        <w:t xml:space="preserve">o predicado </w:t>
       </w:r>
       <w:proofErr w:type="spellStart"/>
       <w:r>
@@ -8649,7 +8486,6 @@
         </w:rPr>
       </w:pPr>
       <w:r>
-        <w:lastRenderedPageBreak/>
         <w:br w:type="page"/>
       </w:r>
     </w:p>
@@ -8657,7 +8493,7 @@
       <w:pPr>
         <w:pStyle w:val="Ttulo1"/>
       </w:pPr>
-      <w:bookmarkStart w:id="40" w:name="_Toc227594664"/>
+      <w:bookmarkStart w:id="40" w:name="_Toc227607975"/>
       <w:r>
         <w:lastRenderedPageBreak/>
         <w:t>Conclusão</w:t>
@@ -11028,6 +10864,7 @@
   <w:style w:type="character" w:default="1" w:styleId="Tipodeletrapredefinidodopargrafo">
     <w:name w:val="Default Paragraph Font"/>
     <w:uiPriority w:val="1"/>
+    <w:semiHidden/>
     <w:unhideWhenUsed/>
   </w:style>
   <w:style w:type="table" w:default="1" w:styleId="Tabelanormal">
@@ -12845,14 +12682,6 @@
 </file>
 
 <file path=customXml/item1.xml><?xml version="1.0" encoding="utf-8"?>
-<p:properties xmlns:p="http://schemas.microsoft.com/office/2006/metadata/properties" xmlns:xsi="http://www.w3.org/2001/XMLSchema-instance" xmlns:pc="http://schemas.microsoft.com/office/infopath/2007/PartnerControls">
-  <documentManagement>
-    <_activity xmlns="981c4c23-2796-4748-94e2-8d7accf3f3de" xsi:nil="true"/>
-  </documentManagement>
-</p:properties>
-</file>
-
-<file path=customXml/item2.xml><?xml version="1.0" encoding="utf-8"?>
 <?mso-contentType ?>
 <FormTemplates xmlns="http://schemas.microsoft.com/sharepoint/v3/contenttype/forms">
   <Display>DocumentLibraryForm</Display>
@@ -12861,7 +12690,137 @@
 </FormTemplates>
 </file>
 
+<file path=customXml/item2.xml><?xml version="1.0" encoding="utf-8"?>
+<p:properties xmlns:p="http://schemas.microsoft.com/office/2006/metadata/properties" xmlns:xsi="http://www.w3.org/2001/XMLSchema-instance" xmlns:pc="http://schemas.microsoft.com/office/infopath/2007/PartnerControls">
+  <documentManagement>
+    <_activity xmlns="981c4c23-2796-4748-94e2-8d7accf3f3de" xsi:nil="true"/>
+  </documentManagement>
+</p:properties>
+</file>
+
 <file path=customXml/item3.xml><?xml version="1.0" encoding="utf-8"?>
+<b:Sources xmlns:b="http://schemas.openxmlformats.org/officeDocument/2006/bibliography" xmlns="http://schemas.openxmlformats.org/officeDocument/2006/bibliography" SelectedStyle="\IEEE2006OfficeOnline.xsl" StyleName="IEEE" Version="2006">
+  <b:Source>
+    <b:Tag>Hua25</b:Tag>
+    <b:SourceType>InternetSite</b:SourceType>
+    <b:Guid>{976125DC-139D-4339-9CC5-C531F6280531}</b:Guid>
+    <b:Author>
+      <b:Author>
+        <b:NameList>
+          <b:Person>
+            <b:Last>Huang</b:Last>
+            <b:First>Shih-Lun</b:First>
+            <b:Middle>Wu</b:Middle>
+          </b:Person>
+          <b:Person>
+            <b:Last>Kim</b:Last>
+            <b:First>Yoon</b:First>
+          </b:Person>
+          <b:Person>
+            <b:Last>Anna</b:Last>
+            <b:First>Cheng-Zhi</b:First>
+          </b:Person>
+        </b:NameList>
+      </b:Author>
+    </b:Author>
+    <b:Title>Midi-LLM: Adapting Large Language Models for Text-to-MIDI Music Generation</b:Title>
+    <b:Year>2025</b:Year>
+    <b:Month>Novembro</b:Month>
+    <b:Day>6</b:Day>
+    <b:YearAccessed>2026</b:YearAccessed>
+    <b:MonthAccessed>Março</b:MonthAccessed>
+    <b:DayAccessed>1</b:DayAccessed>
+    <b:URL>https://arxiv.org/html/2511.03942v1</b:URL>
+    <b:RefOrder>2</b:RefOrder>
+  </b:Source>
+  <b:Source>
+    <b:Tag>Jef24</b:Tag>
+    <b:SourceType>InternetSite</b:SourceType>
+    <b:Guid>{D3B896EF-CF34-4628-B958-DF2AE3C160D7}</b:Guid>
+    <b:Author>
+      <b:Author>
+        <b:NameList>
+          <b:Person>
+            <b:Last>Hollan</b:Last>
+            <b:First>Jeff</b:First>
+          </b:Person>
+        </b:NameList>
+      </b:Author>
+    </b:Author>
+    <b:Title>Why Python is the language of choice for AI</b:Title>
+    <b:Year>2024</b:Year>
+    <b:Month>Outubro</b:Month>
+    <b:Day>22</b:Day>
+    <b:YearAccessed>2026</b:YearAccessed>
+    <b:MonthAccessed>Março</b:MonthAccessed>
+    <b:DayAccessed>1</b:DayAccessed>
+    <b:URL>https://www.infoworld.com/article/3567094/why-python-is-the-language-of-choice-for-ai.html</b:URL>
+    <b:RefOrder>3</b:RefOrder>
+  </b:Source>
+  <b:Source>
+    <b:Tag>Pre24</b:Tag>
+    <b:SourceType>InternetSite</b:SourceType>
+    <b:Guid>{D02A13C0-0F61-4854-AFBA-1046C23626B4}</b:Guid>
+    <b:Author>
+      <b:Author>
+        <b:NameList>
+          <b:Person>
+            <b:Last>Joshi</b:Last>
+            <b:First>Prerak</b:First>
+          </b:Person>
+        </b:NameList>
+      </b:Author>
+    </b:Author>
+    <b:Title>From Noise to Music: Analyzing Audio with Python and Librosa</b:Title>
+    <b:Year>2024</b:Year>
+    <b:Month>Agosto</b:Month>
+    <b:Day>6</b:Day>
+    <b:YearAccessed>2026</b:YearAccessed>
+    <b:MonthAccessed>Março</b:MonthAccessed>
+    <b:DayAccessed>1</b:DayAccessed>
+    <b:URL>https://medium.com/@joshiprerak123/from-noise-to-music-analyzing-audio-with-python-and-librosa-4a4ea5b1b805</b:URL>
+    <b:RefOrder>5</b:RefOrder>
+  </b:Source>
+  <b:Source>
+    <b:Tag>Poi26</b:Tag>
+    <b:SourceType>InternetSite</b:SourceType>
+    <b:Guid>{9ED6712E-2095-49BE-8E78-93C9E0D8F048}</b:Guid>
+    <b:Title>Why Every Music Producer Faces Challenges and How to Beat Them </b:Title>
+    <b:InternetSiteTitle>Why Every Music Producer Faces Challenges and How to Beat Them </b:InternetSiteTitle>
+    <b:Year>2025</b:Year>
+    <b:Month>Maio</b:Month>
+    <b:Day>29</b:Day>
+    <b:URL>https://www.pointblankmusicschool.com/blog/why-every-music-producer-faces-challenges-and-how-to-beat-them/</b:URL>
+    <b:YearAccessed>2026</b:YearAccessed>
+    <b:MonthAccessed>Março</b:MonthAccessed>
+    <b:DayAccessed>1</b:DayAccessed>
+    <b:Author>
+      <b:Author>
+        <b:NameList>
+          <b:Person>
+            <b:Last>Johncy</b:Last>
+            <b:First>Joel</b:First>
+          </b:Person>
+        </b:NameList>
+      </b:Author>
+    </b:Author>
+    <b:RefOrder>1</b:RefOrder>
+  </b:Source>
+  <b:Source>
+    <b:Tag>Ope26</b:Tag>
+    <b:SourceType>InternetSite</b:SourceType>
+    <b:Guid>{D3CE3F9F-0A98-484A-A401-A6F90B2C5D24}</b:Guid>
+    <b:Title>Open Music Foundation Models for Full-Song Generation</b:Title>
+    <b:YearAccessed>2026</b:YearAccessed>
+    <b:MonthAccessed>Março</b:MonthAccessed>
+    <b:DayAccessed>1</b:DayAccessed>
+    <b:URL>https://map-yue.github.io/</b:URL>
+    <b:RefOrder>4</b:RefOrder>
+  </b:Source>
+</b:Sources>
+</file>
+
+<file path=customXml/item4.xml><?xml version="1.0" encoding="utf-8"?>
 <ct:contentTypeSchema xmlns:ct="http://schemas.microsoft.com/office/2006/metadata/contentType" xmlns:ma="http://schemas.microsoft.com/office/2006/metadata/properties/metaAttributes" ct:_="" ma:_="" ma:contentTypeName="Document" ma:contentTypeID="0x01010067E12537DF53554BA462E9C17AE4DD7D" ma:contentTypeVersion="13" ma:contentTypeDescription="Create a new document." ma:contentTypeScope="" ma:versionID="61807ebd70917ce0e3d6bdcfc5ca93dd">
   <xsd:schema xmlns:xsd="http://www.w3.org/2001/XMLSchema" xmlns:xs="http://www.w3.org/2001/XMLSchema" xmlns:p="http://schemas.microsoft.com/office/2006/metadata/properties" xmlns:ns3="981c4c23-2796-4748-94e2-8d7accf3f3de" xmlns:ns4="f6565849-4b43-4765-9526-99799207c62b" targetNamespace="http://schemas.microsoft.com/office/2006/metadata/properties" ma:root="true" ma:fieldsID="f66a4a3034da67298341929f499f63a7" ns3:_="" ns4:_="">
     <xsd:import namespace="981c4c23-2796-4748-94e2-8d7accf3f3de"/>
@@ -13080,129 +13039,15 @@
 </ct:contentTypeSchema>
 </file>
 
-<file path=customXml/item4.xml><?xml version="1.0" encoding="utf-8"?>
-<b:Sources xmlns:b="http://schemas.openxmlformats.org/officeDocument/2006/bibliography" xmlns="http://schemas.openxmlformats.org/officeDocument/2006/bibliography" SelectedStyle="\IEEE2006OfficeOnline.xsl" StyleName="IEEE" Version="2006">
-  <b:Source>
-    <b:Tag>Hua25</b:Tag>
-    <b:SourceType>InternetSite</b:SourceType>
-    <b:Guid>{976125DC-139D-4339-9CC5-C531F6280531}</b:Guid>
-    <b:Author>
-      <b:Author>
-        <b:NameList>
-          <b:Person>
-            <b:Last>Huang</b:Last>
-            <b:First>Shih-Lun</b:First>
-            <b:Middle>Wu</b:Middle>
-          </b:Person>
-          <b:Person>
-            <b:Last>Kim</b:Last>
-            <b:First>Yoon</b:First>
-          </b:Person>
-          <b:Person>
-            <b:Last>Anna</b:Last>
-            <b:First>Cheng-Zhi</b:First>
-          </b:Person>
-        </b:NameList>
-      </b:Author>
-    </b:Author>
-    <b:Title>Midi-LLM: Adapting Large Language Models for Text-to-MIDI Music Generation</b:Title>
-    <b:Year>2025</b:Year>
-    <b:Month>Novembro</b:Month>
-    <b:Day>6</b:Day>
-    <b:YearAccessed>2026</b:YearAccessed>
-    <b:MonthAccessed>Março</b:MonthAccessed>
-    <b:DayAccessed>1</b:DayAccessed>
-    <b:URL>https://arxiv.org/html/2511.03942v1</b:URL>
-    <b:RefOrder>2</b:RefOrder>
-  </b:Source>
-  <b:Source>
-    <b:Tag>Jef24</b:Tag>
-    <b:SourceType>InternetSite</b:SourceType>
-    <b:Guid>{D3B896EF-CF34-4628-B958-DF2AE3C160D7}</b:Guid>
-    <b:Author>
-      <b:Author>
-        <b:NameList>
-          <b:Person>
-            <b:Last>Hollan</b:Last>
-            <b:First>Jeff</b:First>
-          </b:Person>
-        </b:NameList>
-      </b:Author>
-    </b:Author>
-    <b:Title>Why Python is the language of choice for AI</b:Title>
-    <b:Year>2024</b:Year>
-    <b:Month>Outubro</b:Month>
-    <b:Day>22</b:Day>
-    <b:YearAccessed>2026</b:YearAccessed>
-    <b:MonthAccessed>Março</b:MonthAccessed>
-    <b:DayAccessed>1</b:DayAccessed>
-    <b:URL>https://www.infoworld.com/article/3567094/why-python-is-the-language-of-choice-for-ai.html</b:URL>
-    <b:RefOrder>3</b:RefOrder>
-  </b:Source>
-  <b:Source>
-    <b:Tag>Pre24</b:Tag>
-    <b:SourceType>InternetSite</b:SourceType>
-    <b:Guid>{D02A13C0-0F61-4854-AFBA-1046C23626B4}</b:Guid>
-    <b:Author>
-      <b:Author>
-        <b:NameList>
-          <b:Person>
-            <b:Last>Joshi</b:Last>
-            <b:First>Prerak</b:First>
-          </b:Person>
-        </b:NameList>
-      </b:Author>
-    </b:Author>
-    <b:Title>From Noise to Music: Analyzing Audio with Python and Librosa</b:Title>
-    <b:Year>2024</b:Year>
-    <b:Month>Agosto</b:Month>
-    <b:Day>6</b:Day>
-    <b:YearAccessed>2026</b:YearAccessed>
-    <b:MonthAccessed>Março</b:MonthAccessed>
-    <b:DayAccessed>1</b:DayAccessed>
-    <b:URL>https://medium.com/@joshiprerak123/from-noise-to-music-analyzing-audio-with-python-and-librosa-4a4ea5b1b805</b:URL>
-    <b:RefOrder>5</b:RefOrder>
-  </b:Source>
-  <b:Source>
-    <b:Tag>Poi26</b:Tag>
-    <b:SourceType>InternetSite</b:SourceType>
-    <b:Guid>{9ED6712E-2095-49BE-8E78-93C9E0D8F048}</b:Guid>
-    <b:Title>Why Every Music Producer Faces Challenges and How to Beat Them </b:Title>
-    <b:InternetSiteTitle>Why Every Music Producer Faces Challenges and How to Beat Them </b:InternetSiteTitle>
-    <b:Year>2025</b:Year>
-    <b:Month>Maio</b:Month>
-    <b:Day>29</b:Day>
-    <b:URL>https://www.pointblankmusicschool.com/blog/why-every-music-producer-faces-challenges-and-how-to-beat-them/</b:URL>
-    <b:YearAccessed>2026</b:YearAccessed>
-    <b:MonthAccessed>Março</b:MonthAccessed>
-    <b:DayAccessed>1</b:DayAccessed>
-    <b:Author>
-      <b:Author>
-        <b:NameList>
-          <b:Person>
-            <b:Last>Johncy</b:Last>
-            <b:First>Joel</b:First>
-          </b:Person>
-        </b:NameList>
-      </b:Author>
-    </b:Author>
-    <b:RefOrder>1</b:RefOrder>
-  </b:Source>
-  <b:Source>
-    <b:Tag>Ope26</b:Tag>
-    <b:SourceType>InternetSite</b:SourceType>
-    <b:Guid>{D3CE3F9F-0A98-484A-A401-A6F90B2C5D24}</b:Guid>
-    <b:Title>Open Music Foundation Models for Full-Song Generation</b:Title>
-    <b:YearAccessed>2026</b:YearAccessed>
-    <b:MonthAccessed>Março</b:MonthAccessed>
-    <b:DayAccessed>1</b:DayAccessed>
-    <b:URL>https://map-yue.github.io/</b:URL>
-    <b:RefOrder>4</b:RefOrder>
-  </b:Source>
-</b:Sources>
+<file path=customXml/itemProps1.xml><?xml version="1.0" encoding="utf-8"?>
+<ds:datastoreItem xmlns:ds="http://schemas.openxmlformats.org/officeDocument/2006/customXml" ds:itemID="{923D4A1E-FA9C-4C3F-92E8-29DDFE6DC75E}">
+  <ds:schemaRefs>
+    <ds:schemaRef ds:uri="http://schemas.microsoft.com/sharepoint/v3/contenttype/forms"/>
+  </ds:schemaRefs>
+</ds:datastoreItem>
 </file>
 
-<file path=customXml/itemProps1.xml><?xml version="1.0" encoding="utf-8"?>
+<file path=customXml/itemProps2.xml><?xml version="1.0" encoding="utf-8"?>
 <ds:datastoreItem xmlns:ds="http://schemas.openxmlformats.org/officeDocument/2006/customXml" ds:itemID="{FB97D690-244D-4BBB-BD3E-E6205B378795}">
   <ds:schemaRefs>
     <ds:schemaRef ds:uri="http://schemas.microsoft.com/office/2006/metadata/properties"/>
@@ -13212,15 +13057,15 @@
 </ds:datastoreItem>
 </file>
 
-<file path=customXml/itemProps2.xml><?xml version="1.0" encoding="utf-8"?>
-<ds:datastoreItem xmlns:ds="http://schemas.openxmlformats.org/officeDocument/2006/customXml" ds:itemID="{923D4A1E-FA9C-4C3F-92E8-29DDFE6DC75E}">
+<file path=customXml/itemProps3.xml><?xml version="1.0" encoding="utf-8"?>
+<ds:datastoreItem xmlns:ds="http://schemas.openxmlformats.org/officeDocument/2006/customXml" ds:itemID="{59061991-FBDA-4CF2-94FB-0B25874268C6}">
   <ds:schemaRefs>
-    <ds:schemaRef ds:uri="http://schemas.microsoft.com/sharepoint/v3/contenttype/forms"/>
+    <ds:schemaRef ds:uri="http://schemas.openxmlformats.org/officeDocument/2006/bibliography"/>
   </ds:schemaRefs>
 </ds:datastoreItem>
 </file>
 
-<file path=customXml/itemProps3.xml><?xml version="1.0" encoding="utf-8"?>
+<file path=customXml/itemProps4.xml><?xml version="1.0" encoding="utf-8"?>
 <ds:datastoreItem xmlns:ds="http://schemas.openxmlformats.org/officeDocument/2006/customXml" ds:itemID="{F7CCB377-ED3E-4432-BA7C-A574A0E6D2A6}">
   <ds:schemaRefs>
     <ds:schemaRef ds:uri="http://schemas.microsoft.com/office/2006/metadata/contentType"/>
@@ -13237,12 +13082,4 @@
     <ds:schemaRef ds:uri="http://schemas.microsoft.com/internal/obd"/>
   </ds:schemaRefs>
 </ds:datastoreItem>
-</file>
-
-<file path=customXml/itemProps4.xml><?xml version="1.0" encoding="utf-8"?>
-<ds:datastoreItem xmlns:ds="http://schemas.openxmlformats.org/officeDocument/2006/customXml" ds:itemID="{59061991-FBDA-4CF2-94FB-0B25874268C6}">
-  <ds:schemaRefs>
-    <ds:schemaRef ds:uri="http://schemas.openxmlformats.org/officeDocument/2006/bibliography"/>
-  </ds:schemaRefs>
-</ds:datastoreItem>
 </file>
</xml_diff>

<commit_message>
add new sections after teacher feedback
</commit_message>
<xml_diff>
--- a/Relatório ISOLA Prolog.docx
+++ b/Relatório ISOLA Prolog.docx
@@ -498,7 +498,7 @@
           <w:r>
             <w:fldChar w:fldCharType="separate"/>
           </w:r>
-          <w:hyperlink w:anchor="_Toc227607949" w:history="1">
+          <w:hyperlink w:anchor="_Toc227618701" w:history="1">
             <w:r>
               <w:rPr>
                 <w:rStyle w:val="Hiperligao"/>
@@ -541,7 +541,7 @@
                 <w:noProof/>
                 <w:webHidden/>
               </w:rPr>
-              <w:instrText xml:space="preserve"> PAGEREF _Toc227607949 \h </w:instrText>
+              <w:instrText xml:space="preserve"> PAGEREF _Toc227618701 \h </w:instrText>
             </w:r>
             <w:r>
               <w:rPr>
@@ -586,7 +586,7 @@
               <w14:ligatures w14:val="standardContextual"/>
             </w:rPr>
           </w:pPr>
-          <w:hyperlink w:anchor="_Toc227607950" w:history="1">
+          <w:hyperlink w:anchor="_Toc227618702" w:history="1">
             <w:r>
               <w:rPr>
                 <w:rStyle w:val="Hiperligao"/>
@@ -629,7 +629,7 @@
                 <w:noProof/>
                 <w:webHidden/>
               </w:rPr>
-              <w:instrText xml:space="preserve"> PAGEREF _Toc227607950 \h </w:instrText>
+              <w:instrText xml:space="preserve"> PAGEREF _Toc227618702 \h </w:instrText>
             </w:r>
             <w:r>
               <w:rPr>
@@ -674,7 +674,7 @@
               <w14:ligatures w14:val="standardContextual"/>
             </w:rPr>
           </w:pPr>
-          <w:hyperlink w:anchor="_Toc227607951" w:history="1">
+          <w:hyperlink w:anchor="_Toc227618703" w:history="1">
             <w:r>
               <w:rPr>
                 <w:rStyle w:val="Hiperligao"/>
@@ -717,7 +717,7 @@
                 <w:noProof/>
                 <w:webHidden/>
               </w:rPr>
-              <w:instrText xml:space="preserve"> PAGEREF _Toc227607951 \h </w:instrText>
+              <w:instrText xml:space="preserve"> PAGEREF _Toc227618703 \h </w:instrText>
             </w:r>
             <w:r>
               <w:rPr>
@@ -762,7 +762,7 @@
               <w14:ligatures w14:val="standardContextual"/>
             </w:rPr>
           </w:pPr>
-          <w:hyperlink w:anchor="_Toc227607952" w:history="1">
+          <w:hyperlink w:anchor="_Toc227618704" w:history="1">
             <w:r>
               <w:rPr>
                 <w:rStyle w:val="Hiperligao"/>
@@ -805,7 +805,7 @@
                 <w:noProof/>
                 <w:webHidden/>
               </w:rPr>
-              <w:instrText xml:space="preserve"> PAGEREF _Toc227607952 \h </w:instrText>
+              <w:instrText xml:space="preserve"> PAGEREF _Toc227618704 \h </w:instrText>
             </w:r>
             <w:r>
               <w:rPr>
@@ -850,7 +850,7 @@
               <w14:ligatures w14:val="standardContextual"/>
             </w:rPr>
           </w:pPr>
-          <w:hyperlink w:anchor="_Toc227607953" w:history="1">
+          <w:hyperlink w:anchor="_Toc227618705" w:history="1">
             <w:r>
               <w:rPr>
                 <w:rStyle w:val="Hiperligao"/>
@@ -893,7 +893,7 @@
                 <w:noProof/>
                 <w:webHidden/>
               </w:rPr>
-              <w:instrText xml:space="preserve"> PAGEREF _Toc227607953 \h </w:instrText>
+              <w:instrText xml:space="preserve"> PAGEREF _Toc227618705 \h </w:instrText>
             </w:r>
             <w:r>
               <w:rPr>
@@ -938,7 +938,7 @@
               <w14:ligatures w14:val="standardContextual"/>
             </w:rPr>
           </w:pPr>
-          <w:hyperlink w:anchor="_Toc227607954" w:history="1">
+          <w:hyperlink w:anchor="_Toc227618706" w:history="1">
             <w:r>
               <w:rPr>
                 <w:rStyle w:val="Hiperligao"/>
@@ -981,7 +981,7 @@
                 <w:noProof/>
                 <w:webHidden/>
               </w:rPr>
-              <w:instrText xml:space="preserve"> PAGEREF _Toc227607954 \h </w:instrText>
+              <w:instrText xml:space="preserve"> PAGEREF _Toc227618706 \h </w:instrText>
             </w:r>
             <w:r>
               <w:rPr>
@@ -1026,7 +1026,7 @@
               <w14:ligatures w14:val="standardContextual"/>
             </w:rPr>
           </w:pPr>
-          <w:hyperlink w:anchor="_Toc227607955" w:history="1">
+          <w:hyperlink w:anchor="_Toc227618707" w:history="1">
             <w:r>
               <w:rPr>
                 <w:rStyle w:val="Hiperligao"/>
@@ -1069,7 +1069,7 @@
                 <w:noProof/>
                 <w:webHidden/>
               </w:rPr>
-              <w:instrText xml:space="preserve"> PAGEREF _Toc227607955 \h </w:instrText>
+              <w:instrText xml:space="preserve"> PAGEREF _Toc227618707 \h </w:instrText>
             </w:r>
             <w:r>
               <w:rPr>
@@ -1114,7 +1114,7 @@
               <w14:ligatures w14:val="standardContextual"/>
             </w:rPr>
           </w:pPr>
-          <w:hyperlink w:anchor="_Toc227607956" w:history="1">
+          <w:hyperlink w:anchor="_Toc227618708" w:history="1">
             <w:r>
               <w:rPr>
                 <w:rStyle w:val="Hiperligao"/>
@@ -1157,7 +1157,7 @@
                 <w:noProof/>
                 <w:webHidden/>
               </w:rPr>
-              <w:instrText xml:space="preserve"> PAGEREF _Toc227607956 \h </w:instrText>
+              <w:instrText xml:space="preserve"> PAGEREF _Toc227618708 \h </w:instrText>
             </w:r>
             <w:r>
               <w:rPr>
@@ -1202,7 +1202,7 @@
               <w14:ligatures w14:val="standardContextual"/>
             </w:rPr>
           </w:pPr>
-          <w:hyperlink w:anchor="_Toc227607957" w:history="1">
+          <w:hyperlink w:anchor="_Toc227618709" w:history="1">
             <w:r>
               <w:rPr>
                 <w:rStyle w:val="Hiperligao"/>
@@ -1245,7 +1245,7 @@
                 <w:noProof/>
                 <w:webHidden/>
               </w:rPr>
-              <w:instrText xml:space="preserve"> PAGEREF _Toc227607957 \h </w:instrText>
+              <w:instrText xml:space="preserve"> PAGEREF _Toc227618709 \h </w:instrText>
             </w:r>
             <w:r>
               <w:rPr>
@@ -1290,7 +1290,7 @@
               <w14:ligatures w14:val="standardContextual"/>
             </w:rPr>
           </w:pPr>
-          <w:hyperlink w:anchor="_Toc227607958" w:history="1">
+          <w:hyperlink w:anchor="_Toc227618710" w:history="1">
             <w:r>
               <w:rPr>
                 <w:rStyle w:val="Hiperligao"/>
@@ -1333,7 +1333,7 @@
                 <w:noProof/>
                 <w:webHidden/>
               </w:rPr>
-              <w:instrText xml:space="preserve"> PAGEREF _Toc227607958 \h </w:instrText>
+              <w:instrText xml:space="preserve"> PAGEREF _Toc227618710 \h </w:instrText>
             </w:r>
             <w:r>
               <w:rPr>
@@ -1378,7 +1378,7 @@
               <w14:ligatures w14:val="standardContextual"/>
             </w:rPr>
           </w:pPr>
-          <w:hyperlink w:anchor="_Toc227607959" w:history="1">
+          <w:hyperlink w:anchor="_Toc227618711" w:history="1">
             <w:r>
               <w:rPr>
                 <w:rStyle w:val="Hiperligao"/>
@@ -1421,7 +1421,7 @@
                 <w:noProof/>
                 <w:webHidden/>
               </w:rPr>
-              <w:instrText xml:space="preserve"> PAGEREF _Toc227607959 \h </w:instrText>
+              <w:instrText xml:space="preserve"> PAGEREF _Toc227618711 \h </w:instrText>
             </w:r>
             <w:r>
               <w:rPr>
@@ -1466,7 +1466,7 @@
               <w14:ligatures w14:val="standardContextual"/>
             </w:rPr>
           </w:pPr>
-          <w:hyperlink w:anchor="_Toc227607960" w:history="1">
+          <w:hyperlink w:anchor="_Toc227618712" w:history="1">
             <w:r>
               <w:rPr>
                 <w:rStyle w:val="Hiperligao"/>
@@ -1509,7 +1509,7 @@
                 <w:noProof/>
                 <w:webHidden/>
               </w:rPr>
-              <w:instrText xml:space="preserve"> PAGEREF _Toc227607960 \h </w:instrText>
+              <w:instrText xml:space="preserve"> PAGEREF _Toc227618712 \h </w:instrText>
             </w:r>
             <w:r>
               <w:rPr>
@@ -1554,7 +1554,7 @@
               <w14:ligatures w14:val="standardContextual"/>
             </w:rPr>
           </w:pPr>
-          <w:hyperlink w:anchor="_Toc227607961" w:history="1">
+          <w:hyperlink w:anchor="_Toc227618713" w:history="1">
             <w:r>
               <w:rPr>
                 <w:rStyle w:val="Hiperligao"/>
@@ -1597,7 +1597,7 @@
                 <w:noProof/>
                 <w:webHidden/>
               </w:rPr>
-              <w:instrText xml:space="preserve"> PAGEREF _Toc227607961 \h </w:instrText>
+              <w:instrText xml:space="preserve"> PAGEREF _Toc227618713 \h </w:instrText>
             </w:r>
             <w:r>
               <w:rPr>
@@ -1642,7 +1642,7 @@
               <w14:ligatures w14:val="standardContextual"/>
             </w:rPr>
           </w:pPr>
-          <w:hyperlink w:anchor="_Toc227607962" w:history="1">
+          <w:hyperlink w:anchor="_Toc227618714" w:history="1">
             <w:r>
               <w:rPr>
                 <w:rStyle w:val="Hiperligao"/>
@@ -1685,7 +1685,7 @@
                 <w:noProof/>
                 <w:webHidden/>
               </w:rPr>
-              <w:instrText xml:space="preserve"> PAGEREF _Toc227607962 \h </w:instrText>
+              <w:instrText xml:space="preserve"> PAGEREF _Toc227618714 \h </w:instrText>
             </w:r>
             <w:r>
               <w:rPr>
@@ -1706,6 +1706,94 @@
                 <w:webHidden/>
               </w:rPr>
               <w:t>11</w:t>
+            </w:r>
+            <w:r>
+              <w:rPr>
+                <w:noProof/>
+                <w:webHidden/>
+              </w:rPr>
+              <w:fldChar w:fldCharType="end"/>
+            </w:r>
+          </w:hyperlink>
+        </w:p>
+        <w:p>
+          <w:pPr>
+            <w:pStyle w:val="ndice3"/>
+            <w:tabs>
+              <w:tab w:val="left" w:pos="1440"/>
+              <w:tab w:val="right" w:leader="dot" w:pos="9628"/>
+            </w:tabs>
+            <w:rPr>
+              <w:noProof/>
+              <w:kern w:val="2"/>
+              <w:lang w:eastAsia="pt-PT"/>
+              <w14:ligatures w14:val="standardContextual"/>
+            </w:rPr>
+          </w:pPr>
+          <w:hyperlink w:anchor="_Toc227618715" w:history="1">
+            <w:r>
+              <w:rPr>
+                <w:rStyle w:val="Hiperligao"/>
+                <w:noProof/>
+              </w:rPr>
+              <w:t>5.2.2</w:t>
+            </w:r>
+            <w:r>
+              <w:rPr>
+                <w:noProof/>
+                <w:kern w:val="2"/>
+                <w:lang w:eastAsia="pt-PT"/>
+                <w14:ligatures w14:val="standardContextual"/>
+              </w:rPr>
+              <w:tab/>
+            </w:r>
+            <w:r>
+              <w:rPr>
+                <w:rStyle w:val="Hiperligao"/>
+                <w:noProof/>
+              </w:rPr>
+              <w:t>Otimizações da Implementação</w:t>
+            </w:r>
+            <w:r>
+              <w:rPr>
+                <w:noProof/>
+                <w:webHidden/>
+              </w:rPr>
+              <w:tab/>
+            </w:r>
+            <w:r>
+              <w:rPr>
+                <w:noProof/>
+                <w:webHidden/>
+              </w:rPr>
+              <w:fldChar w:fldCharType="begin"/>
+            </w:r>
+            <w:r>
+              <w:rPr>
+                <w:noProof/>
+                <w:webHidden/>
+              </w:rPr>
+              <w:instrText xml:space="preserve"> PAGEREF _Toc227618715 \h </w:instrText>
+            </w:r>
+            <w:r>
+              <w:rPr>
+                <w:noProof/>
+                <w:webHidden/>
+              </w:rPr>
+            </w:r>
+            <w:r>
+              <w:rPr>
+                <w:noProof/>
+                <w:webHidden/>
+              </w:rPr>
+              <w:fldChar w:fldCharType="separate"/>
+            </w:r>
+            <w:r>
+              <w:rPr>
+                <w:noProof/>
+                <w:webHidden/>
+              </w:rPr>
+              <w:t>12</w:t>
             </w:r>
             <w:r>
               <w:rPr>
@@ -1730,7 +1818,7 @@
               <w14:ligatures w14:val="standardContextual"/>
             </w:rPr>
           </w:pPr>
-          <w:hyperlink w:anchor="_Toc227607963" w:history="1">
+          <w:hyperlink w:anchor="_Toc227618716" w:history="1">
             <w:r>
               <w:rPr>
                 <w:rStyle w:val="Hiperligao"/>
@@ -1773,7 +1861,7 @@
                 <w:noProof/>
                 <w:webHidden/>
               </w:rPr>
-              <w:instrText xml:space="preserve"> PAGEREF _Toc227607963 \h </w:instrText>
+              <w:instrText xml:space="preserve"> PAGEREF _Toc227618716 \h </w:instrText>
             </w:r>
             <w:r>
               <w:rPr>
@@ -1793,7 +1881,7 @@
                 <w:noProof/>
                 <w:webHidden/>
               </w:rPr>
-              <w:t>12</w:t>
+              <w:t>13</w:t>
             </w:r>
             <w:r>
               <w:rPr>
@@ -1818,7 +1906,7 @@
               <w14:ligatures w14:val="standardContextual"/>
             </w:rPr>
           </w:pPr>
-          <w:hyperlink w:anchor="_Toc227607964" w:history="1">
+          <w:hyperlink w:anchor="_Toc227618717" w:history="1">
             <w:r>
               <w:rPr>
                 <w:rStyle w:val="Hiperligao"/>
@@ -1861,7 +1949,7 @@
                 <w:noProof/>
                 <w:webHidden/>
               </w:rPr>
-              <w:instrText xml:space="preserve"> PAGEREF _Toc227607964 \h </w:instrText>
+              <w:instrText xml:space="preserve"> PAGEREF _Toc227618717 \h </w:instrText>
             </w:r>
             <w:r>
               <w:rPr>
@@ -1881,7 +1969,7 @@
                 <w:noProof/>
                 <w:webHidden/>
               </w:rPr>
-              <w:t>13</w:t>
+              <w:t>14</w:t>
             </w:r>
             <w:r>
               <w:rPr>
@@ -1906,7 +1994,7 @@
               <w14:ligatures w14:val="standardContextual"/>
             </w:rPr>
           </w:pPr>
-          <w:hyperlink w:anchor="_Toc227607965" w:history="1">
+          <w:hyperlink w:anchor="_Toc227618718" w:history="1">
             <w:r>
               <w:rPr>
                 <w:rStyle w:val="Hiperligao"/>
@@ -1949,7 +2037,7 @@
                 <w:noProof/>
                 <w:webHidden/>
               </w:rPr>
-              <w:instrText xml:space="preserve"> PAGEREF _Toc227607965 \h </w:instrText>
+              <w:instrText xml:space="preserve"> PAGEREF _Toc227618718 \h </w:instrText>
             </w:r>
             <w:r>
               <w:rPr>
@@ -1969,7 +2057,7 @@
                 <w:noProof/>
                 <w:webHidden/>
               </w:rPr>
-              <w:t>13</w:t>
+              <w:t>14</w:t>
             </w:r>
             <w:r>
               <w:rPr>
@@ -1994,7 +2082,7 @@
               <w14:ligatures w14:val="standardContextual"/>
             </w:rPr>
           </w:pPr>
-          <w:hyperlink w:anchor="_Toc227607966" w:history="1">
+          <w:hyperlink w:anchor="_Toc227618719" w:history="1">
             <w:r>
               <w:rPr>
                 <w:rStyle w:val="Hiperligao"/>
@@ -2037,7 +2125,7 @@
                 <w:noProof/>
                 <w:webHidden/>
               </w:rPr>
-              <w:instrText xml:space="preserve"> PAGEREF _Toc227607966 \h </w:instrText>
+              <w:instrText xml:space="preserve"> PAGEREF _Toc227618719 \h </w:instrText>
             </w:r>
             <w:r>
               <w:rPr>
@@ -2057,7 +2145,7 @@
                 <w:noProof/>
                 <w:webHidden/>
               </w:rPr>
-              <w:t>13</w:t>
+              <w:t>14</w:t>
             </w:r>
             <w:r>
               <w:rPr>
@@ -2082,7 +2170,7 @@
               <w14:ligatures w14:val="standardContextual"/>
             </w:rPr>
           </w:pPr>
-          <w:hyperlink w:anchor="_Toc227607967" w:history="1">
+          <w:hyperlink w:anchor="_Toc227618720" w:history="1">
             <w:r>
               <w:rPr>
                 <w:rStyle w:val="Hiperligao"/>
@@ -2125,7 +2213,7 @@
                 <w:noProof/>
                 <w:webHidden/>
               </w:rPr>
-              <w:instrText xml:space="preserve"> PAGEREF _Toc227607967 \h </w:instrText>
+              <w:instrText xml:space="preserve"> PAGEREF _Toc227618720 \h </w:instrText>
             </w:r>
             <w:r>
               <w:rPr>
@@ -2145,7 +2233,7 @@
                 <w:noProof/>
                 <w:webHidden/>
               </w:rPr>
-              <w:t>13</w:t>
+              <w:t>14</w:t>
             </w:r>
             <w:r>
               <w:rPr>
@@ -2170,7 +2258,7 @@
               <w14:ligatures w14:val="standardContextual"/>
             </w:rPr>
           </w:pPr>
-          <w:hyperlink w:anchor="_Toc227607968" w:history="1">
+          <w:hyperlink w:anchor="_Toc227618721" w:history="1">
             <w:r>
               <w:rPr>
                 <w:rStyle w:val="Hiperligao"/>
@@ -2213,7 +2301,7 @@
                 <w:noProof/>
                 <w:webHidden/>
               </w:rPr>
-              <w:instrText xml:space="preserve"> PAGEREF _Toc227607968 \h </w:instrText>
+              <w:instrText xml:space="preserve"> PAGEREF _Toc227618721 \h </w:instrText>
             </w:r>
             <w:r>
               <w:rPr>
@@ -2233,7 +2321,7 @@
                 <w:noProof/>
                 <w:webHidden/>
               </w:rPr>
-              <w:t>14</w:t>
+              <w:t>16</w:t>
             </w:r>
             <w:r>
               <w:rPr>
@@ -2258,7 +2346,7 @@
               <w14:ligatures w14:val="standardContextual"/>
             </w:rPr>
           </w:pPr>
-          <w:hyperlink w:anchor="_Toc227607969" w:history="1">
+          <w:hyperlink w:anchor="_Toc227618722" w:history="1">
             <w:r>
               <w:rPr>
                 <w:rStyle w:val="Hiperligao"/>
@@ -2301,7 +2389,7 @@
                 <w:noProof/>
                 <w:webHidden/>
               </w:rPr>
-              <w:instrText xml:space="preserve"> PAGEREF _Toc227607969 \h </w:instrText>
+              <w:instrText xml:space="preserve"> PAGEREF _Toc227618722 \h </w:instrText>
             </w:r>
             <w:r>
               <w:rPr>
@@ -2321,7 +2409,7 @@
                 <w:noProof/>
                 <w:webHidden/>
               </w:rPr>
-              <w:t>23</w:t>
+              <w:t>25</w:t>
             </w:r>
             <w:r>
               <w:rPr>
@@ -2346,7 +2434,7 @@
               <w14:ligatures w14:val="standardContextual"/>
             </w:rPr>
           </w:pPr>
-          <w:hyperlink w:anchor="_Toc227607970" w:history="1">
+          <w:hyperlink w:anchor="_Toc227618723" w:history="1">
             <w:r>
               <w:rPr>
                 <w:rStyle w:val="Hiperligao"/>
@@ -2389,7 +2477,7 @@
                 <w:noProof/>
                 <w:webHidden/>
               </w:rPr>
-              <w:instrText xml:space="preserve"> PAGEREF _Toc227607970 \h </w:instrText>
+              <w:instrText xml:space="preserve"> PAGEREF _Toc227618723 \h </w:instrText>
             </w:r>
             <w:r>
               <w:rPr>
@@ -2409,7 +2497,7 @@
                 <w:noProof/>
                 <w:webHidden/>
               </w:rPr>
-              <w:t>23</w:t>
+              <w:t>25</w:t>
             </w:r>
             <w:r>
               <w:rPr>
@@ -2434,7 +2522,7 @@
               <w14:ligatures w14:val="standardContextual"/>
             </w:rPr>
           </w:pPr>
-          <w:hyperlink w:anchor="_Toc227607971" w:history="1">
+          <w:hyperlink w:anchor="_Toc227618724" w:history="1">
             <w:r>
               <w:rPr>
                 <w:rStyle w:val="Hiperligao"/>
@@ -2477,7 +2565,7 @@
                 <w:noProof/>
                 <w:webHidden/>
               </w:rPr>
-              <w:instrText xml:space="preserve"> PAGEREF _Toc227607971 \h </w:instrText>
+              <w:instrText xml:space="preserve"> PAGEREF _Toc227618724 \h </w:instrText>
             </w:r>
             <w:r>
               <w:rPr>
@@ -2497,7 +2585,7 @@
                 <w:noProof/>
                 <w:webHidden/>
               </w:rPr>
-              <w:t>23</w:t>
+              <w:t>25</w:t>
             </w:r>
             <w:r>
               <w:rPr>
@@ -2522,7 +2610,7 @@
               <w14:ligatures w14:val="standardContextual"/>
             </w:rPr>
           </w:pPr>
-          <w:hyperlink w:anchor="_Toc227607972" w:history="1">
+          <w:hyperlink w:anchor="_Toc227618725" w:history="1">
             <w:r>
               <w:rPr>
                 <w:rStyle w:val="Hiperligao"/>
@@ -2565,7 +2653,7 @@
                 <w:noProof/>
                 <w:webHidden/>
               </w:rPr>
-              <w:instrText xml:space="preserve"> PAGEREF _Toc227607972 \h </w:instrText>
+              <w:instrText xml:space="preserve"> PAGEREF _Toc227618725 \h </w:instrText>
             </w:r>
             <w:r>
               <w:rPr>
@@ -2585,7 +2673,7 @@
                 <w:noProof/>
                 <w:webHidden/>
               </w:rPr>
-              <w:t>23</w:t>
+              <w:t>25</w:t>
             </w:r>
             <w:r>
               <w:rPr>
@@ -2610,7 +2698,7 @@
               <w14:ligatures w14:val="standardContextual"/>
             </w:rPr>
           </w:pPr>
-          <w:hyperlink w:anchor="_Toc227607973" w:history="1">
+          <w:hyperlink w:anchor="_Toc227618726" w:history="1">
             <w:r>
               <w:rPr>
                 <w:rStyle w:val="Hiperligao"/>
@@ -2653,7 +2741,7 @@
                 <w:noProof/>
                 <w:webHidden/>
               </w:rPr>
-              <w:instrText xml:space="preserve"> PAGEREF _Toc227607973 \h </w:instrText>
+              <w:instrText xml:space="preserve"> PAGEREF _Toc227618726 \h </w:instrText>
             </w:r>
             <w:r>
               <w:rPr>
@@ -2673,7 +2761,7 @@
                 <w:noProof/>
                 <w:webHidden/>
               </w:rPr>
-              <w:t>23</w:t>
+              <w:t>25</w:t>
             </w:r>
             <w:r>
               <w:rPr>
@@ -2698,7 +2786,7 @@
               <w14:ligatures w14:val="standardContextual"/>
             </w:rPr>
           </w:pPr>
-          <w:hyperlink w:anchor="_Toc227607974" w:history="1">
+          <w:hyperlink w:anchor="_Toc227618727" w:history="1">
             <w:r>
               <w:rPr>
                 <w:rStyle w:val="Hiperligao"/>
@@ -2741,7 +2829,7 @@
                 <w:noProof/>
                 <w:webHidden/>
               </w:rPr>
-              <w:instrText xml:space="preserve"> PAGEREF _Toc227607974 \h </w:instrText>
+              <w:instrText xml:space="preserve"> PAGEREF _Toc227618727 \h </w:instrText>
             </w:r>
             <w:r>
               <w:rPr>
@@ -2761,7 +2849,7 @@
                 <w:noProof/>
                 <w:webHidden/>
               </w:rPr>
-              <w:t>23</w:t>
+              <w:t>25</w:t>
             </w:r>
             <w:r>
               <w:rPr>
@@ -2786,7 +2874,7 @@
               <w14:ligatures w14:val="standardContextual"/>
             </w:rPr>
           </w:pPr>
-          <w:hyperlink w:anchor="_Toc227607975" w:history="1">
+          <w:hyperlink w:anchor="_Toc227618728" w:history="1">
             <w:r>
               <w:rPr>
                 <w:rStyle w:val="Hiperligao"/>
@@ -2829,7 +2917,7 @@
                 <w:noProof/>
                 <w:webHidden/>
               </w:rPr>
-              <w:instrText xml:space="preserve"> PAGEREF _Toc227607975 \h </w:instrText>
+              <w:instrText xml:space="preserve"> PAGEREF _Toc227618728 \h </w:instrText>
             </w:r>
             <w:r>
               <w:rPr>
@@ -2849,7 +2937,7 @@
                 <w:noProof/>
                 <w:webHidden/>
               </w:rPr>
-              <w:t>25</w:t>
+              <w:t>26</w:t>
             </w:r>
             <w:r>
               <w:rPr>
@@ -2919,7 +3007,7 @@
       <w:r>
         <w:fldChar w:fldCharType="separate"/>
       </w:r>
-      <w:hyperlink w:anchor="_Toc227594627" w:history="1">
+      <w:hyperlink w:anchor="_Toc227618741" w:history="1">
         <w:r>
           <w:rPr>
             <w:rStyle w:val="Hiperligao"/>
@@ -2946,7 +3034,7 @@
             <w:noProof/>
             <w:webHidden/>
           </w:rPr>
-          <w:instrText xml:space="preserve"> PAGEREF _Toc227594627 \h </w:instrText>
+          <w:instrText xml:space="preserve"> PAGEREF _Toc227618741 \h </w:instrText>
         </w:r>
         <w:r>
           <w:rPr>
@@ -2990,7 +3078,7 @@
           <w14:ligatures w14:val="standardContextual"/>
         </w:rPr>
       </w:pPr>
-      <w:hyperlink w:anchor="_Toc227594628" w:history="1">
+      <w:hyperlink w:anchor="_Toc227618742" w:history="1">
         <w:r>
           <w:rPr>
             <w:rStyle w:val="Hiperligao"/>
@@ -3017,7 +3105,7 @@
             <w:noProof/>
             <w:webHidden/>
           </w:rPr>
-          <w:instrText xml:space="preserve"> PAGEREF _Toc227594628 \h </w:instrText>
+          <w:instrText xml:space="preserve"> PAGEREF _Toc227618742 \h </w:instrText>
         </w:r>
         <w:r>
           <w:rPr>
@@ -3037,7 +3125,7 @@
             <w:noProof/>
             <w:webHidden/>
           </w:rPr>
-          <w:t>12</w:t>
+          <w:t>13</w:t>
         </w:r>
         <w:r>
           <w:rPr>
@@ -3047,29 +3135,6 @@
           <w:fldChar w:fldCharType="end"/>
         </w:r>
       </w:hyperlink>
-    </w:p>
-    <w:p>
-      <w:r>
-        <w:fldChar w:fldCharType="end"/>
-      </w:r>
-    </w:p>
-    <w:p>
-      <w:pPr>
-        <w:spacing w:after="160" w:line="278" w:lineRule="auto"/>
-        <w:jc w:val="left"/>
-      </w:pPr>
-      <w:r>
-        <w:br w:type="page"/>
-      </w:r>
-    </w:p>
-    <w:p>
-      <w:pPr>
-        <w:pStyle w:val="Ttulondice"/>
-      </w:pPr>
-      <w:r>
-        <w:lastRenderedPageBreak/>
-        <w:t xml:space="preserve">Índice de figuras </w:t>
-      </w:r>
     </w:p>
     <w:p>
       <w:pPr>
@@ -3084,22 +3149,13 @@
           <w14:ligatures w14:val="standardContextual"/>
         </w:rPr>
       </w:pPr>
-      <w:r>
-        <w:fldChar w:fldCharType="begin"/>
-      </w:r>
-      <w:r>
-        <w:instrText xml:space="preserve"> TOC \h \z \c "Figura" </w:instrText>
-      </w:r>
-      <w:r>
-        <w:fldChar w:fldCharType="separate"/>
-      </w:r>
-      <w:hyperlink w:anchor="_Toc227594509" w:history="1">
+      <w:hyperlink w:anchor="_Toc227618743" w:history="1">
         <w:r>
           <w:rPr>
             <w:rStyle w:val="Hiperligao"/>
             <w:noProof/>
           </w:rPr>
-          <w:t>Figura 1 Gráfico de tempo/profundidade</w:t>
+          <w:t>Tabela 3 Tabela de profundidade/tempo tabuleiro 4x4 (melhor caso)</w:t>
         </w:r>
         <w:r>
           <w:rPr>
@@ -3120,7 +3176,7 @@
             <w:noProof/>
             <w:webHidden/>
           </w:rPr>
-          <w:instrText xml:space="preserve"> PAGEREF _Toc227594509 \h </w:instrText>
+          <w:instrText xml:space="preserve"> PAGEREF _Toc227618743 \h </w:instrText>
         </w:r>
         <w:r>
           <w:rPr>
@@ -3164,13 +3220,13 @@
           <w14:ligatures w14:val="standardContextual"/>
         </w:rPr>
       </w:pPr>
-      <w:hyperlink w:anchor="_Toc227594510" w:history="1">
+      <w:hyperlink w:anchor="_Toc227618744" w:history="1">
         <w:r>
           <w:rPr>
             <w:rStyle w:val="Hiperligao"/>
             <w:noProof/>
           </w:rPr>
-          <w:t>Figura 2 Vitória do minimax</w:t>
+          <w:t>Tabela 4 Tabela de profundidade/tempo tabuleiro 4x4 (pior caso)</w:t>
         </w:r>
         <w:r>
           <w:rPr>
@@ -3191,7 +3247,7 @@
             <w:noProof/>
             <w:webHidden/>
           </w:rPr>
-          <w:instrText xml:space="preserve"> PAGEREF _Toc227594510 \h </w:instrText>
+          <w:instrText xml:space="preserve"> PAGEREF _Toc227618744 \h </w:instrText>
         </w:r>
         <w:r>
           <w:rPr>
@@ -3211,7 +3267,7 @@
             <w:noProof/>
             <w:webHidden/>
           </w:rPr>
-          <w:t>14</w:t>
+          <w:t>15</w:t>
         </w:r>
         <w:r>
           <w:rPr>
@@ -3221,6 +3277,29 @@
           <w:fldChar w:fldCharType="end"/>
         </w:r>
       </w:hyperlink>
+    </w:p>
+    <w:p>
+      <w:r>
+        <w:fldChar w:fldCharType="end"/>
+      </w:r>
+    </w:p>
+    <w:p>
+      <w:pPr>
+        <w:spacing w:after="160" w:line="278" w:lineRule="auto"/>
+        <w:jc w:val="left"/>
+      </w:pPr>
+      <w:r>
+        <w:br w:type="page"/>
+      </w:r>
+    </w:p>
+    <w:p>
+      <w:pPr>
+        <w:pStyle w:val="Ttulondice"/>
+      </w:pPr>
+      <w:r>
+        <w:lastRenderedPageBreak/>
+        <w:t xml:space="preserve">Índice de figuras </w:t>
+      </w:r>
     </w:p>
     <w:p>
       <w:pPr>
@@ -3235,13 +3314,22 @@
           <w14:ligatures w14:val="standardContextual"/>
         </w:rPr>
       </w:pPr>
-      <w:hyperlink w:anchor="_Toc227594511" w:history="1">
+      <w:r>
+        <w:fldChar w:fldCharType="begin"/>
+      </w:r>
+      <w:r>
+        <w:instrText xml:space="preserve"> TOC \h \z \c "Figura" </w:instrText>
+      </w:r>
+      <w:r>
+        <w:fldChar w:fldCharType="separate"/>
+      </w:r>
+      <w:hyperlink w:anchor="_Toc227618729" w:history="1">
         <w:r>
           <w:rPr>
             <w:rStyle w:val="Hiperligao"/>
             <w:noProof/>
           </w:rPr>
-          <w:t>Figura 3 vitória do alfa-beta</w:t>
+          <w:t>Figura 1 memória usada pelo prolog</w:t>
         </w:r>
         <w:r>
           <w:rPr>
@@ -3262,7 +3350,7 @@
             <w:noProof/>
             <w:webHidden/>
           </w:rPr>
-          <w:instrText xml:space="preserve"> PAGEREF _Toc227594511 \h </w:instrText>
+          <w:instrText xml:space="preserve"> PAGEREF _Toc227618729 \h </w:instrText>
         </w:r>
         <w:r>
           <w:rPr>
@@ -3306,13 +3394,13 @@
           <w14:ligatures w14:val="standardContextual"/>
         </w:rPr>
       </w:pPr>
-      <w:hyperlink w:anchor="_Toc227594512" w:history="1">
+      <w:hyperlink w:anchor="_Toc227618730" w:history="1">
         <w:r>
           <w:rPr>
             <w:rStyle w:val="Hiperligao"/>
             <w:noProof/>
           </w:rPr>
-          <w:t>Figura 4 Jogada invalida do humano</w:t>
+          <w:t>Figura 2 Vitória do minimax</w:t>
         </w:r>
         <w:r>
           <w:rPr>
@@ -3333,7 +3421,7 @@
             <w:noProof/>
             <w:webHidden/>
           </w:rPr>
-          <w:instrText xml:space="preserve"> PAGEREF _Toc227594512 \h </w:instrText>
+          <w:instrText xml:space="preserve"> PAGEREF _Toc227618730 \h </w:instrText>
         </w:r>
         <w:r>
           <w:rPr>
@@ -3353,7 +3441,7 @@
             <w:noProof/>
             <w:webHidden/>
           </w:rPr>
-          <w:t>15</w:t>
+          <w:t>16</w:t>
         </w:r>
         <w:r>
           <w:rPr>
@@ -3377,13 +3465,13 @@
           <w14:ligatures w14:val="standardContextual"/>
         </w:rPr>
       </w:pPr>
-      <w:hyperlink w:anchor="_Toc227594513" w:history="1">
+      <w:hyperlink w:anchor="_Toc227618731" w:history="1">
         <w:r>
           <w:rPr>
             <w:rStyle w:val="Hiperligao"/>
             <w:noProof/>
           </w:rPr>
-          <w:t>Figura 5 Jogo perfeito por parte da AI parte 1</w:t>
+          <w:t>Figura 3 vitória do alfa-beta</w:t>
         </w:r>
         <w:r>
           <w:rPr>
@@ -3404,7 +3492,7 @@
             <w:noProof/>
             <w:webHidden/>
           </w:rPr>
-          <w:instrText xml:space="preserve"> PAGEREF _Toc227594513 \h </w:instrText>
+          <w:instrText xml:space="preserve"> PAGEREF _Toc227618731 \h </w:instrText>
         </w:r>
         <w:r>
           <w:rPr>
@@ -3424,7 +3512,7 @@
             <w:noProof/>
             <w:webHidden/>
           </w:rPr>
-          <w:t>16</w:t>
+          <w:t>17</w:t>
         </w:r>
         <w:r>
           <w:rPr>
@@ -3448,13 +3536,13 @@
           <w14:ligatures w14:val="standardContextual"/>
         </w:rPr>
       </w:pPr>
-      <w:hyperlink w:anchor="_Toc227594514" w:history="1">
+      <w:hyperlink w:anchor="_Toc227618732" w:history="1">
         <w:r>
           <w:rPr>
             <w:rStyle w:val="Hiperligao"/>
             <w:noProof/>
           </w:rPr>
-          <w:t>Figura 6 Jogo perfeito por parte da AI part 2</w:t>
+          <w:t>Figura 4 Jogada invalida do humano</w:t>
         </w:r>
         <w:r>
           <w:rPr>
@@ -3475,7 +3563,7 @@
             <w:noProof/>
             <w:webHidden/>
           </w:rPr>
-          <w:instrText xml:space="preserve"> PAGEREF _Toc227594514 \h </w:instrText>
+          <w:instrText xml:space="preserve"> PAGEREF _Toc227618732 \h </w:instrText>
         </w:r>
         <w:r>
           <w:rPr>
@@ -3519,13 +3607,13 @@
           <w14:ligatures w14:val="standardContextual"/>
         </w:rPr>
       </w:pPr>
-      <w:hyperlink w:anchor="_Toc227594515" w:history="1">
+      <w:hyperlink w:anchor="_Toc227618733" w:history="1">
         <w:r>
           <w:rPr>
             <w:rStyle w:val="Hiperligao"/>
             <w:noProof/>
           </w:rPr>
-          <w:t>Figura 7 Jogo perfeito por parte da AI part 3</w:t>
+          <w:t>Figura 5 Jogo perfeito por parte da AI parte 1</w:t>
         </w:r>
         <w:r>
           <w:rPr>
@@ -3546,7 +3634,7 @@
             <w:noProof/>
             <w:webHidden/>
           </w:rPr>
-          <w:instrText xml:space="preserve"> PAGEREF _Toc227594515 \h </w:instrText>
+          <w:instrText xml:space="preserve"> PAGEREF _Toc227618733 \h </w:instrText>
         </w:r>
         <w:r>
           <w:rPr>
@@ -3590,13 +3678,13 @@
           <w14:ligatures w14:val="standardContextual"/>
         </w:rPr>
       </w:pPr>
-      <w:hyperlink w:anchor="_Toc227594516" w:history="1">
+      <w:hyperlink w:anchor="_Toc227618734" w:history="1">
         <w:r>
           <w:rPr>
             <w:rStyle w:val="Hiperligao"/>
             <w:noProof/>
           </w:rPr>
-          <w:t>Figura 8 Jogo perfeito por parte da AI part 4</w:t>
+          <w:t>Figura 6 Jogo perfeito por parte da AI part 2</w:t>
         </w:r>
         <w:r>
           <w:rPr>
@@ -3617,7 +3705,7 @@
             <w:noProof/>
             <w:webHidden/>
           </w:rPr>
-          <w:instrText xml:space="preserve"> PAGEREF _Toc227594516 \h </w:instrText>
+          <w:instrText xml:space="preserve"> PAGEREF _Toc227618734 \h </w:instrText>
         </w:r>
         <w:r>
           <w:rPr>
@@ -3661,13 +3749,13 @@
           <w14:ligatures w14:val="standardContextual"/>
         </w:rPr>
       </w:pPr>
-      <w:hyperlink w:anchor="_Toc227594517" w:history="1">
+      <w:hyperlink w:anchor="_Toc227618735" w:history="1">
         <w:r>
           <w:rPr>
             <w:rStyle w:val="Hiperligao"/>
             <w:noProof/>
           </w:rPr>
-          <w:t>Figura 9 alfa-beta com 6 de profundidade</w:t>
+          <w:t>Figura 7 Jogo perfeito por parte da AI part 3</w:t>
         </w:r>
         <w:r>
           <w:rPr>
@@ -3688,7 +3776,7 @@
             <w:noProof/>
             <w:webHidden/>
           </w:rPr>
-          <w:instrText xml:space="preserve"> PAGEREF _Toc227594517 \h </w:instrText>
+          <w:instrText xml:space="preserve"> PAGEREF _Toc227618735 \h </w:instrText>
         </w:r>
         <w:r>
           <w:rPr>
@@ -3708,7 +3796,7 @@
             <w:noProof/>
             <w:webHidden/>
           </w:rPr>
-          <w:t>19</w:t>
+          <w:t>20</w:t>
         </w:r>
         <w:r>
           <w:rPr>
@@ -3732,13 +3820,13 @@
           <w14:ligatures w14:val="standardContextual"/>
         </w:rPr>
       </w:pPr>
-      <w:hyperlink w:anchor="_Toc227594518" w:history="1">
+      <w:hyperlink w:anchor="_Toc227618736" w:history="1">
         <w:r>
           <w:rPr>
             <w:rStyle w:val="Hiperligao"/>
             <w:noProof/>
           </w:rPr>
-          <w:t>Figura 10 alfa-beta com 5 de profundidade</w:t>
+          <w:t>Figura 8 Jogo perfeito por parte da AI part 4</w:t>
         </w:r>
         <w:r>
           <w:rPr>
@@ -3759,7 +3847,7 @@
             <w:noProof/>
             <w:webHidden/>
           </w:rPr>
-          <w:instrText xml:space="preserve"> PAGEREF _Toc227594518 \h </w:instrText>
+          <w:instrText xml:space="preserve"> PAGEREF _Toc227618736 \h </w:instrText>
         </w:r>
         <w:r>
           <w:rPr>
@@ -3779,7 +3867,7 @@
             <w:noProof/>
             <w:webHidden/>
           </w:rPr>
-          <w:t>20</w:t>
+          <w:t>21</w:t>
         </w:r>
         <w:r>
           <w:rPr>
@@ -3803,13 +3891,13 @@
           <w14:ligatures w14:val="standardContextual"/>
         </w:rPr>
       </w:pPr>
-      <w:hyperlink w:anchor="_Toc227594519" w:history="1">
+      <w:hyperlink w:anchor="_Toc227618737" w:history="1">
         <w:r>
           <w:rPr>
             <w:rStyle w:val="Hiperligao"/>
             <w:noProof/>
           </w:rPr>
-          <w:t>Figura 11 alfa-beta com 4 de profundidade</w:t>
+          <w:t>Figura 9 alfa-beta com 6 de profundidade</w:t>
         </w:r>
         <w:r>
           <w:rPr>
@@ -3830,7 +3918,7 @@
             <w:noProof/>
             <w:webHidden/>
           </w:rPr>
-          <w:instrText xml:space="preserve"> PAGEREF _Toc227594519 \h </w:instrText>
+          <w:instrText xml:space="preserve"> PAGEREF _Toc227618737 \h </w:instrText>
         </w:r>
         <w:r>
           <w:rPr>
@@ -3874,12 +3962,154 @@
           <w14:ligatures w14:val="standardContextual"/>
         </w:rPr>
       </w:pPr>
-      <w:hyperlink w:anchor="_Toc227594520" w:history="1">
+      <w:hyperlink w:anchor="_Toc227618738" w:history="1">
         <w:r>
           <w:rPr>
             <w:rStyle w:val="Hiperligao"/>
             <w:noProof/>
           </w:rPr>
+          <w:t>Figura 10 alfa-beta com 5 de profundidade</w:t>
+        </w:r>
+        <w:r>
+          <w:rPr>
+            <w:noProof/>
+            <w:webHidden/>
+          </w:rPr>
+          <w:tab/>
+        </w:r>
+        <w:r>
+          <w:rPr>
+            <w:noProof/>
+            <w:webHidden/>
+          </w:rPr>
+          <w:fldChar w:fldCharType="begin"/>
+        </w:r>
+        <w:r>
+          <w:rPr>
+            <w:noProof/>
+            <w:webHidden/>
+          </w:rPr>
+          <w:instrText xml:space="preserve"> PAGEREF _Toc227618738 \h </w:instrText>
+        </w:r>
+        <w:r>
+          <w:rPr>
+            <w:noProof/>
+            <w:webHidden/>
+          </w:rPr>
+        </w:r>
+        <w:r>
+          <w:rPr>
+            <w:noProof/>
+            <w:webHidden/>
+          </w:rPr>
+          <w:fldChar w:fldCharType="separate"/>
+        </w:r>
+        <w:r>
+          <w:rPr>
+            <w:noProof/>
+            <w:webHidden/>
+          </w:rPr>
+          <w:t>22</w:t>
+        </w:r>
+        <w:r>
+          <w:rPr>
+            <w:noProof/>
+            <w:webHidden/>
+          </w:rPr>
+          <w:fldChar w:fldCharType="end"/>
+        </w:r>
+      </w:hyperlink>
+    </w:p>
+    <w:p>
+      <w:pPr>
+        <w:pStyle w:val="ndicedeilustraes"/>
+        <w:tabs>
+          <w:tab w:val="right" w:leader="dot" w:pos="9628"/>
+        </w:tabs>
+        <w:rPr>
+          <w:noProof/>
+          <w:kern w:val="2"/>
+          <w:lang w:eastAsia="pt-PT"/>
+          <w14:ligatures w14:val="standardContextual"/>
+        </w:rPr>
+      </w:pPr>
+      <w:hyperlink w:anchor="_Toc227618739" w:history="1">
+        <w:r>
+          <w:rPr>
+            <w:rStyle w:val="Hiperligao"/>
+            <w:noProof/>
+          </w:rPr>
+          <w:t>Figura 11 alfa-beta com 4 de profundidade</w:t>
+        </w:r>
+        <w:r>
+          <w:rPr>
+            <w:noProof/>
+            <w:webHidden/>
+          </w:rPr>
+          <w:tab/>
+        </w:r>
+        <w:r>
+          <w:rPr>
+            <w:noProof/>
+            <w:webHidden/>
+          </w:rPr>
+          <w:fldChar w:fldCharType="begin"/>
+        </w:r>
+        <w:r>
+          <w:rPr>
+            <w:noProof/>
+            <w:webHidden/>
+          </w:rPr>
+          <w:instrText xml:space="preserve"> PAGEREF _Toc227618739 \h </w:instrText>
+        </w:r>
+        <w:r>
+          <w:rPr>
+            <w:noProof/>
+            <w:webHidden/>
+          </w:rPr>
+        </w:r>
+        <w:r>
+          <w:rPr>
+            <w:noProof/>
+            <w:webHidden/>
+          </w:rPr>
+          <w:fldChar w:fldCharType="separate"/>
+        </w:r>
+        <w:r>
+          <w:rPr>
+            <w:noProof/>
+            <w:webHidden/>
+          </w:rPr>
+          <w:t>23</w:t>
+        </w:r>
+        <w:r>
+          <w:rPr>
+            <w:noProof/>
+            <w:webHidden/>
+          </w:rPr>
+          <w:fldChar w:fldCharType="end"/>
+        </w:r>
+      </w:hyperlink>
+    </w:p>
+    <w:p>
+      <w:pPr>
+        <w:pStyle w:val="ndicedeilustraes"/>
+        <w:tabs>
+          <w:tab w:val="right" w:leader="dot" w:pos="9628"/>
+        </w:tabs>
+        <w:rPr>
+          <w:noProof/>
+          <w:kern w:val="2"/>
+          <w:lang w:eastAsia="pt-PT"/>
+          <w14:ligatures w14:val="standardContextual"/>
+        </w:rPr>
+      </w:pPr>
+      <w:hyperlink w:anchor="_Toc227618740" w:history="1">
+        <w:r>
+          <w:rPr>
+            <w:rStyle w:val="Hiperligao"/>
+            <w:noProof/>
+          </w:rPr>
           <w:t>Figura 12  alfa-beta com 4 de profundidade</w:t>
         </w:r>
         <w:r>
@@ -3901,7 +4131,7 @@
             <w:noProof/>
             <w:webHidden/>
           </w:rPr>
-          <w:instrText xml:space="preserve"> PAGEREF _Toc227594520 \h </w:instrText>
+          <w:instrText xml:space="preserve"> PAGEREF _Toc227618740 \h </w:instrText>
         </w:r>
         <w:r>
           <w:rPr>
@@ -3921,7 +4151,7 @@
             <w:noProof/>
             <w:webHidden/>
           </w:rPr>
-          <w:t>22</w:t>
+          <w:t>24</w:t>
         </w:r>
         <w:r>
           <w:rPr>
@@ -3956,7 +4186,7 @@
       <w:pPr>
         <w:pStyle w:val="Ttulo1"/>
       </w:pPr>
-      <w:bookmarkStart w:id="1" w:name="_Toc227607949"/>
+      <w:bookmarkStart w:id="1" w:name="_Toc227618701"/>
       <w:r>
         <w:lastRenderedPageBreak/>
         <w:t>Introdução</w:t>
@@ -4072,7 +4302,7 @@
       <w:pPr>
         <w:pStyle w:val="Ttulo1"/>
       </w:pPr>
-      <w:bookmarkStart w:id="2" w:name="_Toc227607950"/>
+      <w:bookmarkStart w:id="2" w:name="_Toc227618702"/>
       <w:r>
         <w:lastRenderedPageBreak/>
         <w:t>Descrição do jogo ISOLA</w:t>
@@ -4083,7 +4313,7 @@
       <w:pPr>
         <w:pStyle w:val="Ttulo2"/>
       </w:pPr>
-      <w:bookmarkStart w:id="3" w:name="_Toc227607951"/>
+      <w:bookmarkStart w:id="3" w:name="_Toc227618703"/>
       <w:r>
         <w:t>R</w:t>
       </w:r>
@@ -4244,7 +4474,7 @@
       <w:pPr>
         <w:pStyle w:val="Ttulo2"/>
       </w:pPr>
-      <w:bookmarkStart w:id="4" w:name="_Toc227607952"/>
+      <w:bookmarkStart w:id="4" w:name="_Toc227618704"/>
       <w:r>
         <w:t>Re</w:t>
       </w:r>
@@ -4400,7 +4630,7 @@
       <w:pPr>
         <w:pStyle w:val="Ttulo1"/>
       </w:pPr>
-      <w:bookmarkStart w:id="5" w:name="_Toc227607953"/>
+      <w:bookmarkStart w:id="5" w:name="_Toc227618705"/>
       <w:r>
         <w:lastRenderedPageBreak/>
         <w:t>Estrutura do Código</w:t>
@@ -4425,7 +4655,7 @@
         <w:pStyle w:val="Legenda"/>
         <w:keepNext/>
       </w:pPr>
-      <w:bookmarkStart w:id="6" w:name="_Toc227594627"/>
+      <w:bookmarkStart w:id="6" w:name="_Toc227618741"/>
       <w:r>
         <w:t xml:space="preserve">Tabela </w:t>
       </w:r>
@@ -4804,7 +5034,7 @@
       <w:pPr>
         <w:pStyle w:val="Ttulo1"/>
       </w:pPr>
-      <w:bookmarkStart w:id="7" w:name="_Toc227607954"/>
+      <w:bookmarkStart w:id="7" w:name="_Toc227618706"/>
       <w:r>
         <w:lastRenderedPageBreak/>
         <w:t>Principais Predicados</w:t>
@@ -4859,7 +5089,7 @@
       <w:pPr>
         <w:pStyle w:val="Ttulo2"/>
       </w:pPr>
-      <w:bookmarkStart w:id="8" w:name="_Toc227607955"/>
+      <w:bookmarkStart w:id="8" w:name="_Toc227618707"/>
       <w:r>
         <w:t>main.pl</w:t>
       </w:r>
@@ -5039,7 +5269,7 @@
       <w:pPr>
         <w:pStyle w:val="Ttulo2"/>
       </w:pPr>
-      <w:bookmarkStart w:id="9" w:name="_Toc227607956"/>
+      <w:bookmarkStart w:id="9" w:name="_Toc227618708"/>
       <w:r>
         <w:t>utils.pl</w:t>
       </w:r>
@@ -5539,7 +5769,7 @@
       <w:pPr>
         <w:pStyle w:val="Ttulo2"/>
       </w:pPr>
-      <w:bookmarkStart w:id="10" w:name="_Toc227607957"/>
+      <w:bookmarkStart w:id="10" w:name="_Toc227618709"/>
       <w:r>
         <w:t>replace.pl</w:t>
       </w:r>
@@ -5570,7 +5800,7 @@
       <w:pPr>
         <w:pStyle w:val="Ttulo2"/>
       </w:pPr>
-      <w:bookmarkStart w:id="11" w:name="_Toc227607958"/>
+      <w:bookmarkStart w:id="11" w:name="_Toc227618710"/>
       <w:r>
         <w:t>print.pl</w:t>
       </w:r>
@@ -5622,7 +5852,7 @@
       <w:pPr>
         <w:pStyle w:val="Ttulo1"/>
       </w:pPr>
-      <w:bookmarkStart w:id="12" w:name="_Toc227607959"/>
+      <w:bookmarkStart w:id="12" w:name="_Toc227618711"/>
       <w:r>
         <w:lastRenderedPageBreak/>
         <w:t xml:space="preserve">Algoritmos de Pesquisa </w:t>
@@ -5638,7 +5868,7 @@
       <w:pPr>
         <w:pStyle w:val="Ttulo2"/>
       </w:pPr>
-      <w:bookmarkStart w:id="13" w:name="_Toc227607960"/>
+      <w:bookmarkStart w:id="13" w:name="_Toc227618712"/>
       <w:proofErr w:type="spellStart"/>
       <w:r>
         <w:t>Minimax</w:t>
@@ -5805,7 +6035,7 @@
       <w:pPr>
         <w:pStyle w:val="Ttulo2"/>
       </w:pPr>
-      <w:bookmarkStart w:id="14" w:name="_Toc227607961"/>
+      <w:bookmarkStart w:id="14" w:name="_Toc227618713"/>
       <w:proofErr w:type="spellStart"/>
       <w:r>
         <w:t>Alfa</w:t>
@@ -6020,7 +6250,7 @@
       <w:pPr>
         <w:pStyle w:val="Ttulo3"/>
       </w:pPr>
-      <w:bookmarkStart w:id="15" w:name="_Toc227607962"/>
+      <w:bookmarkStart w:id="15" w:name="_Toc227618714"/>
       <w:r>
         <w:t>Função de Avaliação Estática</w:t>
       </w:r>
@@ -6138,9 +6368,226 @@
     </w:p>
     <w:p>
       <w:pPr>
+        <w:pStyle w:val="Ttulo3"/>
+      </w:pPr>
+      <w:bookmarkStart w:id="16" w:name="_Toc227618715"/>
+      <w:r>
+        <w:t>Otimizações da Implementação</w:t>
+      </w:r>
+      <w:bookmarkEnd w:id="16"/>
+    </w:p>
+    <w:p>
+      <w:r>
+        <w:t xml:space="preserve">A implementação do algoritmo </w:t>
+      </w:r>
+      <w:proofErr w:type="spellStart"/>
+      <w:r>
+        <w:t>Alfa-Beta</w:t>
+      </w:r>
+      <w:proofErr w:type="spellEnd"/>
+      <w:r>
+        <w:t xml:space="preserve"> no ficheiro alpha_beta.pl inclui várias otimizações que vão além do pseudocódigo clássico, orientadas sobretudo para mitigar o elevado fator de ramificação do jogo ISOLA, resultante da combinação do movimento do peão com a remoção de uma casa em cada turno.</w:t>
+      </w:r>
+    </w:p>
+    <w:p>
+      <w:pPr>
+        <w:pStyle w:val="Ttulo4"/>
+      </w:pPr>
+      <w:r>
+        <w:t>Poda agressiva na geração de sucessores</w:t>
+      </w:r>
+    </w:p>
+    <w:p>
+      <w:r>
+        <w:t xml:space="preserve">O predicado </w:t>
+      </w:r>
+      <w:proofErr w:type="spellStart"/>
+      <w:r>
+        <w:t>auxMoves</w:t>
+      </w:r>
+      <w:proofErr w:type="spellEnd"/>
+      <w:r>
+        <w:t xml:space="preserve">/2 foi modificado face à versão do </w:t>
+      </w:r>
+      <w:proofErr w:type="spellStart"/>
+      <w:r>
+        <w:t>Minimax</w:t>
+      </w:r>
+      <w:proofErr w:type="spellEnd"/>
+      <w:r>
+        <w:t xml:space="preserve"> para não gerar todos os estados possíveis. Em vez de considerar qualquer casa vazia como candidata à remoção, apenas são geradas remoções em casas adjacentes ao peão adversário, isto é, casas que correspondem a movimentos legais do oponente no próximo turno. Esta decisão reduz drasticamente o número de sucessores gerados sem comprometer a qualidade estratégica, uma vez que remover casas longe do adversário raramente contribui para o seu bloqueio. Caso não existam casas adjacentes ao adversário disponíveis, o predicado recorre a qualquer casa vazia como </w:t>
+      </w:r>
+      <w:proofErr w:type="spellStart"/>
+      <w:r>
+        <w:t>fallback</w:t>
+      </w:r>
+      <w:proofErr w:type="spellEnd"/>
+      <w:r>
+        <w:t>, garantindo que o algoritmo nunca falha por ausência de sucessores.</w:t>
+      </w:r>
+    </w:p>
+    <w:p>
+      <w:pPr>
+        <w:pStyle w:val="Ttulo4"/>
+      </w:pPr>
+      <w:r>
+        <w:lastRenderedPageBreak/>
+        <w:t xml:space="preserve">Ordenação de sucessores por score (move </w:t>
+      </w:r>
+      <w:proofErr w:type="spellStart"/>
+      <w:r>
+        <w:t>ordering</w:t>
+      </w:r>
+      <w:proofErr w:type="spellEnd"/>
+      <w:r>
+        <w:t>)</w:t>
+      </w:r>
+    </w:p>
+    <w:p>
+      <w:r>
+        <w:t>O predicado moves/2 aplica uma avaliação estática rápida (</w:t>
+      </w:r>
+      <w:proofErr w:type="spellStart"/>
+      <w:r>
+        <w:t>staticval_fast</w:t>
+      </w:r>
+      <w:proofErr w:type="spellEnd"/>
+      <w:r>
+        <w:t xml:space="preserve">/6) a cada sucessor gerado e ordena a lista resultante com </w:t>
+      </w:r>
+      <w:proofErr w:type="spellStart"/>
+      <w:r>
+        <w:t>keysort</w:t>
+      </w:r>
+      <w:proofErr w:type="spellEnd"/>
+      <w:r>
+        <w:t xml:space="preserve">/2 antes de a devolver ao algoritmo. Para nós onde joga o maximizador ('o') a lista é devolvida por ordem decrescente de score; para nós onde joga o minimizador ('x') por ordem crescente. Esta ordenação é fundamental para a eficácia do </w:t>
+      </w:r>
+      <w:proofErr w:type="spellStart"/>
+      <w:r>
+        <w:t>Alfa-Beta</w:t>
+      </w:r>
+      <w:proofErr w:type="spellEnd"/>
+      <w:r>
+        <w:t>, já que a frequência da poda depende diretamente da qualidade da ordem pela qual os candidatos são avaliados: quanto mais cedo forem encontrados valores próximos do ótimo, mais cedo os ramos inferiores podem ser descartados.</w:t>
+      </w:r>
+    </w:p>
+    <w:p>
+      <w:pPr>
+        <w:pStyle w:val="Ttulo4"/>
+      </w:pPr>
+      <w:r>
+        <w:t>Avaliação estática otimizada</w:t>
+      </w:r>
+    </w:p>
+    <w:p>
+      <w:r>
+        <w:t xml:space="preserve">Para evitar o custo de uma nova chamada a </w:t>
+      </w:r>
+      <w:proofErr w:type="spellStart"/>
+      <w:r>
+        <w:t>indexOf</w:t>
+      </w:r>
+      <w:proofErr w:type="spellEnd"/>
+      <w:r>
+        <w:t xml:space="preserve">/4 em cada avaliação, foi desenvolvida a variante </w:t>
+      </w:r>
+      <w:proofErr w:type="spellStart"/>
+      <w:r>
+        <w:t>staticval_fast</w:t>
+      </w:r>
+      <w:proofErr w:type="spellEnd"/>
+      <w:r>
+        <w:t xml:space="preserve">/6, que recebe as coordenadas dos dois peões já pré-calculadas em moves/2. Complementarmente, o predicado </w:t>
+      </w:r>
+      <w:proofErr w:type="spellStart"/>
+      <w:r>
+        <w:t>mobilidade_at</w:t>
+      </w:r>
+      <w:proofErr w:type="spellEnd"/>
+      <w:r>
+        <w:t xml:space="preserve">/5 substitui o padrão </w:t>
+      </w:r>
+      <w:proofErr w:type="spellStart"/>
+      <w:r>
+        <w:t>findall</w:t>
+      </w:r>
+      <w:proofErr w:type="spellEnd"/>
+      <w:r>
+        <w:t xml:space="preserve">/3 seguido de </w:t>
+      </w:r>
+      <w:proofErr w:type="spellStart"/>
+      <w:r>
+        <w:t>length</w:t>
+      </w:r>
+      <w:proofErr w:type="spellEnd"/>
+      <w:r>
+        <w:t xml:space="preserve">/2 por </w:t>
+      </w:r>
+      <w:proofErr w:type="spellStart"/>
+      <w:r>
+        <w:t>aggregate_</w:t>
+      </w:r>
+      <w:proofErr w:type="gramStart"/>
+      <w:r>
+        <w:t>all</w:t>
+      </w:r>
+      <w:proofErr w:type="spellEnd"/>
+      <w:r>
+        <w:t>(</w:t>
+      </w:r>
+      <w:proofErr w:type="spellStart"/>
+      <w:proofErr w:type="gramEnd"/>
+      <w:r>
+        <w:t>count</w:t>
+      </w:r>
+      <w:proofErr w:type="spellEnd"/>
+      <w:r>
+        <w:t>, ...), que conta as soluções diretamente sem construir a lista intermédia. Este par de predicados é chamado uma vez por sucessor durante a ordenação, pelo que a redução do custo individual tem impacto direto no desempenho global.</w:t>
+      </w:r>
+    </w:p>
+    <w:p>
+      <w:pPr>
+        <w:pStyle w:val="Ttulo4"/>
+      </w:pPr>
+      <w:r>
+        <w:t>Corte antecipado em estados decisivos</w:t>
+      </w:r>
+    </w:p>
+    <w:p>
+      <w:r>
+        <w:t xml:space="preserve">O predicado </w:t>
+      </w:r>
+      <w:proofErr w:type="spellStart"/>
+      <w:r>
+        <w:t>goodenough</w:t>
+      </w:r>
+      <w:proofErr w:type="spellEnd"/>
+      <w:r>
+        <w:t xml:space="preserve">/9 foi estendido com dois </w:t>
+      </w:r>
+      <w:proofErr w:type="spellStart"/>
+      <w:r>
+        <w:t>clauses</w:t>
+      </w:r>
+      <w:proofErr w:type="spellEnd"/>
+      <w:r>
+        <w:t xml:space="preserve"> adicionais que terminam imediatamente a exploração dos irmãos quando o valor do candidato atual atinge ±1000, correspondentes a estados terminais de vitória ou derrota. Quando o computador identifica uma vitória garantida ou uma derrota inevitável, não faz sentido continuar a avaliar alternativas, já que nenhum valor heurístico intermédio pode ultrapassar a magnitude de um estado terminal. Este corte opera em complemento à poda </w:t>
+      </w:r>
+      <w:proofErr w:type="spellStart"/>
+      <w:r>
+        <w:t>alfa-beta</w:t>
+      </w:r>
+      <w:proofErr w:type="spellEnd"/>
+      <w:r>
+        <w:t xml:space="preserve"> tradicional e é particularmente relevante nas fases finais do jogo, onde vários ramos convergem para estados terminais.</w:t>
+      </w:r>
+    </w:p>
+    <w:p>
+      <w:pPr>
         <w:pStyle w:val="Ttulo2"/>
       </w:pPr>
-      <w:bookmarkStart w:id="16" w:name="_Toc227607963"/>
+      <w:bookmarkStart w:id="17" w:name="_Toc227618716"/>
       <w:r>
         <w:t xml:space="preserve">Comparação </w:t>
       </w:r>
@@ -6167,7 +6614,7 @@
       <w:r>
         <w:t>-Beta</w:t>
       </w:r>
-      <w:bookmarkEnd w:id="16"/>
+      <w:bookmarkEnd w:id="17"/>
       <w:proofErr w:type="spellEnd"/>
     </w:p>
     <w:p>
@@ -6175,7 +6622,7 @@
         <w:pStyle w:val="Legenda"/>
         <w:keepNext/>
       </w:pPr>
-      <w:bookmarkStart w:id="17" w:name="_Toc227594628"/>
+      <w:bookmarkStart w:id="18" w:name="_Toc227618742"/>
       <w:r>
         <w:t xml:space="preserve">Tabela </w:t>
       </w:r>
@@ -6219,7 +6666,7 @@
       <w:r>
         <w:t>-Beta</w:t>
       </w:r>
-      <w:bookmarkEnd w:id="17"/>
+      <w:bookmarkEnd w:id="18"/>
       <w:proofErr w:type="spellEnd"/>
     </w:p>
     <w:tbl>
@@ -6536,18 +6983,18 @@
       <w:pPr>
         <w:pStyle w:val="Ttulo1"/>
       </w:pPr>
-      <w:bookmarkStart w:id="18" w:name="_Toc227607964"/>
+      <w:bookmarkStart w:id="19" w:name="_Toc227618717"/>
       <w:r>
         <w:lastRenderedPageBreak/>
         <w:t>Avaliação Experimental</w:t>
       </w:r>
-      <w:bookmarkEnd w:id="18"/>
+      <w:bookmarkEnd w:id="19"/>
     </w:p>
     <w:p>
       <w:pPr>
         <w:pStyle w:val="Ttulo2"/>
       </w:pPr>
-      <w:bookmarkStart w:id="19" w:name="_Toc227607965"/>
+      <w:bookmarkStart w:id="20" w:name="_Toc227618718"/>
       <w:r>
         <w:t xml:space="preserve">Tabuleiro 3x3 </w:t>
       </w:r>
@@ -6559,7 +7006,7 @@
       <w:r>
         <w:t xml:space="preserve"> sem limite</w:t>
       </w:r>
-      <w:bookmarkEnd w:id="19"/>
+      <w:bookmarkEnd w:id="20"/>
     </w:p>
     <w:p>
       <w:r>
@@ -6640,7 +7087,7 @@
       <w:pPr>
         <w:pStyle w:val="Ttulo2"/>
       </w:pPr>
-      <w:bookmarkStart w:id="20" w:name="_Toc227607966"/>
+      <w:bookmarkStart w:id="21" w:name="_Toc227618719"/>
       <w:r>
         <w:t xml:space="preserve">Tabuleiro 6x6 </w:t>
       </w:r>
@@ -6664,7 +7111,7 @@
       <w:r>
         <w:t>3</w:t>
       </w:r>
-      <w:bookmarkEnd w:id="20"/>
+      <w:bookmarkEnd w:id="21"/>
     </w:p>
     <w:p>
       <w:r>
@@ -6753,7 +7200,7 @@
       <w:pPr>
         <w:pStyle w:val="Ttulo2"/>
       </w:pPr>
-      <w:bookmarkStart w:id="21" w:name="_Toc227607967"/>
+      <w:bookmarkStart w:id="22" w:name="_Toc227618720"/>
       <w:r>
         <w:t xml:space="preserve">Impacto da </w:t>
       </w:r>
@@ -6770,7 +7217,7 @@
       <w:r>
         <w:t>-Beta</w:t>
       </w:r>
-      <w:bookmarkEnd w:id="21"/>
+      <w:bookmarkEnd w:id="22"/>
       <w:proofErr w:type="spellEnd"/>
     </w:p>
     <w:p>
@@ -6783,6 +7230,7 @@
         <w:pStyle w:val="Legenda"/>
         <w:keepNext/>
       </w:pPr>
+      <w:bookmarkStart w:id="23" w:name="_Toc227618743"/>
       <w:r>
         <w:t xml:space="preserve">Tabela </w:t>
       </w:r>
@@ -6797,6 +7245,7 @@
       <w:r>
         <w:t xml:space="preserve"> Tabela de profundidade/tempo tabuleiro 4x4 (melhor caso)</w:t>
       </w:r>
+      <w:bookmarkEnd w:id="23"/>
     </w:p>
     <w:tbl>
       <w:tblPr>
@@ -7019,6 +7468,7 @@
         <w:pStyle w:val="Legenda"/>
         <w:keepNext/>
       </w:pPr>
+      <w:bookmarkStart w:id="24" w:name="_Toc227618744"/>
       <w:r>
         <w:lastRenderedPageBreak/>
         <w:t xml:space="preserve">Tabela </w:t>
@@ -7034,6 +7484,7 @@
       <w:r>
         <w:t xml:space="preserve"> Tabela de profundidade/tempo tabuleiro 4x4 (pior caso)</w:t>
       </w:r>
+      <w:bookmarkEnd w:id="24"/>
     </w:p>
     <w:tbl>
       <w:tblPr>
@@ -7307,6 +7758,7 @@
       <w:pPr>
         <w:pStyle w:val="Legenda"/>
       </w:pPr>
+      <w:bookmarkStart w:id="25" w:name="_Toc227618729"/>
       <w:r>
         <w:t xml:space="preserve">Figura </w:t>
       </w:r>
@@ -7325,6 +7777,7 @@
       <w:r>
         <w:t>prolog</w:t>
       </w:r>
+      <w:bookmarkEnd w:id="25"/>
       <w:proofErr w:type="spellEnd"/>
     </w:p>
     <w:p>
@@ -7357,12 +7810,12 @@
       <w:pPr>
         <w:pStyle w:val="Ttulo2"/>
       </w:pPr>
-      <w:bookmarkStart w:id="22" w:name="_Toc227607968"/>
+      <w:bookmarkStart w:id="26" w:name="_Toc227618721"/>
       <w:r>
         <w:lastRenderedPageBreak/>
         <w:t>Testes</w:t>
       </w:r>
-      <w:bookmarkEnd w:id="22"/>
+      <w:bookmarkEnd w:id="26"/>
       <w:r>
         <w:t xml:space="preserve"> </w:t>
       </w:r>
@@ -7418,7 +7871,7 @@
       <w:pPr>
         <w:pStyle w:val="Legenda"/>
       </w:pPr>
-      <w:bookmarkStart w:id="23" w:name="_Toc227594510"/>
+      <w:bookmarkStart w:id="27" w:name="_Toc227618730"/>
       <w:r>
         <w:t xml:space="preserve">Figura </w:t>
       </w:r>
@@ -7437,7 +7890,7 @@
       <w:r>
         <w:t>minimax</w:t>
       </w:r>
-      <w:bookmarkEnd w:id="23"/>
+      <w:bookmarkEnd w:id="27"/>
       <w:proofErr w:type="spellEnd"/>
     </w:p>
     <w:p>
@@ -7495,7 +7948,7 @@
       <w:pPr>
         <w:pStyle w:val="Legenda"/>
       </w:pPr>
-      <w:bookmarkStart w:id="24" w:name="_Toc227594511"/>
+      <w:bookmarkStart w:id="28" w:name="_Toc227618731"/>
       <w:r>
         <w:t xml:space="preserve">Figura </w:t>
       </w:r>
@@ -7515,7 +7968,7 @@
       <w:r>
         <w:t>alfa-beta</w:t>
       </w:r>
-      <w:bookmarkEnd w:id="24"/>
+      <w:bookmarkEnd w:id="28"/>
       <w:proofErr w:type="spellEnd"/>
       <w:proofErr w:type="gramEnd"/>
     </w:p>
@@ -7568,7 +8021,7 @@
       <w:pPr>
         <w:pStyle w:val="Legenda"/>
       </w:pPr>
-      <w:bookmarkStart w:id="25" w:name="_Toc227594512"/>
+      <w:bookmarkStart w:id="29" w:name="_Toc227618732"/>
       <w:r>
         <w:t xml:space="preserve">Figura </w:t>
       </w:r>
@@ -7589,7 +8042,7 @@
         </w:rPr>
         <w:t>invalida do humano</w:t>
       </w:r>
-      <w:bookmarkEnd w:id="25"/>
+      <w:bookmarkEnd w:id="29"/>
     </w:p>
     <w:p>
       <w:pPr>
@@ -7648,7 +8101,7 @@
         <w:pStyle w:val="Legenda"/>
         <w:jc w:val="left"/>
       </w:pPr>
-      <w:bookmarkStart w:id="26" w:name="_Toc227594513"/>
+      <w:bookmarkStart w:id="30" w:name="_Toc227618733"/>
       <w:r>
         <w:t xml:space="preserve">Figura </w:t>
       </w:r>
@@ -7663,7 +8116,7 @@
       <w:r>
         <w:t xml:space="preserve"> Jogo perfeito por parte da AI parte 1</w:t>
       </w:r>
-      <w:bookmarkEnd w:id="26"/>
+      <w:bookmarkEnd w:id="30"/>
     </w:p>
     <w:p>
       <w:pPr>
@@ -7715,7 +8168,7 @@
       <w:pPr>
         <w:pStyle w:val="Legenda"/>
       </w:pPr>
-      <w:bookmarkStart w:id="27" w:name="_Toc227594514"/>
+      <w:bookmarkStart w:id="31" w:name="_Toc227618734"/>
       <w:r>
         <w:t xml:space="preserve">Figura </w:t>
       </w:r>
@@ -7744,7 +8197,7 @@
       <w:r>
         <w:t>2</w:t>
       </w:r>
-      <w:bookmarkEnd w:id="27"/>
+      <w:bookmarkEnd w:id="31"/>
     </w:p>
     <w:p>
       <w:pPr>
@@ -7796,7 +8249,7 @@
       <w:pPr>
         <w:pStyle w:val="Legenda"/>
       </w:pPr>
-      <w:bookmarkStart w:id="28" w:name="_Toc227594515"/>
+      <w:bookmarkStart w:id="32" w:name="_Toc227618735"/>
       <w:r>
         <w:t xml:space="preserve">Figura </w:t>
       </w:r>
@@ -7825,7 +8278,7 @@
       <w:r>
         <w:t>3</w:t>
       </w:r>
-      <w:bookmarkEnd w:id="28"/>
+      <w:bookmarkEnd w:id="32"/>
     </w:p>
     <w:p>
       <w:pPr>
@@ -7877,7 +8330,7 @@
       <w:pPr>
         <w:pStyle w:val="Legenda"/>
       </w:pPr>
-      <w:bookmarkStart w:id="29" w:name="_Toc227594516"/>
+      <w:bookmarkStart w:id="33" w:name="_Toc227618736"/>
       <w:r>
         <w:t xml:space="preserve">Figura </w:t>
       </w:r>
@@ -7906,7 +8359,7 @@
       <w:r>
         <w:t>4</w:t>
       </w:r>
-      <w:bookmarkEnd w:id="29"/>
+      <w:bookmarkEnd w:id="33"/>
     </w:p>
     <w:p>
       <w:pPr>
@@ -7957,7 +8410,7 @@
       <w:pPr>
         <w:pStyle w:val="Legenda"/>
       </w:pPr>
-      <w:bookmarkStart w:id="30" w:name="_Toc227594517"/>
+      <w:bookmarkStart w:id="34" w:name="_Toc227618737"/>
       <w:r>
         <w:t xml:space="preserve">Figura </w:t>
       </w:r>
@@ -7988,7 +8441,7 @@
       <w:r>
         <w:t xml:space="preserve"> de profundidade</w:t>
       </w:r>
-      <w:bookmarkEnd w:id="30"/>
+      <w:bookmarkEnd w:id="34"/>
     </w:p>
     <w:p>
       <w:pPr>
@@ -8040,7 +8493,7 @@
       <w:pPr>
         <w:pStyle w:val="Legenda"/>
       </w:pPr>
-      <w:bookmarkStart w:id="31" w:name="_Toc227594518"/>
+      <w:bookmarkStart w:id="35" w:name="_Toc227618738"/>
       <w:r>
         <w:t xml:space="preserve">Figura </w:t>
       </w:r>
@@ -8065,7 +8518,7 @@
       <w:r>
         <w:t xml:space="preserve"> com 5 de profundidade</w:t>
       </w:r>
-      <w:bookmarkEnd w:id="31"/>
+      <w:bookmarkEnd w:id="35"/>
     </w:p>
     <w:p>
       <w:pPr>
@@ -8117,7 +8570,7 @@
       <w:pPr>
         <w:pStyle w:val="Legenda"/>
       </w:pPr>
-      <w:bookmarkStart w:id="32" w:name="_Toc227594519"/>
+      <w:bookmarkStart w:id="36" w:name="_Toc227618739"/>
       <w:r>
         <w:t xml:space="preserve">Figura </w:t>
       </w:r>
@@ -8148,7 +8601,7 @@
       <w:r>
         <w:t xml:space="preserve"> de profundidade</w:t>
       </w:r>
-      <w:bookmarkEnd w:id="32"/>
+      <w:bookmarkEnd w:id="36"/>
     </w:p>
     <w:p>
       <w:pPr>
@@ -8200,7 +8653,7 @@
       <w:pPr>
         <w:pStyle w:val="Legenda"/>
       </w:pPr>
-      <w:bookmarkStart w:id="33" w:name="_Toc227594520"/>
+      <w:bookmarkStart w:id="37" w:name="_Toc227618740"/>
       <w:r>
         <w:t xml:space="preserve">Figura </w:t>
       </w:r>
@@ -8231,7 +8684,7 @@
       <w:r>
         <w:t xml:space="preserve"> com 4 de profundidade</w:t>
       </w:r>
-      <w:bookmarkEnd w:id="33"/>
+      <w:bookmarkEnd w:id="37"/>
     </w:p>
     <w:p>
       <w:pPr>
@@ -8257,22 +8710,22 @@
       <w:pPr>
         <w:pStyle w:val="Ttulo1"/>
       </w:pPr>
-      <w:bookmarkStart w:id="34" w:name="_Toc227607969"/>
+      <w:bookmarkStart w:id="38" w:name="_Toc227618722"/>
       <w:r>
         <w:lastRenderedPageBreak/>
         <w:t>Decisões de Design e Justificações</w:t>
       </w:r>
-      <w:bookmarkEnd w:id="34"/>
+      <w:bookmarkEnd w:id="38"/>
     </w:p>
     <w:p>
       <w:pPr>
         <w:pStyle w:val="Ttulo2"/>
       </w:pPr>
-      <w:bookmarkStart w:id="35" w:name="_Toc227607970"/>
+      <w:bookmarkStart w:id="39" w:name="_Toc227618723"/>
       <w:r>
         <w:t>Separação modular do código</w:t>
       </w:r>
-      <w:bookmarkEnd w:id="35"/>
+      <w:bookmarkEnd w:id="39"/>
     </w:p>
     <w:p>
       <w:r>
@@ -8316,11 +8769,11 @@
       <w:pPr>
         <w:pStyle w:val="Ttulo2"/>
       </w:pPr>
-      <w:bookmarkStart w:id="36" w:name="_Toc227607971"/>
+      <w:bookmarkStart w:id="40" w:name="_Toc227618724"/>
       <w:r>
         <w:t>Mobilidade como heurística de avaliação</w:t>
       </w:r>
-      <w:bookmarkEnd w:id="36"/>
+      <w:bookmarkEnd w:id="40"/>
     </w:p>
     <w:p>
       <w:r>
@@ -8348,11 +8801,11 @@
       <w:pPr>
         <w:pStyle w:val="Ttulo2"/>
       </w:pPr>
-      <w:bookmarkStart w:id="37" w:name="_Toc227607972"/>
+      <w:bookmarkStart w:id="41" w:name="_Toc227618725"/>
       <w:r>
         <w:t>Profundidade de pesquisa a 3</w:t>
       </w:r>
-      <w:bookmarkEnd w:id="37"/>
+      <w:bookmarkEnd w:id="41"/>
     </w:p>
     <w:p>
       <w:r>
@@ -8372,11 +8825,11 @@
       <w:pPr>
         <w:pStyle w:val="Ttulo2"/>
       </w:pPr>
-      <w:bookmarkStart w:id="38" w:name="_Toc227607973"/>
+      <w:bookmarkStart w:id="42" w:name="_Toc227618726"/>
       <w:r>
         <w:t>Validação tolerante das jogadas do utilizador</w:t>
       </w:r>
-      <w:bookmarkEnd w:id="38"/>
+      <w:bookmarkEnd w:id="42"/>
     </w:p>
     <w:p>
       <w:r>
@@ -8398,7 +8851,7 @@
       <w:pPr>
         <w:pStyle w:val="Ttulo2"/>
       </w:pPr>
-      <w:bookmarkStart w:id="39" w:name="_Toc227607974"/>
+      <w:bookmarkStart w:id="43" w:name="_Toc227618727"/>
       <w:r>
         <w:t xml:space="preserve">Utilização de </w:t>
       </w:r>
@@ -8410,7 +8863,7 @@
       <w:r>
         <w:t>/3 para geração de sucessores</w:t>
       </w:r>
-      <w:bookmarkEnd w:id="39"/>
+      <w:bookmarkEnd w:id="43"/>
     </w:p>
     <w:p>
       <w:r>
@@ -8493,12 +8946,12 @@
       <w:pPr>
         <w:pStyle w:val="Ttulo1"/>
       </w:pPr>
-      <w:bookmarkStart w:id="40" w:name="_Toc227607975"/>
+      <w:bookmarkStart w:id="44" w:name="_Toc227618728"/>
       <w:r>
         <w:lastRenderedPageBreak/>
         <w:t>Conclusão</w:t>
       </w:r>
-      <w:bookmarkEnd w:id="40"/>
+      <w:bookmarkEnd w:id="44"/>
       <w:r>
         <w:t xml:space="preserve"> </w:t>
       </w:r>
@@ -10216,6 +10669,24 @@
     <w:abstractNumId w:val="4"/>
   </w:num>
   <w:num w:numId="15" w16cid:durableId="1730496509">
+    <w:abstractNumId w:val="0"/>
+  </w:num>
+  <w:num w:numId="16" w16cid:durableId="647438820">
+    <w:abstractNumId w:val="0"/>
+  </w:num>
+  <w:num w:numId="17" w16cid:durableId="164246275">
+    <w:abstractNumId w:val="0"/>
+  </w:num>
+  <w:num w:numId="18" w16cid:durableId="722212060">
+    <w:abstractNumId w:val="0"/>
+  </w:num>
+  <w:num w:numId="19" w16cid:durableId="1324237534">
+    <w:abstractNumId w:val="0"/>
+  </w:num>
+  <w:num w:numId="20" w16cid:durableId="238830107">
+    <w:abstractNumId w:val="0"/>
+  </w:num>
+  <w:num w:numId="21" w16cid:durableId="472141039">
     <w:abstractNumId w:val="0"/>
   </w:num>
   <w:numIdMacAtCleanup w:val="5"/>

</xml_diff>